<commit_message>
Beadandó frissítésée összegzés résszel
A beadandó dolgozatból már csak a nethelyre való feltöltés hiányzik
</commit_message>
<xml_diff>
--- a/Web-programozás 1 – Előadás Beadandó.docx
+++ b/Web-programozás 1 – Előadás Beadandó.docx
@@ -3692,7 +3692,7 @@
                               <w:rPr>
                                 <w:noProof/>
                               </w:rPr>
-                              <w:t>2</w:t>
+                              <w:t>1</w:t>
                             </w:r>
                             <w:r>
                               <w:rPr>
@@ -3749,7 +3749,7 @@
                         <w:rPr>
                           <w:noProof/>
                         </w:rPr>
-                        <w:t>2</w:t>
+                        <w:t>1</w:t>
                       </w:r>
                       <w:r>
                         <w:rPr>
@@ -3844,7 +3844,7 @@
                               <w:rPr>
                                 <w:noProof/>
                               </w:rPr>
-                              <w:t>1</w:t>
+                              <w:t>2</w:t>
                             </w:r>
                             <w:r>
                               <w:rPr>
@@ -3907,7 +3907,7 @@
                         <w:rPr>
                           <w:noProof/>
                         </w:rPr>
-                        <w:t>1</w:t>
+                        <w:t>2</w:t>
                       </w:r>
                       <w:r>
                         <w:rPr>
@@ -10148,8 +10148,7 @@
         <w:jc w:val="center"/>
         <w:rPr>
           <w:rFonts w:ascii="Times New Roman" w:hAnsi="Times New Roman" w:cs="Times New Roman"/>
-          <w:sz w:val="24"/>
-          <w:szCs w:val="24"/>
+          <w:color w:val="auto"/>
         </w:rPr>
       </w:pPr>
       <w:r>
@@ -10205,6 +10204,205 @@
         </w:rPr>
         <w:t>. ábra Végleges oojs.html kinézet</w:t>
       </w:r>
+    </w:p>
+    <w:p>
+      <w:pPr>
+        <w:spacing w:line="360" w:lineRule="auto"/>
+        <w:jc w:val="both"/>
+        <w:rPr>
+          <w:rFonts w:ascii="Times New Roman" w:hAnsi="Times New Roman" w:cs="Times New Roman"/>
+          <w:sz w:val="24"/>
+          <w:szCs w:val="24"/>
+        </w:rPr>
+      </w:pPr>
+      <w:r>
+        <w:rPr>
+          <w:rFonts w:ascii="Times New Roman" w:hAnsi="Times New Roman" w:cs="Times New Roman"/>
+          <w:sz w:val="24"/>
+          <w:szCs w:val="24"/>
+        </w:rPr>
+        <w:t>A fentieken túl fontos még lezárásként kiemelni, hogy a</w:t>
+      </w:r>
+      <w:r>
+        <w:rPr>
+          <w:rFonts w:ascii="Times New Roman" w:hAnsi="Times New Roman" w:cs="Times New Roman"/>
+          <w:sz w:val="24"/>
+          <w:szCs w:val="24"/>
+        </w:rPr>
+        <w:t>z OOJS alkalmazásban az alábbi objektumorientált elemeket alkalmaztuk</w:t>
+      </w:r>
+      <w:r>
+        <w:rPr>
+          <w:rFonts w:ascii="Times New Roman" w:hAnsi="Times New Roman" w:cs="Times New Roman"/>
+          <w:sz w:val="24"/>
+          <w:szCs w:val="24"/>
+        </w:rPr>
+        <w:t>, amelyek a feladat leírása szerint elvárásként szerepeltek</w:t>
+      </w:r>
+      <w:r>
+        <w:rPr>
+          <w:rFonts w:ascii="Times New Roman" w:hAnsi="Times New Roman" w:cs="Times New Roman"/>
+          <w:sz w:val="24"/>
+          <w:szCs w:val="24"/>
+        </w:rPr>
+        <w:t>:</w:t>
+      </w:r>
+    </w:p>
+    <w:p>
+      <w:pPr>
+        <w:pStyle w:val="Listaszerbekezds"/>
+        <w:numPr>
+          <w:ilvl w:val="1"/>
+          <w:numId w:val="8"/>
+        </w:numPr>
+        <w:spacing w:line="360" w:lineRule="auto"/>
+        <w:jc w:val="both"/>
+        <w:rPr>
+          <w:rFonts w:ascii="Times New Roman" w:hAnsi="Times New Roman" w:cs="Times New Roman"/>
+          <w:sz w:val="24"/>
+          <w:szCs w:val="24"/>
+        </w:rPr>
+      </w:pPr>
+      <w:proofErr w:type="spellStart"/>
+      <w:r>
+        <w:rPr>
+          <w:rFonts w:ascii="Times New Roman" w:hAnsi="Times New Roman" w:cs="Times New Roman"/>
+          <w:sz w:val="24"/>
+          <w:szCs w:val="24"/>
+        </w:rPr>
+        <w:t>class</w:t>
+      </w:r>
+      <w:proofErr w:type="spellEnd"/>
+    </w:p>
+    <w:p>
+      <w:pPr>
+        <w:pStyle w:val="Listaszerbekezds"/>
+        <w:numPr>
+          <w:ilvl w:val="1"/>
+          <w:numId w:val="8"/>
+        </w:numPr>
+        <w:spacing w:line="360" w:lineRule="auto"/>
+        <w:jc w:val="both"/>
+        <w:rPr>
+          <w:rFonts w:ascii="Times New Roman" w:hAnsi="Times New Roman" w:cs="Times New Roman"/>
+          <w:sz w:val="24"/>
+          <w:szCs w:val="24"/>
+        </w:rPr>
+      </w:pPr>
+      <w:proofErr w:type="spellStart"/>
+      <w:r>
+        <w:rPr>
+          <w:rFonts w:ascii="Times New Roman" w:hAnsi="Times New Roman" w:cs="Times New Roman"/>
+          <w:sz w:val="24"/>
+          <w:szCs w:val="24"/>
+        </w:rPr>
+        <w:t>constructor</w:t>
+      </w:r>
+      <w:proofErr w:type="spellEnd"/>
+    </w:p>
+    <w:p>
+      <w:pPr>
+        <w:pStyle w:val="Listaszerbekezds"/>
+        <w:numPr>
+          <w:ilvl w:val="1"/>
+          <w:numId w:val="8"/>
+        </w:numPr>
+        <w:spacing w:line="360" w:lineRule="auto"/>
+        <w:jc w:val="both"/>
+        <w:rPr>
+          <w:rFonts w:ascii="Times New Roman" w:hAnsi="Times New Roman" w:cs="Times New Roman"/>
+          <w:sz w:val="24"/>
+          <w:szCs w:val="24"/>
+        </w:rPr>
+      </w:pPr>
+      <w:r>
+        <w:rPr>
+          <w:rFonts w:ascii="Times New Roman" w:hAnsi="Times New Roman" w:cs="Times New Roman"/>
+          <w:sz w:val="24"/>
+          <w:szCs w:val="24"/>
+        </w:rPr>
+        <w:t>metódusok</w:t>
+      </w:r>
+    </w:p>
+    <w:p>
+      <w:pPr>
+        <w:pStyle w:val="Listaszerbekezds"/>
+        <w:numPr>
+          <w:ilvl w:val="1"/>
+          <w:numId w:val="8"/>
+        </w:numPr>
+        <w:spacing w:line="360" w:lineRule="auto"/>
+        <w:jc w:val="both"/>
+        <w:rPr>
+          <w:rFonts w:ascii="Times New Roman" w:hAnsi="Times New Roman" w:cs="Times New Roman"/>
+          <w:sz w:val="24"/>
+          <w:szCs w:val="24"/>
+        </w:rPr>
+      </w:pPr>
+      <w:proofErr w:type="spellStart"/>
+      <w:r>
+        <w:rPr>
+          <w:rFonts w:ascii="Times New Roman" w:hAnsi="Times New Roman" w:cs="Times New Roman"/>
+          <w:sz w:val="24"/>
+          <w:szCs w:val="24"/>
+        </w:rPr>
+        <w:t>extends</w:t>
+      </w:r>
+      <w:proofErr w:type="spellEnd"/>
+      <w:r>
+        <w:rPr>
+          <w:rFonts w:ascii="Times New Roman" w:hAnsi="Times New Roman" w:cs="Times New Roman"/>
+          <w:sz w:val="24"/>
+          <w:szCs w:val="24"/>
+        </w:rPr>
+        <w:t xml:space="preserve"> és </w:t>
+      </w:r>
+      <w:proofErr w:type="spellStart"/>
+      <w:r>
+        <w:rPr>
+          <w:rFonts w:ascii="Times New Roman" w:hAnsi="Times New Roman" w:cs="Times New Roman"/>
+          <w:sz w:val="24"/>
+          <w:szCs w:val="24"/>
+        </w:rPr>
+        <w:t>super</w:t>
+      </w:r>
+      <w:proofErr w:type="spellEnd"/>
+    </w:p>
+    <w:p>
+      <w:pPr>
+        <w:pStyle w:val="Listaszerbekezds"/>
+        <w:numPr>
+          <w:ilvl w:val="1"/>
+          <w:numId w:val="8"/>
+        </w:numPr>
+        <w:spacing w:line="360" w:lineRule="auto"/>
+        <w:jc w:val="both"/>
+        <w:rPr>
+          <w:rFonts w:ascii="Times New Roman" w:hAnsi="Times New Roman" w:cs="Times New Roman"/>
+          <w:sz w:val="24"/>
+          <w:szCs w:val="24"/>
+        </w:rPr>
+      </w:pPr>
+      <w:proofErr w:type="spellStart"/>
+      <w:proofErr w:type="gramStart"/>
+      <w:r>
+        <w:rPr>
+          <w:rFonts w:ascii="Times New Roman" w:hAnsi="Times New Roman" w:cs="Times New Roman"/>
+          <w:sz w:val="24"/>
+          <w:szCs w:val="24"/>
+        </w:rPr>
+        <w:t>document.body</w:t>
+      </w:r>
+      <w:proofErr w:type="gramEnd"/>
+      <w:r>
+        <w:rPr>
+          <w:rFonts w:ascii="Times New Roman" w:hAnsi="Times New Roman" w:cs="Times New Roman"/>
+          <w:sz w:val="24"/>
+          <w:szCs w:val="24"/>
+        </w:rPr>
+        <w:t>.appendChild</w:t>
+      </w:r>
+      <w:proofErr w:type="spellEnd"/>
     </w:p>
     <w:p>
       <w:pPr>
@@ -10379,6 +10577,7 @@
           <w:sz w:val="24"/>
           <w:szCs w:val="24"/>
         </w:rPr>
+        <w:lastRenderedPageBreak/>
         <w:t xml:space="preserve">Tovább lépve az SPA menüpont két, gombok segítségével váltható </w:t>
       </w:r>
       <w:proofErr w:type="spellStart"/>
@@ -10524,8 +10723,806 @@
           <w:sz w:val="24"/>
           <w:szCs w:val="24"/>
         </w:rPr>
+        <w:t>Az OOJS menüpont alatt egy objektumorientált JavaScript alapú grafikus alkalmazás található, amely egy szerencsesüti működését jeleníti meg. A felhasználó a süteményre kattintva megnyithatja azt, ekkor egy véletlenszerű üzenet jelenik meg. Az alkalmazás ezt követően egy gomb segítségével újraindítható, így új szerencsesüti és új üzenet kérhető.</w:t>
+      </w:r>
+    </w:p>
+    <w:p>
+      <w:pPr>
+        <w:pStyle w:val="Cmsor1"/>
+        <w:numPr>
+          <w:ilvl w:val="0"/>
+          <w:numId w:val="1"/>
+        </w:numPr>
+        <w:rPr>
+          <w:rFonts w:ascii="Times New Roman" w:hAnsi="Times New Roman" w:cs="Times New Roman"/>
+          <w:b/>
+          <w:bCs/>
+          <w:color w:val="000000" w:themeColor="text1"/>
+          <w:sz w:val="28"/>
+          <w:szCs w:val="28"/>
+        </w:rPr>
+      </w:pPr>
+      <w:r>
+        <w:rPr>
+          <w:rFonts w:ascii="Times New Roman" w:hAnsi="Times New Roman" w:cs="Times New Roman"/>
+          <w:b/>
+          <w:bCs/>
+          <w:color w:val="000000" w:themeColor="text1"/>
+          <w:sz w:val="28"/>
+          <w:szCs w:val="28"/>
+        </w:rPr>
+        <w:t>Összegzés</w:t>
+      </w:r>
+    </w:p>
+    <w:p/>
+    <w:p>
+      <w:pPr>
+        <w:spacing w:line="360" w:lineRule="auto"/>
+        <w:ind w:firstLine="360"/>
+        <w:jc w:val="both"/>
+        <w:rPr>
+          <w:rFonts w:ascii="Times New Roman" w:hAnsi="Times New Roman" w:cs="Times New Roman"/>
+          <w:color w:val="000000" w:themeColor="text1"/>
+          <w:sz w:val="24"/>
+          <w:szCs w:val="24"/>
+        </w:rPr>
+      </w:pPr>
+      <w:r>
+        <w:rPr>
+          <w:rFonts w:ascii="Times New Roman" w:hAnsi="Times New Roman" w:cs="Times New Roman"/>
+          <w:color w:val="000000" w:themeColor="text1"/>
+          <w:sz w:val="24"/>
+          <w:szCs w:val="24"/>
+        </w:rPr>
+        <w:t xml:space="preserve">A projekt megvalósítása során a feladatokat végig közösen, szoros együttműködésben végeztük el. Bár a GitHub </w:t>
+      </w:r>
+      <w:proofErr w:type="spellStart"/>
+      <w:r>
+        <w:rPr>
+          <w:rFonts w:ascii="Times New Roman" w:hAnsi="Times New Roman" w:cs="Times New Roman"/>
+          <w:color w:val="000000" w:themeColor="text1"/>
+          <w:sz w:val="24"/>
+          <w:szCs w:val="24"/>
+        </w:rPr>
+        <w:t>repository</w:t>
+      </w:r>
+      <w:proofErr w:type="spellEnd"/>
+      <w:r>
+        <w:rPr>
+          <w:rFonts w:ascii="Times New Roman" w:hAnsi="Times New Roman" w:cs="Times New Roman"/>
+          <w:color w:val="000000" w:themeColor="text1"/>
+          <w:sz w:val="24"/>
+          <w:szCs w:val="24"/>
+        </w:rPr>
+        <w:t xml:space="preserve">-ban a </w:t>
+      </w:r>
+      <w:proofErr w:type="spellStart"/>
+      <w:r>
+        <w:rPr>
+          <w:rFonts w:ascii="Times New Roman" w:hAnsi="Times New Roman" w:cs="Times New Roman"/>
+          <w:color w:val="000000" w:themeColor="text1"/>
+          <w:sz w:val="24"/>
+          <w:szCs w:val="24"/>
+        </w:rPr>
+        <w:t>commitok</w:t>
+      </w:r>
+      <w:proofErr w:type="spellEnd"/>
+      <w:r>
+        <w:rPr>
+          <w:rFonts w:ascii="Times New Roman" w:hAnsi="Times New Roman" w:cs="Times New Roman"/>
+          <w:color w:val="000000" w:themeColor="text1"/>
+          <w:sz w:val="24"/>
+          <w:szCs w:val="24"/>
+        </w:rPr>
+        <w:t xml:space="preserve"> alapján időnként úgy tűnhet, hogy az egyik fél aktívabb volt, a valóságban a fejlesztési folyamat minden lépését együtt beszéltük át. Folyamatos online kapcsolatban álltunk egymással, így a legtöbb esetben a </w:t>
+      </w:r>
+      <w:proofErr w:type="spellStart"/>
+      <w:r>
+        <w:rPr>
+          <w:rFonts w:ascii="Times New Roman" w:hAnsi="Times New Roman" w:cs="Times New Roman"/>
+          <w:color w:val="000000" w:themeColor="text1"/>
+          <w:sz w:val="24"/>
+          <w:szCs w:val="24"/>
+        </w:rPr>
+        <w:t>commitolás</w:t>
+      </w:r>
+      <w:proofErr w:type="spellEnd"/>
+      <w:r>
+        <w:rPr>
+          <w:rFonts w:ascii="Times New Roman" w:hAnsi="Times New Roman" w:cs="Times New Roman"/>
+          <w:color w:val="000000" w:themeColor="text1"/>
+          <w:sz w:val="24"/>
+          <w:szCs w:val="24"/>
+        </w:rPr>
+        <w:t xml:space="preserve"> előtt már mindketten átnéztük és egyeztettük a módosításokat.</w:t>
+      </w:r>
+    </w:p>
+    <w:p>
+      <w:pPr>
+        <w:spacing w:line="360" w:lineRule="auto"/>
+        <w:ind w:firstLine="360"/>
+        <w:jc w:val="both"/>
+        <w:rPr>
+          <w:rFonts w:ascii="Times New Roman" w:hAnsi="Times New Roman" w:cs="Times New Roman"/>
+          <w:color w:val="000000" w:themeColor="text1"/>
+          <w:sz w:val="24"/>
+          <w:szCs w:val="24"/>
+        </w:rPr>
+      </w:pPr>
+      <w:r>
+        <w:rPr>
+          <w:noProof/>
+        </w:rPr>
+        <mc:AlternateContent>
+          <mc:Choice Requires="wps">
+            <w:drawing>
+              <wp:anchor distT="0" distB="0" distL="114300" distR="114300" simplePos="0" relativeHeight="251678720" behindDoc="0" locked="0" layoutInCell="1" allowOverlap="1" wp14:anchorId="4C51B646" wp14:editId="3D548EF2">
+                <wp:simplePos x="0" y="0"/>
+                <wp:positionH relativeFrom="column">
+                  <wp:posOffset>2503170</wp:posOffset>
+                </wp:positionH>
+                <wp:positionV relativeFrom="paragraph">
+                  <wp:posOffset>2559050</wp:posOffset>
+                </wp:positionV>
+                <wp:extent cx="3237230" cy="635"/>
+                <wp:effectExtent l="0" t="0" r="0" b="0"/>
+                <wp:wrapSquare wrapText="bothSides"/>
+                <wp:docPr id="121565947" name="Szövegdoboz 1"/>
+                <wp:cNvGraphicFramePr/>
+                <a:graphic xmlns:a="http://schemas.openxmlformats.org/drawingml/2006/main">
+                  <a:graphicData uri="http://schemas.microsoft.com/office/word/2010/wordprocessingShape">
+                    <wps:wsp>
+                      <wps:cNvSpPr txBox="1"/>
+                      <wps:spPr>
+                        <a:xfrm>
+                          <a:off x="0" y="0"/>
+                          <a:ext cx="3237230" cy="635"/>
+                        </a:xfrm>
+                        <a:prstGeom prst="rect">
+                          <a:avLst/>
+                        </a:prstGeom>
+                        <a:solidFill>
+                          <a:prstClr val="white"/>
+                        </a:solidFill>
+                        <a:ln>
+                          <a:noFill/>
+                        </a:ln>
+                      </wps:spPr>
+                      <wps:txbx>
+                        <w:txbxContent>
+                          <w:p>
+                            <w:pPr>
+                              <w:pStyle w:val="Kpalrs"/>
+                              <w:jc w:val="center"/>
+                              <w:rPr>
+                                <w:rFonts w:ascii="Times New Roman" w:hAnsi="Times New Roman" w:cs="Times New Roman"/>
+                                <w:color w:val="000000" w:themeColor="text1"/>
+                              </w:rPr>
+                            </w:pPr>
+                            <w:r>
+                              <w:rPr>
+                                <w:rFonts w:ascii="Times New Roman" w:hAnsi="Times New Roman" w:cs="Times New Roman"/>
+                                <w:color w:val="000000" w:themeColor="text1"/>
+                              </w:rPr>
+                              <w:fldChar w:fldCharType="begin"/>
+                            </w:r>
+                            <w:r>
+                              <w:rPr>
+                                <w:rFonts w:ascii="Times New Roman" w:hAnsi="Times New Roman" w:cs="Times New Roman"/>
+                                <w:color w:val="000000" w:themeColor="text1"/>
+                              </w:rPr>
+                              <w:instrText xml:space="preserve"> SEQ ábra \* ARABIC </w:instrText>
+                            </w:r>
+                            <w:r>
+                              <w:rPr>
+                                <w:rFonts w:ascii="Times New Roman" w:hAnsi="Times New Roman" w:cs="Times New Roman"/>
+                                <w:color w:val="000000" w:themeColor="text1"/>
+                              </w:rPr>
+                              <w:fldChar w:fldCharType="separate"/>
+                            </w:r>
+                            <w:r>
+                              <w:rPr>
+                                <w:rFonts w:ascii="Times New Roman" w:hAnsi="Times New Roman" w:cs="Times New Roman"/>
+                                <w:noProof/>
+                                <w:color w:val="000000" w:themeColor="text1"/>
+                              </w:rPr>
+                              <w:t>12</w:t>
+                            </w:r>
+                            <w:r>
+                              <w:rPr>
+                                <w:rFonts w:ascii="Times New Roman" w:hAnsi="Times New Roman" w:cs="Times New Roman"/>
+                                <w:color w:val="000000" w:themeColor="text1"/>
+                              </w:rPr>
+                              <w:fldChar w:fldCharType="end"/>
+                            </w:r>
+                            <w:r>
+                              <w:rPr>
+                                <w:rFonts w:ascii="Times New Roman" w:hAnsi="Times New Roman" w:cs="Times New Roman"/>
+                                <w:color w:val="000000" w:themeColor="text1"/>
+                              </w:rPr>
+                              <w:t xml:space="preserve">. ábra </w:t>
+                            </w:r>
+                            <w:proofErr w:type="spellStart"/>
+                            <w:r>
+                              <w:rPr>
+                                <w:rFonts w:ascii="Times New Roman" w:hAnsi="Times New Roman" w:cs="Times New Roman"/>
+                                <w:color w:val="000000" w:themeColor="text1"/>
+                              </w:rPr>
+                              <w:t>Commit</w:t>
+                            </w:r>
+                            <w:proofErr w:type="spellEnd"/>
+                            <w:r>
+                              <w:rPr>
+                                <w:rFonts w:ascii="Times New Roman" w:hAnsi="Times New Roman" w:cs="Times New Roman"/>
+                                <w:color w:val="000000" w:themeColor="text1"/>
+                              </w:rPr>
+                              <w:t xml:space="preserve"> lista egy része</w:t>
+                            </w:r>
+                          </w:p>
+                        </w:txbxContent>
+                      </wps:txbx>
+                      <wps:bodyPr rot="0" spcFirstLastPara="0" vertOverflow="overflow" horzOverflow="overflow" vert="horz" wrap="square" lIns="0" tIns="0" rIns="0" bIns="0" numCol="1" spcCol="0" rtlCol="0" fromWordArt="0" anchor="t" anchorCtr="0" forceAA="0" compatLnSpc="1">
+                        <a:prstTxWarp prst="textNoShape">
+                          <a:avLst/>
+                        </a:prstTxWarp>
+                        <a:spAutoFit/>
+                      </wps:bodyPr>
+                    </wps:wsp>
+                  </a:graphicData>
+                </a:graphic>
+              </wp:anchor>
+            </w:drawing>
+          </mc:Choice>
+          <mc:Fallback>
+            <w:pict>
+              <v:shape w14:anchorId="4C51B646" id="_x0000_s1032" type="#_x0000_t202" style="position:absolute;left:0;text-align:left;margin-left:197.1pt;margin-top:201.5pt;width:254.9pt;height:.05pt;z-index:251678720;visibility:visible;mso-wrap-style:square;mso-wrap-distance-left:9pt;mso-wrap-distance-top:0;mso-wrap-distance-right:9pt;mso-wrap-distance-bottom:0;mso-position-horizontal:absolute;mso-position-horizontal-relative:text;mso-position-vertical:absolute;mso-position-vertical-relative:text;v-text-anchor:top" o:gfxdata="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" stroked="f">
+                <v:textbox style="mso-fit-shape-to-text:t" inset="0,0,0,0">
+                  <w:txbxContent>
+                    <w:p>
+                      <w:pPr>
+                        <w:pStyle w:val="Kpalrs"/>
+                        <w:jc w:val="center"/>
+                        <w:rPr>
+                          <w:rFonts w:ascii="Times New Roman" w:hAnsi="Times New Roman" w:cs="Times New Roman"/>
+                          <w:color w:val="000000" w:themeColor="text1"/>
+                        </w:rPr>
+                      </w:pPr>
+                      <w:r>
+                        <w:rPr>
+                          <w:rFonts w:ascii="Times New Roman" w:hAnsi="Times New Roman" w:cs="Times New Roman"/>
+                          <w:color w:val="000000" w:themeColor="text1"/>
+                        </w:rPr>
+                        <w:fldChar w:fldCharType="begin"/>
+                      </w:r>
+                      <w:r>
+                        <w:rPr>
+                          <w:rFonts w:ascii="Times New Roman" w:hAnsi="Times New Roman" w:cs="Times New Roman"/>
+                          <w:color w:val="000000" w:themeColor="text1"/>
+                        </w:rPr>
+                        <w:instrText xml:space="preserve"> SEQ ábra \* ARABIC </w:instrText>
+                      </w:r>
+                      <w:r>
+                        <w:rPr>
+                          <w:rFonts w:ascii="Times New Roman" w:hAnsi="Times New Roman" w:cs="Times New Roman"/>
+                          <w:color w:val="000000" w:themeColor="text1"/>
+                        </w:rPr>
+                        <w:fldChar w:fldCharType="separate"/>
+                      </w:r>
+                      <w:r>
+                        <w:rPr>
+                          <w:rFonts w:ascii="Times New Roman" w:hAnsi="Times New Roman" w:cs="Times New Roman"/>
+                          <w:noProof/>
+                          <w:color w:val="000000" w:themeColor="text1"/>
+                        </w:rPr>
+                        <w:t>12</w:t>
+                      </w:r>
+                      <w:r>
+                        <w:rPr>
+                          <w:rFonts w:ascii="Times New Roman" w:hAnsi="Times New Roman" w:cs="Times New Roman"/>
+                          <w:color w:val="000000" w:themeColor="text1"/>
+                        </w:rPr>
+                        <w:fldChar w:fldCharType="end"/>
+                      </w:r>
+                      <w:r>
+                        <w:rPr>
+                          <w:rFonts w:ascii="Times New Roman" w:hAnsi="Times New Roman" w:cs="Times New Roman"/>
+                          <w:color w:val="000000" w:themeColor="text1"/>
+                        </w:rPr>
+                        <w:t xml:space="preserve">. ábra </w:t>
+                      </w:r>
+                      <w:proofErr w:type="spellStart"/>
+                      <w:r>
+                        <w:rPr>
+                          <w:rFonts w:ascii="Times New Roman" w:hAnsi="Times New Roman" w:cs="Times New Roman"/>
+                          <w:color w:val="000000" w:themeColor="text1"/>
+                        </w:rPr>
+                        <w:t>Commit</w:t>
+                      </w:r>
+                      <w:proofErr w:type="spellEnd"/>
+                      <w:r>
+                        <w:rPr>
+                          <w:rFonts w:ascii="Times New Roman" w:hAnsi="Times New Roman" w:cs="Times New Roman"/>
+                          <w:color w:val="000000" w:themeColor="text1"/>
+                        </w:rPr>
+                        <w:t xml:space="preserve"> lista egy része</w:t>
+                      </w:r>
+                    </w:p>
+                  </w:txbxContent>
+                </v:textbox>
+                <w10:wrap type="square"/>
+              </v:shape>
+            </w:pict>
+          </mc:Fallback>
+        </mc:AlternateContent>
+      </w:r>
+      <w:r>
+        <w:rPr>
+          <w:rFonts w:ascii="Times New Roman" w:hAnsi="Times New Roman" w:cs="Times New Roman"/>
+          <w:color w:val="000000" w:themeColor="text1"/>
+          <w:sz w:val="24"/>
+          <w:szCs w:val="24"/>
+        </w:rPr>
+        <w:drawing>
+          <wp:anchor distT="0" distB="0" distL="114300" distR="114300" simplePos="0" relativeHeight="251676672" behindDoc="0" locked="0" layoutInCell="1" allowOverlap="1" wp14:anchorId="473AEB64" wp14:editId="0B885397">
+            <wp:simplePos x="0" y="0"/>
+            <wp:positionH relativeFrom="margin">
+              <wp:align>right</wp:align>
+            </wp:positionH>
+            <wp:positionV relativeFrom="margin">
+              <wp:posOffset>6149340</wp:posOffset>
+            </wp:positionV>
+            <wp:extent cx="3237230" cy="1750695"/>
+            <wp:effectExtent l="19050" t="19050" r="20320" b="20955"/>
+            <wp:wrapSquare wrapText="bothSides"/>
+            <wp:docPr id="930529810" name="Kép 1"/>
+            <wp:cNvGraphicFramePr>
+              <a:graphicFrameLocks xmlns:a="http://schemas.openxmlformats.org/drawingml/2006/main" noChangeAspect="1"/>
+            </wp:cNvGraphicFramePr>
+            <a:graphic xmlns:a="http://schemas.openxmlformats.org/drawingml/2006/main">
+              <a:graphicData uri="http://schemas.openxmlformats.org/drawingml/2006/picture">
+                <pic:pic xmlns:pic="http://schemas.openxmlformats.org/drawingml/2006/picture">
+                  <pic:nvPicPr>
+                    <pic:cNvPr id="930529810" name=""/>
+                    <pic:cNvPicPr/>
+                  </pic:nvPicPr>
+                  <pic:blipFill>
+                    <a:blip r:embed="rId22" cstate="print">
+                      <a:extLst>
+                        <a:ext uri="{28A0092B-C50C-407E-A947-70E740481C1C}">
+                          <a14:useLocalDpi xmlns:a14="http://schemas.microsoft.com/office/drawing/2010/main" val="0"/>
+                        </a:ext>
+                      </a:extLst>
+                    </a:blip>
+                    <a:stretch>
+                      <a:fillRect/>
+                    </a:stretch>
+                  </pic:blipFill>
+                  <pic:spPr>
+                    <a:xfrm>
+                      <a:off x="0" y="0"/>
+                      <a:ext cx="3237230" cy="1750695"/>
+                    </a:xfrm>
+                    <a:prstGeom prst="rect">
+                      <a:avLst/>
+                    </a:prstGeom>
+                    <a:ln>
+                      <a:solidFill>
+                        <a:schemeClr val="tx1"/>
+                      </a:solidFill>
+                    </a:ln>
+                  </pic:spPr>
+                </pic:pic>
+              </a:graphicData>
+            </a:graphic>
+          </wp:anchor>
+        </w:drawing>
+      </w:r>
+      <w:r>
+        <w:rPr>
+          <w:rFonts w:ascii="Times New Roman" w:hAnsi="Times New Roman" w:cs="Times New Roman"/>
+          <w:color w:val="000000" w:themeColor="text1"/>
+          <w:sz w:val="24"/>
+          <w:szCs w:val="24"/>
+        </w:rPr>
+        <w:t xml:space="preserve">Az összes HTML oldal (index, </w:t>
+      </w:r>
+      <w:proofErr w:type="spellStart"/>
+      <w:r>
+        <w:rPr>
+          <w:rFonts w:ascii="Times New Roman" w:hAnsi="Times New Roman" w:cs="Times New Roman"/>
+          <w:color w:val="000000" w:themeColor="text1"/>
+          <w:sz w:val="24"/>
+          <w:szCs w:val="24"/>
+        </w:rPr>
+        <w:t>javascript</w:t>
+      </w:r>
+      <w:proofErr w:type="spellEnd"/>
+      <w:r>
+        <w:rPr>
+          <w:rFonts w:ascii="Times New Roman" w:hAnsi="Times New Roman" w:cs="Times New Roman"/>
+          <w:color w:val="000000" w:themeColor="text1"/>
+          <w:sz w:val="24"/>
+          <w:szCs w:val="24"/>
+        </w:rPr>
+        <w:t xml:space="preserve">, </w:t>
+      </w:r>
+      <w:proofErr w:type="spellStart"/>
+      <w:r>
+        <w:rPr>
+          <w:rFonts w:ascii="Times New Roman" w:hAnsi="Times New Roman" w:cs="Times New Roman"/>
+          <w:color w:val="000000" w:themeColor="text1"/>
+          <w:sz w:val="24"/>
+          <w:szCs w:val="24"/>
+        </w:rPr>
+        <w:t>react</w:t>
+      </w:r>
+      <w:proofErr w:type="spellEnd"/>
+      <w:r>
+        <w:rPr>
+          <w:rFonts w:ascii="Times New Roman" w:hAnsi="Times New Roman" w:cs="Times New Roman"/>
+          <w:color w:val="000000" w:themeColor="text1"/>
+          <w:sz w:val="24"/>
+          <w:szCs w:val="24"/>
+        </w:rPr>
+        <w:t xml:space="preserve">, </w:t>
+      </w:r>
+      <w:proofErr w:type="spellStart"/>
+      <w:r>
+        <w:rPr>
+          <w:rFonts w:ascii="Times New Roman" w:hAnsi="Times New Roman" w:cs="Times New Roman"/>
+          <w:color w:val="000000" w:themeColor="text1"/>
+          <w:sz w:val="24"/>
+          <w:szCs w:val="24"/>
+        </w:rPr>
+        <w:t>spa</w:t>
+      </w:r>
+      <w:proofErr w:type="spellEnd"/>
+      <w:r>
+        <w:rPr>
+          <w:rFonts w:ascii="Times New Roman" w:hAnsi="Times New Roman" w:cs="Times New Roman"/>
+          <w:color w:val="000000" w:themeColor="text1"/>
+          <w:sz w:val="24"/>
+          <w:szCs w:val="24"/>
+        </w:rPr>
+        <w:t xml:space="preserve">, </w:t>
+      </w:r>
+      <w:proofErr w:type="spellStart"/>
+      <w:r>
+        <w:rPr>
+          <w:rFonts w:ascii="Times New Roman" w:hAnsi="Times New Roman" w:cs="Times New Roman"/>
+          <w:color w:val="000000" w:themeColor="text1"/>
+          <w:sz w:val="24"/>
+          <w:szCs w:val="24"/>
+        </w:rPr>
+        <w:t>fetchapi</w:t>
+      </w:r>
+      <w:proofErr w:type="spellEnd"/>
+      <w:r>
+        <w:rPr>
+          <w:rFonts w:ascii="Times New Roman" w:hAnsi="Times New Roman" w:cs="Times New Roman"/>
+          <w:color w:val="000000" w:themeColor="text1"/>
+          <w:sz w:val="24"/>
+          <w:szCs w:val="24"/>
+        </w:rPr>
+        <w:t xml:space="preserve">, </w:t>
+      </w:r>
+      <w:proofErr w:type="spellStart"/>
+      <w:r>
+        <w:rPr>
+          <w:rFonts w:ascii="Times New Roman" w:hAnsi="Times New Roman" w:cs="Times New Roman"/>
+          <w:color w:val="000000" w:themeColor="text1"/>
+          <w:sz w:val="24"/>
+          <w:szCs w:val="24"/>
+        </w:rPr>
+        <w:t>axios</w:t>
+      </w:r>
+      <w:proofErr w:type="spellEnd"/>
+      <w:r>
+        <w:rPr>
+          <w:rFonts w:ascii="Times New Roman" w:hAnsi="Times New Roman" w:cs="Times New Roman"/>
+          <w:color w:val="000000" w:themeColor="text1"/>
+          <w:sz w:val="24"/>
+          <w:szCs w:val="24"/>
+        </w:rPr>
+        <w:t xml:space="preserve">, </w:t>
+      </w:r>
+      <w:proofErr w:type="spellStart"/>
+      <w:r>
+        <w:rPr>
+          <w:rFonts w:ascii="Times New Roman" w:hAnsi="Times New Roman" w:cs="Times New Roman"/>
+          <w:color w:val="000000" w:themeColor="text1"/>
+          <w:sz w:val="24"/>
+          <w:szCs w:val="24"/>
+        </w:rPr>
+        <w:t>oojs</w:t>
+      </w:r>
+      <w:proofErr w:type="spellEnd"/>
+      <w:r>
+        <w:rPr>
+          <w:rFonts w:ascii="Times New Roman" w:hAnsi="Times New Roman" w:cs="Times New Roman"/>
+          <w:color w:val="000000" w:themeColor="text1"/>
+          <w:sz w:val="24"/>
+          <w:szCs w:val="24"/>
+        </w:rPr>
+        <w:t xml:space="preserve">) kialakítása közös munkával történt, a különbség inkább abban jelent meg, hogy éppen ki végezte el a </w:t>
+      </w:r>
+      <w:proofErr w:type="spellStart"/>
+      <w:r>
+        <w:rPr>
+          <w:rFonts w:ascii="Times New Roman" w:hAnsi="Times New Roman" w:cs="Times New Roman"/>
+          <w:color w:val="000000" w:themeColor="text1"/>
+          <w:sz w:val="24"/>
+          <w:szCs w:val="24"/>
+        </w:rPr>
+        <w:t>commitolást</w:t>
+      </w:r>
+      <w:proofErr w:type="spellEnd"/>
+      <w:r>
+        <w:rPr>
+          <w:rFonts w:ascii="Times New Roman" w:hAnsi="Times New Roman" w:cs="Times New Roman"/>
+          <w:color w:val="000000" w:themeColor="text1"/>
+          <w:sz w:val="24"/>
+          <w:szCs w:val="24"/>
+        </w:rPr>
+        <w:t xml:space="preserve"> a GitHub </w:t>
+      </w:r>
+      <w:proofErr w:type="spellStart"/>
+      <w:r>
+        <w:rPr>
+          <w:rFonts w:ascii="Times New Roman" w:hAnsi="Times New Roman" w:cs="Times New Roman"/>
+          <w:color w:val="000000" w:themeColor="text1"/>
+          <w:sz w:val="24"/>
+          <w:szCs w:val="24"/>
+        </w:rPr>
+        <w:t>Desktop</w:t>
+      </w:r>
+      <w:proofErr w:type="spellEnd"/>
+      <w:r>
+        <w:rPr>
+          <w:rFonts w:ascii="Times New Roman" w:hAnsi="Times New Roman" w:cs="Times New Roman"/>
+          <w:color w:val="000000" w:themeColor="text1"/>
+          <w:sz w:val="24"/>
+          <w:szCs w:val="24"/>
+        </w:rPr>
+        <w:t xml:space="preserve"> alkalmazáson keresztül. Több alkalommal személyesen, az iskola helyszínén is együtt dolgoztunk, ilyenkor jellemzően az egyik csoporttag számítógépén folyt a munka. Ez magyarázza, hogy egyes napokon az egyik félhez köthető több </w:t>
+      </w:r>
+      <w:proofErr w:type="spellStart"/>
+      <w:r>
+        <w:rPr>
+          <w:rFonts w:ascii="Times New Roman" w:hAnsi="Times New Roman" w:cs="Times New Roman"/>
+          <w:color w:val="000000" w:themeColor="text1"/>
+          <w:sz w:val="24"/>
+          <w:szCs w:val="24"/>
+        </w:rPr>
+        <w:t>commit</w:t>
+      </w:r>
+      <w:proofErr w:type="spellEnd"/>
+      <w:r>
+        <w:rPr>
+          <w:rFonts w:ascii="Times New Roman" w:hAnsi="Times New Roman" w:cs="Times New Roman"/>
+          <w:color w:val="000000" w:themeColor="text1"/>
+          <w:sz w:val="24"/>
+          <w:szCs w:val="24"/>
+        </w:rPr>
+        <w:t xml:space="preserve"> jelenik meg a verziókövetésben.</w:t>
+      </w:r>
+      <w:r>
+        <w:t xml:space="preserve"> </w:t>
+      </w:r>
+      <w:r>
+        <w:rPr>
+          <w:rFonts w:ascii="Times New Roman" w:hAnsi="Times New Roman" w:cs="Times New Roman"/>
+          <w:color w:val="000000" w:themeColor="text1"/>
+          <w:sz w:val="24"/>
+          <w:szCs w:val="24"/>
+        </w:rPr>
+        <w:t xml:space="preserve">A GitHub </w:t>
+      </w:r>
+      <w:proofErr w:type="spellStart"/>
+      <w:r>
+        <w:rPr>
+          <w:rFonts w:ascii="Times New Roman" w:hAnsi="Times New Roman" w:cs="Times New Roman"/>
+          <w:color w:val="000000" w:themeColor="text1"/>
+          <w:sz w:val="24"/>
+          <w:szCs w:val="24"/>
+        </w:rPr>
+        <w:t>repository</w:t>
+      </w:r>
+      <w:proofErr w:type="spellEnd"/>
+      <w:r>
+        <w:rPr>
+          <w:rFonts w:ascii="Times New Roman" w:hAnsi="Times New Roman" w:cs="Times New Roman"/>
+          <w:color w:val="000000" w:themeColor="text1"/>
+          <w:sz w:val="24"/>
+          <w:szCs w:val="24"/>
+        </w:rPr>
+        <w:t xml:space="preserve">-ban jól látható a projekt folyamatos fejlesztése. </w:t>
+      </w:r>
+      <w:r>
+        <w:rPr>
+          <w:rFonts w:ascii="Times New Roman" w:hAnsi="Times New Roman" w:cs="Times New Roman"/>
+          <w:color w:val="000000" w:themeColor="text1"/>
+          <w:sz w:val="24"/>
+          <w:szCs w:val="24"/>
+        </w:rPr>
+        <w:br/>
+        <w:t xml:space="preserve">A </w:t>
+      </w:r>
+      <w:proofErr w:type="spellStart"/>
+      <w:r>
+        <w:rPr>
+          <w:rFonts w:ascii="Times New Roman" w:hAnsi="Times New Roman" w:cs="Times New Roman"/>
+          <w:color w:val="000000" w:themeColor="text1"/>
+          <w:sz w:val="24"/>
+          <w:szCs w:val="24"/>
+        </w:rPr>
+        <w:t>commitok</w:t>
+      </w:r>
+      <w:proofErr w:type="spellEnd"/>
+      <w:r>
+        <w:rPr>
+          <w:rFonts w:ascii="Times New Roman" w:hAnsi="Times New Roman" w:cs="Times New Roman"/>
+          <w:color w:val="000000" w:themeColor="text1"/>
+          <w:sz w:val="24"/>
+          <w:szCs w:val="24"/>
+        </w:rPr>
+        <w:t xml:space="preserve"> száma és időbeli eloszlása igazolja, hogy a feladat több lépésben készült el. </w:t>
+      </w:r>
+      <w:r>
+        <w:rPr>
+          <w:rFonts w:ascii="Times New Roman" w:hAnsi="Times New Roman" w:cs="Times New Roman"/>
+          <w:color w:val="000000" w:themeColor="text1"/>
+          <w:sz w:val="24"/>
+          <w:szCs w:val="24"/>
+        </w:rPr>
+        <w:br/>
+        <w:t xml:space="preserve">A </w:t>
+      </w:r>
+      <w:proofErr w:type="spellStart"/>
+      <w:r>
+        <w:rPr>
+          <w:rFonts w:ascii="Times New Roman" w:hAnsi="Times New Roman" w:cs="Times New Roman"/>
+          <w:color w:val="000000" w:themeColor="text1"/>
+          <w:sz w:val="24"/>
+          <w:szCs w:val="24"/>
+        </w:rPr>
+        <w:t>contributors</w:t>
+      </w:r>
+      <w:proofErr w:type="spellEnd"/>
+      <w:r>
+        <w:rPr>
+          <w:rFonts w:ascii="Times New Roman" w:hAnsi="Times New Roman" w:cs="Times New Roman"/>
+          <w:color w:val="000000" w:themeColor="text1"/>
+          <w:sz w:val="24"/>
+          <w:szCs w:val="24"/>
+        </w:rPr>
+        <w:t xml:space="preserve"> </w:t>
+      </w:r>
+      <w:r>
+        <w:rPr>
+          <w:rFonts w:ascii="Times New Roman" w:hAnsi="Times New Roman" w:cs="Times New Roman"/>
+          <w:color w:val="000000" w:themeColor="text1"/>
+          <w:sz w:val="24"/>
+          <w:szCs w:val="24"/>
+        </w:rPr>
+        <w:t>(</w:t>
+      </w:r>
+      <w:proofErr w:type="spellStart"/>
+      <w:r>
+        <w:rPr>
+          <w:rFonts w:ascii="Times New Roman" w:hAnsi="Times New Roman" w:cs="Times New Roman"/>
+          <w:color w:val="000000" w:themeColor="text1"/>
+          <w:sz w:val="24"/>
+          <w:szCs w:val="24"/>
+        </w:rPr>
+        <w:t>harmatinepasztoreva</w:t>
+      </w:r>
+      <w:proofErr w:type="spellEnd"/>
+      <w:r>
+        <w:rPr>
+          <w:rFonts w:ascii="Times New Roman" w:hAnsi="Times New Roman" w:cs="Times New Roman"/>
+          <w:color w:val="000000" w:themeColor="text1"/>
+          <w:sz w:val="24"/>
+          <w:szCs w:val="24"/>
+        </w:rPr>
+        <w:t xml:space="preserve"> – Harmatiné Pásztor Éva (JBDAQO), </w:t>
+      </w:r>
+      <w:r>
+        <w:rPr>
+          <w:rFonts w:ascii="Times New Roman" w:hAnsi="Times New Roman" w:cs="Times New Roman"/>
+          <w:color w:val="000000" w:themeColor="text1"/>
+          <w:sz w:val="24"/>
+          <w:szCs w:val="24"/>
+        </w:rPr>
+        <w:t>ttdd33</w:t>
+      </w:r>
+      <w:r>
+        <w:rPr>
+          <w:rFonts w:ascii="Times New Roman" w:hAnsi="Times New Roman" w:cs="Times New Roman"/>
+          <w:color w:val="000000" w:themeColor="text1"/>
+          <w:sz w:val="24"/>
+          <w:szCs w:val="24"/>
+        </w:rPr>
+        <w:t xml:space="preserve"> – Deák </w:t>
+      </w:r>
+      <w:r>
+        <w:rPr>
+          <w:rFonts w:ascii="Times New Roman" w:hAnsi="Times New Roman" w:cs="Times New Roman"/>
+          <w:color w:val="000000" w:themeColor="text1"/>
+          <w:sz w:val="24"/>
+          <w:szCs w:val="24"/>
+        </w:rPr>
         <w:lastRenderedPageBreak/>
-        <w:t>Az OOJS menüpont alatt egy objektumorientált JavaScript alapú grafikus alkalmazás található, amely egy szerencsesüti működését jeleníti meg. A felhasználó a süteményre kattintva megnyithatja azt, ekkor egy véletlenszerű üzenet jelenik meg. Az alkalmazás ezt követően egy gomb segítségével újraindítható, így új szerencsesüti és új üzenet kérhető.</w:t>
+        <w:t>Dávid (</w:t>
+      </w:r>
+      <w:r>
+        <w:rPr>
+          <w:rFonts w:ascii="Times New Roman" w:hAnsi="Times New Roman" w:cs="Times New Roman"/>
+          <w:color w:val="000000" w:themeColor="text1"/>
+          <w:sz w:val="24"/>
+          <w:szCs w:val="24"/>
+        </w:rPr>
+        <w:t>OPFHRV)</w:t>
+      </w:r>
+      <w:r>
+        <w:rPr>
+          <w:rFonts w:ascii="Times New Roman" w:hAnsi="Times New Roman" w:cs="Times New Roman"/>
+          <w:color w:val="000000" w:themeColor="text1"/>
+          <w:sz w:val="24"/>
+          <w:szCs w:val="24"/>
+        </w:rPr>
+        <w:t xml:space="preserve">) </w:t>
+      </w:r>
+      <w:r>
+        <w:rPr>
+          <w:rFonts w:ascii="Times New Roman" w:hAnsi="Times New Roman" w:cs="Times New Roman"/>
+          <w:color w:val="000000" w:themeColor="text1"/>
+          <w:sz w:val="24"/>
+          <w:szCs w:val="24"/>
+        </w:rPr>
+        <w:t>részben mindkét csoporttag megjelenik, ami alátámasztja a közös munkavégzést.</w:t>
+      </w:r>
+    </w:p>
+    <w:p>
+      <w:pPr>
+        <w:spacing w:line="360" w:lineRule="auto"/>
+        <w:ind w:firstLine="360"/>
+        <w:jc w:val="both"/>
+        <w:rPr>
+          <w:rFonts w:ascii="Times New Roman" w:hAnsi="Times New Roman" w:cs="Times New Roman"/>
+          <w:color w:val="000000" w:themeColor="text1"/>
+          <w:sz w:val="24"/>
+          <w:szCs w:val="24"/>
+        </w:rPr>
+      </w:pPr>
+      <w:r>
+        <w:rPr>
+          <w:rFonts w:ascii="Times New Roman" w:hAnsi="Times New Roman" w:cs="Times New Roman"/>
+          <w:color w:val="000000" w:themeColor="text1"/>
+          <w:sz w:val="24"/>
+          <w:szCs w:val="24"/>
+        </w:rPr>
+        <w:t xml:space="preserve">A projekt során a GitHub </w:t>
+      </w:r>
+      <w:proofErr w:type="spellStart"/>
+      <w:r>
+        <w:rPr>
+          <w:rFonts w:ascii="Times New Roman" w:hAnsi="Times New Roman" w:cs="Times New Roman"/>
+          <w:color w:val="000000" w:themeColor="text1"/>
+          <w:sz w:val="24"/>
+          <w:szCs w:val="24"/>
+        </w:rPr>
+        <w:t>Desktop</w:t>
+      </w:r>
+      <w:proofErr w:type="spellEnd"/>
+      <w:r>
+        <w:rPr>
+          <w:rFonts w:ascii="Times New Roman" w:hAnsi="Times New Roman" w:cs="Times New Roman"/>
+          <w:color w:val="000000" w:themeColor="text1"/>
+          <w:sz w:val="24"/>
+          <w:szCs w:val="24"/>
+        </w:rPr>
+        <w:t xml:space="preserve"> használata mindkettőnk számára új tapasztalat volt, és pozitív meglepetésként ért minket, hogy mennyire hatékonyan támogatja a közös munkavégzést. Ennek köszönhetően nemcsak a beadandó feladatot tudtuk strukturáltan és átlátható módon megvalósítani, hanem jelentős tapasztalatot is szereztünk a verziókövetés és a csapatmunka gyakorlati alkalmazásában. Összességében a projekt egyik legnagyobb pozitív élménye éppen az volt, hogy megtanultuk, hogyan lehet egy közös fejlesztést hatékonyan megszervezni és lebonyolítani GitHub környezetben.</w:t>
       </w:r>
     </w:p>
     <w:p>
@@ -10726,7 +11723,7 @@
         </w:rPr>
         <w:t xml:space="preserve">: </w:t>
       </w:r>
-      <w:hyperlink r:id="rId22" w:history="1">
+      <w:hyperlink r:id="rId23" w:history="1">
         <w:r>
           <w:rPr>
             <w:rStyle w:val="Hiperhivatkozs"/>
@@ -10771,7 +11768,7 @@
         </w:rPr>
         <w:t xml:space="preserve"> mintaprojektek gyűjteménye: </w:t>
       </w:r>
-      <w:hyperlink r:id="rId23" w:history="1">
+      <w:hyperlink r:id="rId24" w:history="1">
         <w:r>
           <w:rPr>
             <w:rStyle w:val="Hiperhivatkozs"/>
@@ -10816,7 +11813,7 @@
         </w:rPr>
         <w:t xml:space="preserve"> a logó elkészítéséhez - </w:t>
       </w:r>
-      <w:hyperlink r:id="rId24" w:history="1">
+      <w:hyperlink r:id="rId25" w:history="1">
         <w:r>
           <w:rPr>
             <w:rStyle w:val="Hiperhivatkozs"/>
@@ -10861,7 +11858,7 @@
         </w:rPr>
         <w:t xml:space="preserve"> a színpaletta kiválasztásához - </w:t>
       </w:r>
-      <w:hyperlink r:id="rId25" w:history="1">
+      <w:hyperlink r:id="rId26" w:history="1">
         <w:r>
           <w:rPr>
             <w:rStyle w:val="Hiperhivatkozs"/>
@@ -10958,7 +11955,7 @@
         </w:rPr>
         <w:t xml:space="preserve"> </w:t>
       </w:r>
-      <w:hyperlink r:id="rId26" w:history="1">
+      <w:hyperlink r:id="rId27" w:history="1">
         <w:r>
           <w:rPr>
             <w:rStyle w:val="Hiperhivatkozs"/>
@@ -11428,7 +12425,7 @@
   <w:abstractNum w:abstractNumId="4" w15:restartNumberingAfterBreak="0">
     <w:nsid w:val="28C53F42"/>
     <w:multiLevelType w:val="hybridMultilevel"/>
-    <w:tmpl w:val="2840AAE2"/>
+    <w:tmpl w:val="C1FED4FA"/>
     <w:lvl w:ilvl="0" w:tplc="040E0001">
       <w:start w:val="1"/>
       <w:numFmt w:val="bullet"/>
@@ -11441,16 +12438,15 @@
         <w:rFonts w:ascii="Symbol" w:hAnsi="Symbol" w:hint="default"/>
       </w:rPr>
     </w:lvl>
-    <w:lvl w:ilvl="1" w:tplc="040E0003" w:tentative="1">
-      <w:start w:val="1"/>
+    <w:lvl w:ilvl="1" w:tplc="0B947FAE">
       <w:numFmt w:val="bullet"/>
-      <w:lvlText w:val="o"/>
+      <w:lvlText w:val="-"/>
       <w:lvlJc w:val="left"/>
       <w:pPr>
         <w:ind w:left="2148" w:hanging="360"/>
       </w:pPr>
       <w:rPr>
-        <w:rFonts w:ascii="Courier New" w:hAnsi="Courier New" w:cs="Courier New" w:hint="default"/>
+        <w:rFonts w:ascii="Times New Roman" w:eastAsiaTheme="minorHAnsi" w:hAnsi="Times New Roman" w:cs="Times New Roman" w:hint="default"/>
       </w:rPr>
     </w:lvl>
     <w:lvl w:ilvl="2" w:tplc="040E0005" w:tentative="1">
@@ -11653,9 +12649,9 @@
     </w:lvl>
   </w:abstractNum>
   <w:abstractNum w:abstractNumId="6" w15:restartNumberingAfterBreak="0">
-    <w:nsid w:val="54230612"/>
+    <w:nsid w:val="3E0F7FEA"/>
     <w:multiLevelType w:val="hybridMultilevel"/>
-    <w:tmpl w:val="3BA2FF60"/>
+    <w:tmpl w:val="021C2E7C"/>
     <w:lvl w:ilvl="0" w:tplc="040E0001">
       <w:start w:val="1"/>
       <w:numFmt w:val="bullet"/>
@@ -11766,6 +12762,119 @@
     </w:lvl>
   </w:abstractNum>
   <w:abstractNum w:abstractNumId="7" w15:restartNumberingAfterBreak="0">
+    <w:nsid w:val="54230612"/>
+    <w:multiLevelType w:val="hybridMultilevel"/>
+    <w:tmpl w:val="3BA2FF60"/>
+    <w:lvl w:ilvl="0" w:tplc="040E0001">
+      <w:start w:val="1"/>
+      <w:numFmt w:val="bullet"/>
+      <w:lvlText w:val=""/>
+      <w:lvlJc w:val="left"/>
+      <w:pPr>
+        <w:ind w:left="1428" w:hanging="360"/>
+      </w:pPr>
+      <w:rPr>
+        <w:rFonts w:ascii="Symbol" w:hAnsi="Symbol" w:hint="default"/>
+      </w:rPr>
+    </w:lvl>
+    <w:lvl w:ilvl="1" w:tplc="040E0003" w:tentative="1">
+      <w:start w:val="1"/>
+      <w:numFmt w:val="bullet"/>
+      <w:lvlText w:val="o"/>
+      <w:lvlJc w:val="left"/>
+      <w:pPr>
+        <w:ind w:left="2148" w:hanging="360"/>
+      </w:pPr>
+      <w:rPr>
+        <w:rFonts w:ascii="Courier New" w:hAnsi="Courier New" w:cs="Courier New" w:hint="default"/>
+      </w:rPr>
+    </w:lvl>
+    <w:lvl w:ilvl="2" w:tplc="040E0005" w:tentative="1">
+      <w:start w:val="1"/>
+      <w:numFmt w:val="bullet"/>
+      <w:lvlText w:val=""/>
+      <w:lvlJc w:val="left"/>
+      <w:pPr>
+        <w:ind w:left="2868" w:hanging="360"/>
+      </w:pPr>
+      <w:rPr>
+        <w:rFonts w:ascii="Wingdings" w:hAnsi="Wingdings" w:hint="default"/>
+      </w:rPr>
+    </w:lvl>
+    <w:lvl w:ilvl="3" w:tplc="040E0001" w:tentative="1">
+      <w:start w:val="1"/>
+      <w:numFmt w:val="bullet"/>
+      <w:lvlText w:val=""/>
+      <w:lvlJc w:val="left"/>
+      <w:pPr>
+        <w:ind w:left="3588" w:hanging="360"/>
+      </w:pPr>
+      <w:rPr>
+        <w:rFonts w:ascii="Symbol" w:hAnsi="Symbol" w:hint="default"/>
+      </w:rPr>
+    </w:lvl>
+    <w:lvl w:ilvl="4" w:tplc="040E0003" w:tentative="1">
+      <w:start w:val="1"/>
+      <w:numFmt w:val="bullet"/>
+      <w:lvlText w:val="o"/>
+      <w:lvlJc w:val="left"/>
+      <w:pPr>
+        <w:ind w:left="4308" w:hanging="360"/>
+      </w:pPr>
+      <w:rPr>
+        <w:rFonts w:ascii="Courier New" w:hAnsi="Courier New" w:cs="Courier New" w:hint="default"/>
+      </w:rPr>
+    </w:lvl>
+    <w:lvl w:ilvl="5" w:tplc="040E0005" w:tentative="1">
+      <w:start w:val="1"/>
+      <w:numFmt w:val="bullet"/>
+      <w:lvlText w:val=""/>
+      <w:lvlJc w:val="left"/>
+      <w:pPr>
+        <w:ind w:left="5028" w:hanging="360"/>
+      </w:pPr>
+      <w:rPr>
+        <w:rFonts w:ascii="Wingdings" w:hAnsi="Wingdings" w:hint="default"/>
+      </w:rPr>
+    </w:lvl>
+    <w:lvl w:ilvl="6" w:tplc="040E0001" w:tentative="1">
+      <w:start w:val="1"/>
+      <w:numFmt w:val="bullet"/>
+      <w:lvlText w:val=""/>
+      <w:lvlJc w:val="left"/>
+      <w:pPr>
+        <w:ind w:left="5748" w:hanging="360"/>
+      </w:pPr>
+      <w:rPr>
+        <w:rFonts w:ascii="Symbol" w:hAnsi="Symbol" w:hint="default"/>
+      </w:rPr>
+    </w:lvl>
+    <w:lvl w:ilvl="7" w:tplc="040E0003" w:tentative="1">
+      <w:start w:val="1"/>
+      <w:numFmt w:val="bullet"/>
+      <w:lvlText w:val="o"/>
+      <w:lvlJc w:val="left"/>
+      <w:pPr>
+        <w:ind w:left="6468" w:hanging="360"/>
+      </w:pPr>
+      <w:rPr>
+        <w:rFonts w:ascii="Courier New" w:hAnsi="Courier New" w:cs="Courier New" w:hint="default"/>
+      </w:rPr>
+    </w:lvl>
+    <w:lvl w:ilvl="8" w:tplc="040E0005" w:tentative="1">
+      <w:start w:val="1"/>
+      <w:numFmt w:val="bullet"/>
+      <w:lvlText w:val=""/>
+      <w:lvlJc w:val="left"/>
+      <w:pPr>
+        <w:ind w:left="7188" w:hanging="360"/>
+      </w:pPr>
+      <w:rPr>
+        <w:rFonts w:ascii="Wingdings" w:hAnsi="Wingdings" w:hint="default"/>
+      </w:rPr>
+    </w:lvl>
+  </w:abstractNum>
+  <w:abstractNum w:abstractNumId="8" w15:restartNumberingAfterBreak="0">
     <w:nsid w:val="61247E68"/>
     <w:multiLevelType w:val="hybridMultilevel"/>
     <w:tmpl w:val="5E6CB8DE"/>
@@ -11888,19 +12997,22 @@
     <w:abstractNumId w:val="5"/>
   </w:num>
   <w:num w:numId="4" w16cid:durableId="1509557945">
-    <w:abstractNumId w:val="6"/>
+    <w:abstractNumId w:val="7"/>
   </w:num>
   <w:num w:numId="5" w16cid:durableId="584384540">
     <w:abstractNumId w:val="2"/>
   </w:num>
   <w:num w:numId="6" w16cid:durableId="797189651">
-    <w:abstractNumId w:val="7"/>
+    <w:abstractNumId w:val="8"/>
   </w:num>
   <w:num w:numId="7" w16cid:durableId="254411717">
     <w:abstractNumId w:val="0"/>
   </w:num>
   <w:num w:numId="8" w16cid:durableId="996373597">
     <w:abstractNumId w:val="4"/>
+  </w:num>
+  <w:num w:numId="9" w16cid:durableId="1105341080">
+    <w:abstractNumId w:val="6"/>
   </w:num>
 </w:numbering>
 </file>

</xml_diff>

<commit_message>
vite.config elérési utak frissítése, és a build mappa feltöltése
</commit_message>
<xml_diff>
--- a/Web-programozás 1 – Előadás Beadandó.docx
+++ b/Web-programozás 1 – Előadás Beadandó.docx
@@ -1,6 +1,6 @@
 
 <file path=word/document.xml><?xml version="1.0" encoding="utf-8"?>
-<w:document xmlns:wpc="http://schemas.microsoft.com/office/word/2010/wordprocessingCanvas" xmlns:cx="http://schemas.microsoft.com/office/drawing/2014/chartex" xmlns:cx1="http://schemas.microsoft.com/office/drawing/2015/9/8/chartex" xmlns:cx2="http://schemas.microsoft.com/office/drawing/2015/10/21/chartex" xmlns:cx3="http://schemas.microsoft.com/office/drawing/2016/5/9/chartex" xmlns:cx4="http://schemas.microsoft.com/office/drawing/2016/5/10/chartex" xmlns:cx5="http://schemas.microsoft.com/office/drawing/2016/5/11/chartex" xmlns:cx6="http://schemas.microsoft.com/office/drawing/2016/5/12/chartex" xmlns:cx7="http://schemas.microsoft.com/office/drawing/2016/5/13/chartex" xmlns:cx8="http://schemas.microsoft.com/office/drawing/2016/5/14/chartex" xmlns:mc="http://schemas.openxmlformats.org/markup-compatibility/2006" xmlns:aink="http://schemas.microsoft.com/office/drawing/2016/ink" xmlns:am3d="http://schemas.microsoft.com/office/drawing/2017/model3d" xmlns:o="urn:schemas-microsoft-com:office:office" xmlns:oel="http://schemas.microsoft.com/office/2019/extlst" xmlns:r="http://schemas.openxmlformats.org/officeDocument/2006/relationships" xmlns:m="http://schemas.openxmlformats.org/officeDocument/2006/math" xmlns:v="urn:schemas-microsoft-com:vml" xmlns:wp14="http://schemas.microsoft.com/office/word/2010/wordprocessingDrawing" xmlns:wp="http://schemas.openxmlformats.org/drawingml/2006/wordprocessingDrawing" xmlns:w10="urn:schemas-microsoft-com:office:word" xmlns:w="http://schemas.openxmlformats.org/wordprocessingml/2006/main" xmlns:w14="http://schemas.microsoft.com/office/word/2010/wordml" xmlns:w15="http://schemas.microsoft.com/office/word/2012/wordml" xmlns:w16cex="http://schemas.microsoft.com/office/word/2018/wordml/cex" xmlns:w16cid="http://schemas.microsoft.com/office/word/2016/wordml/cid" xmlns:w16="http://schemas.microsoft.com/office/word/2018/wordml" xmlns:w16du="http://schemas.microsoft.com/office/word/2023/wordml/word16du" xmlns:w16sdtdh="http://schemas.microsoft.com/office/word/2020/wordml/sdtdatahash" xmlns:w16sdtfl="http://schemas.microsoft.com/office/word/2024/wordml/sdtformatlock" xmlns:w16se="http://schemas.microsoft.com/office/word/2015/wordml/symex" xmlns:wpg="http://schemas.microsoft.com/office/word/2010/wordprocessingGroup" xmlns:wpi="http://schemas.microsoft.com/office/word/2010/wordprocessingInk" xmlns:wne="http://schemas.microsoft.com/office/word/2006/wordml" xmlns:wps="http://schemas.microsoft.com/office/word/2010/wordprocessingShape" mc:Ignorable="w14 w15 w16se w16cid w16 w16cex w16sdtdh w16sdtfl w16du wp14">
+<w:document xmlns:wpc="http://schemas.microsoft.com/office/word/2010/wordprocessingCanvas" xmlns:mc="http://schemas.openxmlformats.org/markup-compatibility/2006" xmlns:o="urn:schemas-microsoft-com:office:office" xmlns:r="http://schemas.openxmlformats.org/officeDocument/2006/relationships" xmlns:m="http://schemas.openxmlformats.org/officeDocument/2006/math" xmlns:v="urn:schemas-microsoft-com:vml" xmlns:wp14="http://schemas.microsoft.com/office/word/2010/wordprocessingDrawing" xmlns:wp="http://schemas.openxmlformats.org/drawingml/2006/wordprocessingDrawing" xmlns:w10="urn:schemas-microsoft-com:office:word" xmlns:w="http://schemas.openxmlformats.org/wordprocessingml/2006/main" xmlns:w14="http://schemas.microsoft.com/office/word/2010/wordml" xmlns:w15="http://schemas.microsoft.com/office/word/2012/wordml" xmlns:wpg="http://schemas.microsoft.com/office/word/2010/wordprocessingGroup" xmlns:wpi="http://schemas.microsoft.com/office/word/2010/wordprocessingInk" xmlns:wne="http://schemas.microsoft.com/office/word/2006/wordml" xmlns:wps="http://schemas.microsoft.com/office/word/2010/wordprocessingShape" mc:Ignorable="w14 w15 wp14">
   <w:body>
     <w:p>
       <w:pPr>
@@ -2037,115 +2037,7 @@
           <w:sz w:val="24"/>
           <w:szCs w:val="24"/>
         </w:rPr>
-        <w:t xml:space="preserve">alkalmazás elkészítése volt, amelyben a hagyományos HTML–CSS alapokra építve </w:t>
-      </w:r>
-      <w:proofErr w:type="spellStart"/>
-      <w:r>
-        <w:rPr>
-          <w:rFonts w:ascii="Times New Roman" w:hAnsi="Times New Roman" w:cs="Times New Roman"/>
-          <w:sz w:val="24"/>
-          <w:szCs w:val="24"/>
-        </w:rPr>
-        <w:t>JavaScriptes</w:t>
-      </w:r>
-      <w:proofErr w:type="spellEnd"/>
-      <w:r>
-        <w:rPr>
-          <w:rFonts w:ascii="Times New Roman" w:hAnsi="Times New Roman" w:cs="Times New Roman"/>
-          <w:sz w:val="24"/>
-          <w:szCs w:val="24"/>
-        </w:rPr>
-        <w:t xml:space="preserve">, </w:t>
-      </w:r>
-      <w:proofErr w:type="spellStart"/>
-      <w:r>
-        <w:rPr>
-          <w:rFonts w:ascii="Times New Roman" w:hAnsi="Times New Roman" w:cs="Times New Roman"/>
-          <w:sz w:val="24"/>
-          <w:szCs w:val="24"/>
-        </w:rPr>
-        <w:t>Reactes</w:t>
-      </w:r>
-      <w:proofErr w:type="spellEnd"/>
-      <w:r>
-        <w:rPr>
-          <w:rFonts w:ascii="Times New Roman" w:hAnsi="Times New Roman" w:cs="Times New Roman"/>
-          <w:sz w:val="24"/>
-          <w:szCs w:val="24"/>
-        </w:rPr>
-        <w:t xml:space="preserve">, </w:t>
-      </w:r>
-      <w:proofErr w:type="spellStart"/>
-      <w:r>
-        <w:rPr>
-          <w:rFonts w:ascii="Times New Roman" w:hAnsi="Times New Roman" w:cs="Times New Roman"/>
-          <w:sz w:val="24"/>
-          <w:szCs w:val="24"/>
-        </w:rPr>
-        <w:t>Fetch</w:t>
-      </w:r>
-      <w:proofErr w:type="spellEnd"/>
-      <w:r>
-        <w:rPr>
-          <w:rFonts w:ascii="Times New Roman" w:hAnsi="Times New Roman" w:cs="Times New Roman"/>
-          <w:sz w:val="24"/>
-          <w:szCs w:val="24"/>
-        </w:rPr>
-        <w:t xml:space="preserve"> API-s és </w:t>
-      </w:r>
-      <w:proofErr w:type="spellStart"/>
-      <w:r>
-        <w:rPr>
-          <w:rFonts w:ascii="Times New Roman" w:hAnsi="Times New Roman" w:cs="Times New Roman"/>
-          <w:sz w:val="24"/>
-          <w:szCs w:val="24"/>
-        </w:rPr>
-        <w:t>Axiosos</w:t>
-      </w:r>
-      <w:proofErr w:type="spellEnd"/>
-      <w:r>
-        <w:rPr>
-          <w:rFonts w:ascii="Times New Roman" w:hAnsi="Times New Roman" w:cs="Times New Roman"/>
-          <w:sz w:val="24"/>
-          <w:szCs w:val="24"/>
-        </w:rPr>
-        <w:t xml:space="preserve"> megoldásokat is alkalmaznunk kellett. A projektet </w:t>
-      </w:r>
-      <w:proofErr w:type="spellStart"/>
-      <w:r>
-        <w:rPr>
-          <w:rFonts w:ascii="Times New Roman" w:hAnsi="Times New Roman" w:cs="Times New Roman"/>
-          <w:sz w:val="24"/>
-          <w:szCs w:val="24"/>
-        </w:rPr>
-        <w:t>kétfős</w:t>
-      </w:r>
-      <w:proofErr w:type="spellEnd"/>
-      <w:r>
-        <w:rPr>
-          <w:rFonts w:ascii="Times New Roman" w:hAnsi="Times New Roman" w:cs="Times New Roman"/>
-          <w:sz w:val="24"/>
-          <w:szCs w:val="24"/>
-        </w:rPr>
-        <w:t xml:space="preserve"> csoportban valósítottuk meg, ezért már a munka kezdetén fontos szempont volt a feladatok összehangolása, a közös munka megszervezése, valamint a fejlesztési folyamat átlátható dokumentálása. A közös fejlesztéshez a GitHubot és a GitHub </w:t>
-      </w:r>
-      <w:proofErr w:type="spellStart"/>
-      <w:r>
-        <w:rPr>
-          <w:rFonts w:ascii="Times New Roman" w:hAnsi="Times New Roman" w:cs="Times New Roman"/>
-          <w:sz w:val="24"/>
-          <w:szCs w:val="24"/>
-        </w:rPr>
-        <w:t>Desktop</w:t>
-      </w:r>
-      <w:proofErr w:type="spellEnd"/>
-      <w:r>
-        <w:rPr>
-          <w:rFonts w:ascii="Times New Roman" w:hAnsi="Times New Roman" w:cs="Times New Roman"/>
-          <w:sz w:val="24"/>
-          <w:szCs w:val="24"/>
-        </w:rPr>
-        <w:t xml:space="preserve"> alkalmazást használtuk, amely jelentősen megkönnyítette a verziókövetést és a párhuzamos munkavégzést. Mivel a beadandóhoz adatbázist is kellett választani, a fejlesztés megkezdése előtt áttekintettük a megadott adatbázis-forrásokat, és végül a </w:t>
+        <w:t xml:space="preserve">alkalmazás elkészítése volt, amelyben a hagyományos HTML–CSS alapokra építve JavaScriptes, Reactes, Fetch API-s és Axiosos megoldásokat is alkalmaznunk kellett. A projektet kétfős csoportban valósítottuk meg, ezért már a munka kezdetén fontos szempont volt a feladatok összehangolása, a közös munka megszervezése, valamint a fejlesztési folyamat átlátható dokumentálása. A közös fejlesztéshez a GitHubot és a GitHub Desktop alkalmazást használtuk, amely jelentősen megkönnyítette a verziókövetést és a párhuzamos munkavégzést. Mivel a beadandóhoz adatbázist is kellett választani, a fejlesztés megkezdése előtt áttekintettük a megadott adatbázis-forrásokat, és végül a </w:t>
       </w:r>
       <w:r>
         <w:rPr>
@@ -2217,25 +2109,7 @@
           <w:sz w:val="24"/>
           <w:szCs w:val="24"/>
         </w:rPr>
-        <w:t xml:space="preserve">a kiadott feladatok technikai megvalósítása legyen, amelyet a megadott "Web-programozás-1-Előadás" </w:t>
-      </w:r>
-      <w:proofErr w:type="spellStart"/>
-      <w:r>
-        <w:rPr>
-          <w:rFonts w:ascii="Times New Roman" w:hAnsi="Times New Roman" w:cs="Times New Roman"/>
-          <w:sz w:val="24"/>
-          <w:szCs w:val="24"/>
-        </w:rPr>
-        <w:t>pdf-ben</w:t>
-      </w:r>
-      <w:proofErr w:type="spellEnd"/>
-      <w:r>
-        <w:rPr>
-          <w:rFonts w:ascii="Times New Roman" w:hAnsi="Times New Roman" w:cs="Times New Roman"/>
-          <w:sz w:val="24"/>
-          <w:szCs w:val="24"/>
-        </w:rPr>
-        <w:t xml:space="preserve"> bemutatott </w:t>
+        <w:t xml:space="preserve">a kiadott feladatok technikai megvalósítása legyen, amelyet a megadott "Web-programozás-1-Előadás" pdf-ben bemutatott </w:t>
       </w:r>
       <w:r>
         <w:rPr>
@@ -2429,16 +2303,7 @@
           <w:sz w:val="24"/>
           <w:szCs w:val="24"/>
         </w:rPr>
-        <w:t xml:space="preserve"> a regisztrációt elvégeznie. Ezután létrehoztuk a projekt számára a „</w:t>
-      </w:r>
-      <w:proofErr w:type="spellStart"/>
-      <w:r>
-        <w:rPr>
-          <w:rFonts w:ascii="Times New Roman" w:hAnsi="Times New Roman" w:cs="Times New Roman"/>
-          <w:sz w:val="24"/>
-          <w:szCs w:val="24"/>
-        </w:rPr>
-        <w:t>webprog-</w:t>
+        <w:t xml:space="preserve"> a regisztrációt elvégeznie. Ezután létrehoztuk a projekt számára a „webprog-</w:t>
       </w:r>
       <w:r>
         <w:rPr>
@@ -2447,34 +2312,7 @@
           <w:szCs w:val="24"/>
         </w:rPr>
         <w:lastRenderedPageBreak/>
-        <w:t>beadando</w:t>
-      </w:r>
-      <w:proofErr w:type="spellEnd"/>
-      <w:r>
-        <w:rPr>
-          <w:rFonts w:ascii="Times New Roman" w:hAnsi="Times New Roman" w:cs="Times New Roman"/>
-          <w:sz w:val="24"/>
-          <w:szCs w:val="24"/>
-        </w:rPr>
-        <w:t xml:space="preserve">” nevű nyilvános </w:t>
-      </w:r>
-      <w:proofErr w:type="spellStart"/>
-      <w:r>
-        <w:rPr>
-          <w:rFonts w:ascii="Times New Roman" w:hAnsi="Times New Roman" w:cs="Times New Roman"/>
-          <w:sz w:val="24"/>
-          <w:szCs w:val="24"/>
-        </w:rPr>
-        <w:t>repository</w:t>
-      </w:r>
-      <w:proofErr w:type="spellEnd"/>
-      <w:r>
-        <w:rPr>
-          <w:rFonts w:ascii="Times New Roman" w:hAnsi="Times New Roman" w:cs="Times New Roman"/>
-          <w:sz w:val="24"/>
-          <w:szCs w:val="24"/>
-        </w:rPr>
-        <w:t xml:space="preserve">-t, amely a teljes fejlesztési folyamat központi helyszíne lett. </w:t>
+        <w:t xml:space="preserve">beadando” nevű nyilvános repository-t, amely a teljes fejlesztési folyamat központi helyszíne lett. </w:t>
       </w:r>
     </w:p>
     <w:p>
@@ -2494,25 +2332,7 @@
           <w:sz w:val="24"/>
           <w:szCs w:val="24"/>
         </w:rPr>
-        <w:t xml:space="preserve">Már a kezdetektől fontosnak tartottuk, hogy a projekt ne egyetlen nagy feltöltésből álljon, hanem több, egymást követő állapotban kerüljön fel a GitHubra, mivel a feladat értékelésének része volt a verziókövető rendszer tudatos használata is. Mindketten telepítettük a GitHub </w:t>
-      </w:r>
-      <w:proofErr w:type="spellStart"/>
-      <w:r>
-        <w:rPr>
-          <w:rFonts w:ascii="Times New Roman" w:hAnsi="Times New Roman" w:cs="Times New Roman"/>
-          <w:sz w:val="24"/>
-          <w:szCs w:val="24"/>
-        </w:rPr>
-        <w:t>Desktop</w:t>
-      </w:r>
-      <w:proofErr w:type="spellEnd"/>
-      <w:r>
-        <w:rPr>
-          <w:rFonts w:ascii="Times New Roman" w:hAnsi="Times New Roman" w:cs="Times New Roman"/>
-          <w:sz w:val="24"/>
-          <w:szCs w:val="24"/>
-        </w:rPr>
-        <w:t xml:space="preserve"> alkalmazást, mert ez </w:t>
+        <w:t xml:space="preserve">Már a kezdetektől fontosnak tartottuk, hogy a projekt ne egyetlen nagy feltöltésből álljon, hanem több, egymást követő állapotban kerüljön fel a GitHubra, mivel a feladat értékelésének része volt a verziókövető rendszer tudatos használata is. Mindketten telepítettük a GitHub Desktop alkalmazást, mert ez </w:t>
       </w:r>
       <w:r>
         <w:rPr>
@@ -2528,25 +2348,7 @@
           <w:sz w:val="24"/>
           <w:szCs w:val="24"/>
         </w:rPr>
-        <w:t xml:space="preserve">leegyszerűsítette a közös munkát, a </w:t>
-      </w:r>
-      <w:proofErr w:type="spellStart"/>
-      <w:r>
-        <w:rPr>
-          <w:rFonts w:ascii="Times New Roman" w:hAnsi="Times New Roman" w:cs="Times New Roman"/>
-          <w:sz w:val="24"/>
-          <w:szCs w:val="24"/>
-        </w:rPr>
-        <w:t>commitok</w:t>
-      </w:r>
-      <w:proofErr w:type="spellEnd"/>
-      <w:r>
-        <w:rPr>
-          <w:rFonts w:ascii="Times New Roman" w:hAnsi="Times New Roman" w:cs="Times New Roman"/>
-          <w:sz w:val="24"/>
-          <w:szCs w:val="24"/>
-        </w:rPr>
-        <w:t xml:space="preserve"> kezelését, a változások áttekintését és az egyes részfeladatok elkülönítését. </w:t>
+        <w:t xml:space="preserve">leegyszerűsítette a közös munkát, a commitok kezelését, a változások áttekintését és az egyes részfeladatok elkülönítését. </w:t>
       </w:r>
     </w:p>
     <w:p>
@@ -2922,25 +2724,7 @@
           <w:sz w:val="24"/>
           <w:szCs w:val="24"/>
         </w:rPr>
-        <w:t xml:space="preserve">Láblécbe beírtuk a készítők nevét és </w:t>
-      </w:r>
-      <w:proofErr w:type="spellStart"/>
-      <w:r>
-        <w:rPr>
-          <w:rFonts w:ascii="Times New Roman" w:hAnsi="Times New Roman" w:cs="Times New Roman"/>
-          <w:sz w:val="24"/>
-          <w:szCs w:val="24"/>
-        </w:rPr>
-        <w:t>Neptun</w:t>
-      </w:r>
-      <w:proofErr w:type="spellEnd"/>
-      <w:r>
-        <w:rPr>
-          <w:rFonts w:ascii="Times New Roman" w:hAnsi="Times New Roman" w:cs="Times New Roman"/>
-          <w:sz w:val="24"/>
-          <w:szCs w:val="24"/>
-        </w:rPr>
-        <w:t xml:space="preserve"> kódját:</w:t>
+        <w:t>Láblécbe beírtuk a készítők nevét és Neptun kódját:</w:t>
       </w:r>
     </w:p>
     <w:p>
@@ -2960,25 +2744,7 @@
           <w:sz w:val="24"/>
           <w:szCs w:val="24"/>
         </w:rPr>
-        <w:t>&lt;</w:t>
-      </w:r>
-      <w:proofErr w:type="spellStart"/>
-      <w:r>
-        <w:rPr>
-          <w:rFonts w:ascii="Times New Roman" w:hAnsi="Times New Roman" w:cs="Times New Roman"/>
-          <w:sz w:val="24"/>
-          <w:szCs w:val="24"/>
-        </w:rPr>
-        <w:t>footer</w:t>
-      </w:r>
-      <w:proofErr w:type="spellEnd"/>
-      <w:r>
-        <w:rPr>
-          <w:rFonts w:ascii="Times New Roman" w:hAnsi="Times New Roman" w:cs="Times New Roman"/>
-          <w:sz w:val="24"/>
-          <w:szCs w:val="24"/>
-        </w:rPr>
-        <w:t>&gt;</w:t>
+        <w:t>&lt;footer&gt;</w:t>
       </w:r>
     </w:p>
     <w:p>
@@ -3318,25 +3084,7 @@
           <w:sz w:val="24"/>
           <w:szCs w:val="24"/>
         </w:rPr>
-        <w:t xml:space="preserve"> már megfelelően működött, visszatértünk a főoldalhoz, és ekkor kezdtük el annak tényleges vizuális és tartalmi kiteljesítését. Ebben a szakaszban készült el a cukrászda logója is, amely a weboldal </w:t>
-      </w:r>
-      <w:proofErr w:type="spellStart"/>
-      <w:r>
-        <w:rPr>
-          <w:rFonts w:ascii="Times New Roman" w:hAnsi="Times New Roman" w:cs="Times New Roman"/>
-          <w:sz w:val="24"/>
-          <w:szCs w:val="24"/>
-        </w:rPr>
-        <w:t>arculatának</w:t>
-      </w:r>
-      <w:proofErr w:type="spellEnd"/>
-      <w:r>
-        <w:rPr>
-          <w:rFonts w:ascii="Times New Roman" w:hAnsi="Times New Roman" w:cs="Times New Roman"/>
-          <w:sz w:val="24"/>
-          <w:szCs w:val="24"/>
-        </w:rPr>
-        <w:t xml:space="preserve"> egyik meghatározó elemévé vált. A logó megtervezéséhez a</w:t>
+        <w:t xml:space="preserve"> már megfelelően működött, visszatértünk a főoldalhoz, és ekkor kezdtük el annak tényleges vizuális és tartalmi kiteljesítését. Ebben a szakaszban készült el a cukrászda logója is, amely a weboldal arculatának egyik meghatározó elemévé vált. A logó megtervezéséhez a</w:t>
       </w:r>
       <w:r>
         <w:rPr>
@@ -3679,27 +3427,14 @@
                                 <w:szCs w:val="22"/>
                               </w:rPr>
                             </w:pPr>
-                            <w:r>
-                              <w:fldChar w:fldCharType="begin"/>
-                            </w:r>
-                            <w:r>
-                              <w:instrText xml:space="preserve"> SEQ ábra \* ARABIC </w:instrText>
-                            </w:r>
-                            <w:r>
-                              <w:fldChar w:fldCharType="separate"/>
-                            </w:r>
-                            <w:r>
-                              <w:rPr>
-                                <w:noProof/>
-                              </w:rPr>
-                              <w:t>1</w:t>
-                            </w:r>
-                            <w:r>
-                              <w:rPr>
-                                <w:noProof/>
-                              </w:rPr>
-                              <w:fldChar w:fldCharType="end"/>
-                            </w:r>
+                            <w:fldSimple w:instr=" SEQ ábra \* ARABIC ">
+                              <w:r>
+                                <w:rPr>
+                                  <w:noProof/>
+                                </w:rPr>
+                                <w:t>1</w:t>
+                              </w:r>
+                            </w:fldSimple>
                             <w:r>
                               <w:t>. ábra Logó elhelyezése</w:t>
                             </w:r>
@@ -3718,7 +3453,7 @@
               </wp:anchor>
             </w:drawing>
           </mc:Choice>
-          <mc:Fallback>
+          <mc:Fallback xmlns:w16se="http://schemas.microsoft.com/office/word/2015/wordml/symex" xmlns:w16sdtfl="http://schemas.microsoft.com/office/word/2024/wordml/sdtformatlock" xmlns:w16sdtdh="http://schemas.microsoft.com/office/word/2020/wordml/sdtdatahash" xmlns:w16du="http://schemas.microsoft.com/office/word/2023/wordml/word16du" xmlns:w16="http://schemas.microsoft.com/office/word/2018/wordml" xmlns:w16cid="http://schemas.microsoft.com/office/word/2016/wordml/cid" xmlns:w16cex="http://schemas.microsoft.com/office/word/2018/wordml/cex" xmlns:oel="http://schemas.microsoft.com/office/2019/extlst" xmlns:am3d="http://schemas.microsoft.com/office/drawing/2017/model3d" xmlns:aink="http://schemas.microsoft.com/office/drawing/2016/ink" xmlns:cx8="http://schemas.microsoft.com/office/drawing/2016/5/14/chartex" xmlns:cx7="http://schemas.microsoft.com/office/drawing/2016/5/13/chartex" xmlns:cx6="http://schemas.microsoft.com/office/drawing/2016/5/12/chartex" xmlns:cx5="http://schemas.microsoft.com/office/drawing/2016/5/11/chartex" xmlns:cx4="http://schemas.microsoft.com/office/drawing/2016/5/10/chartex" xmlns:cx3="http://schemas.microsoft.com/office/drawing/2016/5/9/chartex" xmlns:cx2="http://schemas.microsoft.com/office/drawing/2015/10/21/chartex" xmlns:cx1="http://schemas.microsoft.com/office/drawing/2015/9/8/chartex" xmlns:cx="http://schemas.microsoft.com/office/drawing/2014/chartex">
             <w:pict>
               <v:shapetype w14:anchorId="5B14A4B2" id="_x0000_t202" coordsize="21600,21600" o:spt="202" path="m,l,21600r21600,l21600,xe">
                 <v:stroke joinstyle="miter"/>
@@ -3870,7 +3605,7 @@
               </wp:anchor>
             </w:drawing>
           </mc:Choice>
-          <mc:Fallback>
+          <mc:Fallback xmlns:w16se="http://schemas.microsoft.com/office/word/2015/wordml/symex" xmlns:w16sdtfl="http://schemas.microsoft.com/office/word/2024/wordml/sdtformatlock" xmlns:w16sdtdh="http://schemas.microsoft.com/office/word/2020/wordml/sdtdatahash" xmlns:w16du="http://schemas.microsoft.com/office/word/2023/wordml/word16du" xmlns:w16="http://schemas.microsoft.com/office/word/2018/wordml" xmlns:w16cid="http://schemas.microsoft.com/office/word/2016/wordml/cid" xmlns:w16cex="http://schemas.microsoft.com/office/word/2018/wordml/cex" xmlns:oel="http://schemas.microsoft.com/office/2019/extlst" xmlns:am3d="http://schemas.microsoft.com/office/drawing/2017/model3d" xmlns:aink="http://schemas.microsoft.com/office/drawing/2016/ink" xmlns:cx8="http://schemas.microsoft.com/office/drawing/2016/5/14/chartex" xmlns:cx7="http://schemas.microsoft.com/office/drawing/2016/5/13/chartex" xmlns:cx6="http://schemas.microsoft.com/office/drawing/2016/5/12/chartex" xmlns:cx5="http://schemas.microsoft.com/office/drawing/2016/5/11/chartex" xmlns:cx4="http://schemas.microsoft.com/office/drawing/2016/5/10/chartex" xmlns:cx3="http://schemas.microsoft.com/office/drawing/2016/5/9/chartex" xmlns:cx2="http://schemas.microsoft.com/office/drawing/2015/10/21/chartex" xmlns:cx1="http://schemas.microsoft.com/office/drawing/2015/9/8/chartex" xmlns:cx="http://schemas.microsoft.com/office/drawing/2014/chartex">
             <w:pict>
               <v:shape w14:anchorId="1E853F09" id="_x0000_s1027" type="#_x0000_t202" style="position:absolute;left:0;text-align:left;margin-left:270.9pt;margin-top:143.65pt;width:169.5pt;height:.05pt;z-index:251663360;visibility:visible;mso-wrap-style:square;mso-wrap-distance-left:9pt;mso-wrap-distance-top:0;mso-wrap-distance-right:9pt;mso-wrap-distance-bottom:0;mso-position-horizontal:absolute;mso-position-horizontal-relative:text;mso-position-vertical:absolute;mso-position-vertical-relative:text;v-text-anchor:top" o:gfxdata="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" stroked="f">
                 <v:textbox style="mso-fit-shape-to-text:t" inset="0,0,0,0">
@@ -3965,16 +3700,7 @@
           <w:sz w:val="24"/>
           <w:szCs w:val="24"/>
         </w:rPr>
-        <w:t xml:space="preserve"> kezdtük el az index oldal tényleges tartalmi feltöltését. A főoldalt négy különálló, jól áttekinthető tartalmi egységre osztottuk, amelyek H2-es címsorral jelentek meg. Ezek </w:t>
-      </w:r>
-      <w:proofErr w:type="gramStart"/>
-      <w:r>
-        <w:rPr>
-          <w:rFonts w:ascii="Times New Roman" w:hAnsi="Times New Roman" w:cs="Times New Roman"/>
-          <w:sz w:val="24"/>
-          <w:szCs w:val="24"/>
-        </w:rPr>
-        <w:t xml:space="preserve">a </w:t>
+        <w:t xml:space="preserve"> kezdtük el az index oldal tényleges tartalmi feltöltését. A főoldalt négy különálló, jól áttekinthető tartalmi egységre osztottuk, amelyek H2-es címsorral jelentek meg. Ezek a </w:t>
       </w:r>
       <w:r>
         <w:rPr>
@@ -3984,7 +3710,6 @@
         </w:rPr>
         <w:t>:</w:t>
       </w:r>
-      <w:proofErr w:type="gramEnd"/>
     </w:p>
     <w:p>
       <w:pPr>
@@ -4278,61 +4003,7 @@
           <w:sz w:val="24"/>
           <w:szCs w:val="24"/>
         </w:rPr>
-        <w:t xml:space="preserve">"Web-programozás-1-Előadás" </w:t>
-      </w:r>
-      <w:proofErr w:type="spellStart"/>
-      <w:r>
-        <w:rPr>
-          <w:rFonts w:ascii="Times New Roman" w:hAnsi="Times New Roman" w:cs="Times New Roman"/>
-          <w:sz w:val="24"/>
-          <w:szCs w:val="24"/>
-        </w:rPr>
-        <w:t>pdf-ben</w:t>
-      </w:r>
-      <w:proofErr w:type="spellEnd"/>
-      <w:r>
-        <w:rPr>
-          <w:rFonts w:ascii="Times New Roman" w:hAnsi="Times New Roman" w:cs="Times New Roman"/>
-          <w:sz w:val="24"/>
-          <w:szCs w:val="24"/>
-        </w:rPr>
-        <w:t xml:space="preserve"> található "CRUD alkalmazás – tömbbel - Oldal frissítésekor újraindul az alkalmazás =&gt; AJAX-</w:t>
-      </w:r>
-      <w:proofErr w:type="spellStart"/>
-      <w:r>
-        <w:rPr>
-          <w:rFonts w:ascii="Times New Roman" w:hAnsi="Times New Roman" w:cs="Times New Roman"/>
-          <w:sz w:val="24"/>
-          <w:szCs w:val="24"/>
-        </w:rPr>
-        <w:t>Fetch</w:t>
-      </w:r>
-      <w:proofErr w:type="spellEnd"/>
-      <w:r>
-        <w:rPr>
-          <w:rFonts w:ascii="Times New Roman" w:hAnsi="Times New Roman" w:cs="Times New Roman"/>
-          <w:sz w:val="24"/>
-          <w:szCs w:val="24"/>
-        </w:rPr>
-        <w:t xml:space="preserve"> API ezt majd megoldja" címszó alatt található JavaScript CRUD </w:t>
-      </w:r>
-      <w:proofErr w:type="spellStart"/>
-      <w:r>
-        <w:rPr>
-          <w:rFonts w:ascii="Times New Roman" w:hAnsi="Times New Roman" w:cs="Times New Roman"/>
-          <w:sz w:val="24"/>
-          <w:szCs w:val="24"/>
-        </w:rPr>
-        <w:t>example</w:t>
-      </w:r>
-      <w:proofErr w:type="spellEnd"/>
-      <w:r>
-        <w:rPr>
-          <w:rFonts w:ascii="Times New Roman" w:hAnsi="Times New Roman" w:cs="Times New Roman"/>
-          <w:sz w:val="24"/>
-          <w:szCs w:val="24"/>
-        </w:rPr>
-        <w:t xml:space="preserve"> részt vettük alapul és ezen anyagot használtuk fel</w:t>
+        <w:t>"Web-programozás-1-Előadás" pdf-ben található "CRUD alkalmazás – tömbbel - Oldal frissítésekor újraindul az alkalmazás =&gt; AJAX-Fetch API ezt majd megoldja" címszó alatt található JavaScript CRUD example részt vettük alapul és ezen anyagot használtuk fel</w:t>
       </w:r>
       <w:r>
         <w:rPr>
@@ -4457,33 +4128,8 @@
           <w:rFonts w:ascii="Times New Roman" w:hAnsi="Times New Roman" w:cs="Times New Roman"/>
           <w:color w:val="auto"/>
         </w:rPr>
-        <w:t xml:space="preserve">. ábra: </w:t>
-      </w:r>
-      <w:proofErr w:type="spellStart"/>
-      <w:r>
-        <w:rPr>
-          <w:rFonts w:ascii="Times New Roman" w:hAnsi="Times New Roman" w:cs="Times New Roman"/>
-          <w:color w:val="auto"/>
-        </w:rPr>
-        <w:t>Javascript</w:t>
-      </w:r>
-      <w:proofErr w:type="spellEnd"/>
-      <w:r>
-        <w:rPr>
-          <w:rFonts w:ascii="Times New Roman" w:hAnsi="Times New Roman" w:cs="Times New Roman"/>
-          <w:color w:val="auto"/>
-        </w:rPr>
-        <w:t xml:space="preserve"> </w:t>
-      </w:r>
-      <w:proofErr w:type="spellStart"/>
-      <w:r>
-        <w:rPr>
-          <w:rFonts w:ascii="Times New Roman" w:hAnsi="Times New Roman" w:cs="Times New Roman"/>
-          <w:color w:val="auto"/>
-        </w:rPr>
-        <w:t>example</w:t>
-      </w:r>
-      <w:proofErr w:type="spellEnd"/>
+        <w:t>. ábra: Javascript example</w:t>
+      </w:r>
     </w:p>
     <w:p>
       <w:pPr>
@@ -4538,42 +4184,7 @@
           <w:szCs w:val="24"/>
         </w:rPr>
         <w:tab/>
-      </w:r>
-      <w:proofErr w:type="spellStart"/>
-      <w:r>
-        <w:rPr>
-          <w:rFonts w:ascii="Times New Roman" w:hAnsi="Times New Roman" w:cs="Times New Roman"/>
-          <w:sz w:val="24"/>
-          <w:szCs w:val="24"/>
-        </w:rPr>
-        <w:t>Full</w:t>
-      </w:r>
-      <w:proofErr w:type="spellEnd"/>
-      <w:r>
-        <w:rPr>
-          <w:rFonts w:ascii="Times New Roman" w:hAnsi="Times New Roman" w:cs="Times New Roman"/>
-          <w:sz w:val="24"/>
-          <w:szCs w:val="24"/>
-        </w:rPr>
-        <w:t xml:space="preserve"> </w:t>
-      </w:r>
-      <w:proofErr w:type="spellStart"/>
-      <w:r>
-        <w:rPr>
-          <w:rFonts w:ascii="Times New Roman" w:hAnsi="Times New Roman" w:cs="Times New Roman"/>
-          <w:sz w:val="24"/>
-          <w:szCs w:val="24"/>
-        </w:rPr>
-        <w:t>Name</w:t>
-      </w:r>
-      <w:proofErr w:type="spellEnd"/>
-      <w:r>
-        <w:rPr>
-          <w:rFonts w:ascii="Times New Roman" w:hAnsi="Times New Roman" w:cs="Times New Roman"/>
-          <w:sz w:val="24"/>
-          <w:szCs w:val="24"/>
-        </w:rPr>
-        <w:t xml:space="preserve"> </w:t>
+        <w:t xml:space="preserve">Full Name </w:t>
       </w:r>
       <w:r>
         <w:rPr>
@@ -4589,25 +4200,7 @@
           <w:sz w:val="24"/>
           <w:szCs w:val="24"/>
         </w:rPr>
-        <w:t xml:space="preserve"> </w:t>
-      </w:r>
-      <w:proofErr w:type="spellStart"/>
-      <w:r>
-        <w:rPr>
-          <w:rFonts w:ascii="Times New Roman" w:hAnsi="Times New Roman" w:cs="Times New Roman"/>
-          <w:sz w:val="24"/>
-          <w:szCs w:val="24"/>
-        </w:rPr>
-        <w:t>Id</w:t>
-      </w:r>
-      <w:proofErr w:type="spellEnd"/>
-      <w:r>
-        <w:rPr>
-          <w:rFonts w:ascii="Times New Roman" w:hAnsi="Times New Roman" w:cs="Times New Roman"/>
-          <w:sz w:val="24"/>
-          <w:szCs w:val="24"/>
-        </w:rPr>
-        <w:t>*</w:t>
+        <w:t xml:space="preserve"> Id*</w:t>
       </w:r>
     </w:p>
     <w:p>
@@ -4681,24 +4274,7 @@
           <w:szCs w:val="24"/>
         </w:rPr>
         <w:tab/>
-      </w:r>
-      <w:proofErr w:type="spellStart"/>
-      <w:r>
-        <w:rPr>
-          <w:rFonts w:ascii="Times New Roman" w:hAnsi="Times New Roman" w:cs="Times New Roman"/>
-          <w:sz w:val="24"/>
-          <w:szCs w:val="24"/>
-        </w:rPr>
-        <w:t>Salary</w:t>
-      </w:r>
-      <w:proofErr w:type="spellEnd"/>
-      <w:r>
-        <w:rPr>
-          <w:rFonts w:ascii="Times New Roman" w:hAnsi="Times New Roman" w:cs="Times New Roman"/>
-          <w:sz w:val="24"/>
-          <w:szCs w:val="24"/>
-        </w:rPr>
-        <w:t xml:space="preserve"> </w:t>
+        <w:t xml:space="preserve">Salary </w:t>
       </w:r>
       <w:r>
         <w:rPr>
@@ -4788,24 +4364,7 @@
           <w:szCs w:val="24"/>
         </w:rPr>
         <w:tab/>
-      </w:r>
-      <w:proofErr w:type="spellStart"/>
-      <w:r>
-        <w:rPr>
-          <w:rFonts w:ascii="Times New Roman" w:hAnsi="Times New Roman" w:cs="Times New Roman"/>
-          <w:sz w:val="24"/>
-          <w:szCs w:val="24"/>
-        </w:rPr>
-        <w:t>Submit</w:t>
-      </w:r>
-      <w:proofErr w:type="spellEnd"/>
-      <w:r>
-        <w:rPr>
-          <w:rFonts w:ascii="Times New Roman" w:hAnsi="Times New Roman" w:cs="Times New Roman"/>
-          <w:sz w:val="24"/>
-          <w:szCs w:val="24"/>
-        </w:rPr>
-        <w:t xml:space="preserve"> </w:t>
+        <w:t xml:space="preserve">Submit </w:t>
       </w:r>
       <w:r>
         <w:rPr>
@@ -4840,97 +4399,7 @@
           <w:sz w:val="24"/>
           <w:szCs w:val="24"/>
         </w:rPr>
-        <w:t xml:space="preserve">Az eredeti </w:t>
-      </w:r>
-      <w:proofErr w:type="spellStart"/>
-      <w:r>
-        <w:rPr>
-          <w:rFonts w:ascii="Times New Roman" w:hAnsi="Times New Roman" w:cs="Times New Roman"/>
-          <w:sz w:val="24"/>
-          <w:szCs w:val="24"/>
-        </w:rPr>
-        <w:t>employee-form</w:t>
-      </w:r>
-      <w:proofErr w:type="spellEnd"/>
-      <w:r>
-        <w:rPr>
-          <w:rFonts w:ascii="Times New Roman" w:hAnsi="Times New Roman" w:cs="Times New Roman"/>
-          <w:sz w:val="24"/>
-          <w:szCs w:val="24"/>
-        </w:rPr>
-        <w:t xml:space="preserve"> elnevezést szintén lecseréltük, és a saját alkalmazásunkban suti-</w:t>
-      </w:r>
-      <w:proofErr w:type="spellStart"/>
-      <w:r>
-        <w:rPr>
-          <w:rFonts w:ascii="Times New Roman" w:hAnsi="Times New Roman" w:cs="Times New Roman"/>
-          <w:sz w:val="24"/>
-          <w:szCs w:val="24"/>
-        </w:rPr>
-        <w:t>form</w:t>
-      </w:r>
-      <w:proofErr w:type="spellEnd"/>
-      <w:r>
-        <w:rPr>
-          <w:rFonts w:ascii="Times New Roman" w:hAnsi="Times New Roman" w:cs="Times New Roman"/>
-          <w:sz w:val="24"/>
-          <w:szCs w:val="24"/>
-        </w:rPr>
-        <w:t xml:space="preserve"> néven használtuk tovább, mert így jobban kifejezte a tartalmat. Ugyanez történt az alsó adatmegjelenítő résszel is: az </w:t>
-      </w:r>
-      <w:proofErr w:type="spellStart"/>
-      <w:r>
-        <w:rPr>
-          <w:rFonts w:ascii="Times New Roman" w:hAnsi="Times New Roman" w:cs="Times New Roman"/>
-          <w:sz w:val="24"/>
-          <w:szCs w:val="24"/>
-        </w:rPr>
-        <w:t>employees-table</w:t>
-      </w:r>
-      <w:proofErr w:type="spellEnd"/>
-      <w:r>
-        <w:rPr>
-          <w:rFonts w:ascii="Times New Roman" w:hAnsi="Times New Roman" w:cs="Times New Roman"/>
-          <w:sz w:val="24"/>
-          <w:szCs w:val="24"/>
-        </w:rPr>
-        <w:t xml:space="preserve"> helyett suti-</w:t>
-      </w:r>
-      <w:proofErr w:type="spellStart"/>
-      <w:r>
-        <w:rPr>
-          <w:rFonts w:ascii="Times New Roman" w:hAnsi="Times New Roman" w:cs="Times New Roman"/>
-          <w:sz w:val="24"/>
-          <w:szCs w:val="24"/>
-        </w:rPr>
-        <w:t>table</w:t>
-      </w:r>
-      <w:proofErr w:type="spellEnd"/>
-      <w:r>
-        <w:rPr>
-          <w:rFonts w:ascii="Times New Roman" w:hAnsi="Times New Roman" w:cs="Times New Roman"/>
-          <w:sz w:val="24"/>
-          <w:szCs w:val="24"/>
-        </w:rPr>
-        <w:t xml:space="preserve"> elnevezést alkalmaztunk. Az „Edit” és „</w:t>
-      </w:r>
-      <w:proofErr w:type="spellStart"/>
-      <w:r>
-        <w:rPr>
-          <w:rFonts w:ascii="Times New Roman" w:hAnsi="Times New Roman" w:cs="Times New Roman"/>
-          <w:sz w:val="24"/>
-          <w:szCs w:val="24"/>
-        </w:rPr>
-        <w:t>Delete</w:t>
-      </w:r>
-      <w:proofErr w:type="spellEnd"/>
-      <w:r>
-        <w:rPr>
-          <w:rFonts w:ascii="Times New Roman" w:hAnsi="Times New Roman" w:cs="Times New Roman"/>
-          <w:sz w:val="24"/>
-          <w:szCs w:val="24"/>
-        </w:rPr>
-        <w:t xml:space="preserve">” gombok szintén magyar feliratot kaptak, vagyis „Módosítás” és „Törlés” formában jelentek meg. A „Sütemény típusa” mezőnél már nem egyszerű szabad szövegbevitelt alkalmaztunk, hanem előre összeállított választható listát készítettünk. Ennek előkészítéséhez </w:t>
+        <w:t xml:space="preserve">Az eredeti employee-form elnevezést szintén lecseréltük, és a saját alkalmazásunkban suti-form néven használtuk tovább, mert így jobban kifejezte a tartalmat. Ugyanez történt az alsó adatmegjelenítő résszel is: az employees-table helyett suti-table elnevezést alkalmaztunk. Az „Edit” és „Delete” gombok szintén magyar feliratot kaptak, vagyis „Módosítás” és „Törlés” formában jelentek meg. A „Sütemény típusa” mezőnél már nem egyszerű szabad szövegbevitelt alkalmaztunk, hanem előre összeállított választható listát készítettünk. Ennek előkészítéséhez </w:t>
       </w:r>
       <w:r>
         <w:rPr>
@@ -4939,61 +4408,7 @@
           <w:szCs w:val="24"/>
         </w:rPr>
         <w:lastRenderedPageBreak/>
-        <w:t xml:space="preserve">az adatbázist előbb Excel táblázatba rendeztük, majd a típusokat összegyűjtöttük és </w:t>
-      </w:r>
-      <w:proofErr w:type="spellStart"/>
-      <w:r>
-        <w:rPr>
-          <w:rFonts w:ascii="Times New Roman" w:hAnsi="Times New Roman" w:cs="Times New Roman"/>
-          <w:sz w:val="24"/>
-          <w:szCs w:val="24"/>
-        </w:rPr>
-        <w:t>option</w:t>
-      </w:r>
-      <w:proofErr w:type="spellEnd"/>
-      <w:r>
-        <w:rPr>
-          <w:rFonts w:ascii="Times New Roman" w:hAnsi="Times New Roman" w:cs="Times New Roman"/>
-          <w:sz w:val="24"/>
-          <w:szCs w:val="24"/>
-        </w:rPr>
-        <w:t xml:space="preserve"> </w:t>
-      </w:r>
-      <w:proofErr w:type="spellStart"/>
-      <w:r>
-        <w:rPr>
-          <w:rFonts w:ascii="Times New Roman" w:hAnsi="Times New Roman" w:cs="Times New Roman"/>
-          <w:sz w:val="24"/>
-          <w:szCs w:val="24"/>
-        </w:rPr>
-        <w:t>value</w:t>
-      </w:r>
-      <w:proofErr w:type="spellEnd"/>
-      <w:r>
-        <w:rPr>
-          <w:rFonts w:ascii="Times New Roman" w:hAnsi="Times New Roman" w:cs="Times New Roman"/>
-          <w:sz w:val="24"/>
-          <w:szCs w:val="24"/>
-        </w:rPr>
-        <w:t xml:space="preserve"> formában beépítettük a felületbe. Így a felhasználó csak a meghatározott típusok közül választhatott, például vegyes, sós teasütemény, bejgli, torta, tortaszelet, pite, tejszínes sütemény, édes teasütemény, különleges torta vagy krémes. Hasonló megoldást alkalmaztunk a „Díjazott” mezőnél is, ahol „igen” és „nem” opciót lehetett kiválasztani. Miután az átnevezések és a mezők </w:t>
-      </w:r>
-      <w:proofErr w:type="spellStart"/>
-      <w:r>
-        <w:rPr>
-          <w:rFonts w:ascii="Times New Roman" w:hAnsi="Times New Roman" w:cs="Times New Roman"/>
-          <w:sz w:val="24"/>
-          <w:szCs w:val="24"/>
-        </w:rPr>
-        <w:t>testreszabása</w:t>
-      </w:r>
-      <w:proofErr w:type="spellEnd"/>
-      <w:r>
-        <w:rPr>
-          <w:rFonts w:ascii="Times New Roman" w:hAnsi="Times New Roman" w:cs="Times New Roman"/>
-          <w:sz w:val="24"/>
-          <w:szCs w:val="24"/>
-        </w:rPr>
-        <w:t xml:space="preserve"> elkészült, alaposan teszteltük az oldal működését, és csak akkor kezdtük el a megjelenés finomhangolását, amikor már a CRUD logika megfelelően működött.</w:t>
+        <w:t>az adatbázist előbb Excel táblázatba rendeztük, majd a típusokat összegyűjtöttük és option value formában beépítettük a felületbe. Így a felhasználó csak a meghatározott típusok közül választhatott, például vegyes, sós teasütemény, bejgli, torta, tortaszelet, pite, tejszínes sütemény, édes teasütemény, különleges torta vagy krémes. Hasonló megoldást alkalmaztunk a „Díjazott” mezőnél is, ahol „igen” és „nem” opciót lehetett kiválasztani. Miután az átnevezések és a mezők testreszabása elkészült, alaposan teszteltük az oldal működését, és csak akkor kezdtük el a megjelenés finomhangolását, amikor már a CRUD logika megfelelően működött.</w:t>
       </w:r>
     </w:p>
     <w:p>
@@ -5432,7 +4847,7 @@
               </wp:anchor>
             </w:drawing>
           </mc:Choice>
-          <mc:Fallback>
+          <mc:Fallback xmlns:w16se="http://schemas.microsoft.com/office/word/2015/wordml/symex" xmlns:w16sdtfl="http://schemas.microsoft.com/office/word/2024/wordml/sdtformatlock" xmlns:w16sdtdh="http://schemas.microsoft.com/office/word/2020/wordml/sdtdatahash" xmlns:w16du="http://schemas.microsoft.com/office/word/2023/wordml/word16du" xmlns:w16="http://schemas.microsoft.com/office/word/2018/wordml" xmlns:w16cid="http://schemas.microsoft.com/office/word/2016/wordml/cid" xmlns:w16cex="http://schemas.microsoft.com/office/word/2018/wordml/cex" xmlns:oel="http://schemas.microsoft.com/office/2019/extlst" xmlns:am3d="http://schemas.microsoft.com/office/drawing/2017/model3d" xmlns:aink="http://schemas.microsoft.com/office/drawing/2016/ink" xmlns:cx8="http://schemas.microsoft.com/office/drawing/2016/5/14/chartex" xmlns:cx7="http://schemas.microsoft.com/office/drawing/2016/5/13/chartex" xmlns:cx6="http://schemas.microsoft.com/office/drawing/2016/5/12/chartex" xmlns:cx5="http://schemas.microsoft.com/office/drawing/2016/5/11/chartex" xmlns:cx4="http://schemas.microsoft.com/office/drawing/2016/5/10/chartex" xmlns:cx3="http://schemas.microsoft.com/office/drawing/2016/5/9/chartex" xmlns:cx2="http://schemas.microsoft.com/office/drawing/2015/10/21/chartex" xmlns:cx1="http://schemas.microsoft.com/office/drawing/2015/9/8/chartex" xmlns:cx="http://schemas.microsoft.com/office/drawing/2014/chartex">
             <w:pict>
               <v:shape w14:anchorId="1337A45E" id="_x0000_s1028" type="#_x0000_t202" style="position:absolute;left:0;text-align:left;margin-left:225pt;margin-top:181.5pt;width:227.9pt;height:.05pt;z-index:251675648;visibility:visible;mso-wrap-style:square;mso-wrap-distance-left:9pt;mso-wrap-distance-top:0;mso-wrap-distance-right:9pt;mso-wrap-distance-bottom:0;mso-position-horizontal:absolute;mso-position-horizontal-relative:text;mso-position-vertical:absolute;mso-position-vertical-relative:text;v-text-anchor:top" o:gfxdata="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" stroked="f">
                 <v:textbox style="mso-fit-shape-to-text:t" inset="0,0,0,0">
@@ -5511,43 +4926,7 @@
           <w:sz w:val="24"/>
           <w:szCs w:val="24"/>
         </w:rPr>
-        <w:t xml:space="preserve">Miután a főoldal és a JavaScript alapú CRUD alkalmazás megfelelően működött, a következő nagy feladatrész a react.html menüpont megvalósítása volt. Ennél az oldalnál a beadandó előírása szerint </w:t>
-      </w:r>
-      <w:proofErr w:type="spellStart"/>
-      <w:r>
-        <w:rPr>
-          <w:rFonts w:ascii="Times New Roman" w:hAnsi="Times New Roman" w:cs="Times New Roman"/>
-          <w:sz w:val="24"/>
-          <w:szCs w:val="24"/>
-        </w:rPr>
-        <w:t>React</w:t>
-      </w:r>
-      <w:proofErr w:type="spellEnd"/>
-      <w:r>
-        <w:rPr>
-          <w:rFonts w:ascii="Times New Roman" w:hAnsi="Times New Roman" w:cs="Times New Roman"/>
-          <w:sz w:val="24"/>
-          <w:szCs w:val="24"/>
-        </w:rPr>
-        <w:t xml:space="preserve"> segítségével kellett CRUD alkalmazást készítenünk, amely szintén a választott adatbázis egyik fájljának adatait használja fel. A fejlesztéshez a tananyagban szereplő </w:t>
-      </w:r>
-      <w:proofErr w:type="spellStart"/>
-      <w:r>
-        <w:rPr>
-          <w:rFonts w:ascii="Times New Roman" w:hAnsi="Times New Roman" w:cs="Times New Roman"/>
-          <w:sz w:val="24"/>
-          <w:szCs w:val="24"/>
-        </w:rPr>
-        <w:t>React</w:t>
-      </w:r>
-      <w:proofErr w:type="spellEnd"/>
-      <w:r>
-        <w:rPr>
-          <w:rFonts w:ascii="Times New Roman" w:hAnsi="Times New Roman" w:cs="Times New Roman"/>
-          <w:sz w:val="24"/>
-          <w:szCs w:val="24"/>
-        </w:rPr>
-        <w:t xml:space="preserve">-CRUD megoldást, valamint a tanár úr által biztosított megoldasok.zip fájlt használtuk alapként. </w:t>
+        <w:t xml:space="preserve">Miután a főoldal és a JavaScript alapú CRUD alkalmazás megfelelően működött, a következő nagy feladatrész a react.html menüpont megvalósítása volt. Ennél az oldalnál a beadandó előírása szerint React segítségével kellett CRUD alkalmazást készítenünk, amely szintén a választott adatbázis egyik fájljának adatait használja fel. A fejlesztéshez a tananyagban szereplő React-CRUD megoldást, valamint a tanár úr által biztosított megoldasok.zip fájlt használtuk alapként. </w:t>
       </w:r>
     </w:p>
     <w:p>
@@ -5567,151 +4946,7 @@
           <w:sz w:val="24"/>
           <w:szCs w:val="24"/>
         </w:rPr>
-        <w:t xml:space="preserve">Az első lépés az volt, hogy a szükséges fájlokat átemeltük a saját projektünkbe. Ezek közé tartozott a </w:t>
-      </w:r>
-      <w:proofErr w:type="spellStart"/>
-      <w:r>
-        <w:rPr>
-          <w:rFonts w:ascii="Times New Roman" w:hAnsi="Times New Roman" w:cs="Times New Roman"/>
-          <w:sz w:val="24"/>
-          <w:szCs w:val="24"/>
-        </w:rPr>
-        <w:t>src</w:t>
-      </w:r>
-      <w:proofErr w:type="spellEnd"/>
-      <w:r>
-        <w:rPr>
-          <w:rFonts w:ascii="Times New Roman" w:hAnsi="Times New Roman" w:cs="Times New Roman"/>
-          <w:sz w:val="24"/>
-          <w:szCs w:val="24"/>
-        </w:rPr>
-        <w:t>/</w:t>
-      </w:r>
-      <w:proofErr w:type="spellStart"/>
-      <w:r>
-        <w:rPr>
-          <w:rFonts w:ascii="Times New Roman" w:hAnsi="Times New Roman" w:cs="Times New Roman"/>
-          <w:sz w:val="24"/>
-          <w:szCs w:val="24"/>
-        </w:rPr>
-        <w:t>App.jsx</w:t>
-      </w:r>
-      <w:proofErr w:type="spellEnd"/>
-      <w:r>
-        <w:rPr>
-          <w:rFonts w:ascii="Times New Roman" w:hAnsi="Times New Roman" w:cs="Times New Roman"/>
-          <w:sz w:val="24"/>
-          <w:szCs w:val="24"/>
-        </w:rPr>
-        <w:t xml:space="preserve">, a </w:t>
-      </w:r>
-      <w:proofErr w:type="spellStart"/>
-      <w:r>
-        <w:rPr>
-          <w:rFonts w:ascii="Times New Roman" w:hAnsi="Times New Roman" w:cs="Times New Roman"/>
-          <w:sz w:val="24"/>
-          <w:szCs w:val="24"/>
-        </w:rPr>
-        <w:t>src</w:t>
-      </w:r>
-      <w:proofErr w:type="spellEnd"/>
-      <w:r>
-        <w:rPr>
-          <w:rFonts w:ascii="Times New Roman" w:hAnsi="Times New Roman" w:cs="Times New Roman"/>
-          <w:sz w:val="24"/>
-          <w:szCs w:val="24"/>
-        </w:rPr>
-        <w:t>/</w:t>
-      </w:r>
-      <w:proofErr w:type="spellStart"/>
-      <w:r>
-        <w:rPr>
-          <w:rFonts w:ascii="Times New Roman" w:hAnsi="Times New Roman" w:cs="Times New Roman"/>
-          <w:sz w:val="24"/>
-          <w:szCs w:val="24"/>
-        </w:rPr>
-        <w:t>main.jsx</w:t>
-      </w:r>
-      <w:proofErr w:type="spellEnd"/>
-      <w:r>
-        <w:rPr>
-          <w:rFonts w:ascii="Times New Roman" w:hAnsi="Times New Roman" w:cs="Times New Roman"/>
-          <w:sz w:val="24"/>
-          <w:szCs w:val="24"/>
-        </w:rPr>
-        <w:t xml:space="preserve">, továbbá az </w:t>
-      </w:r>
-      <w:proofErr w:type="spellStart"/>
-      <w:r>
-        <w:rPr>
-          <w:rFonts w:ascii="Times New Roman" w:hAnsi="Times New Roman" w:cs="Times New Roman"/>
-          <w:sz w:val="24"/>
-          <w:szCs w:val="24"/>
-        </w:rPr>
-        <w:t>AddUserForm</w:t>
-      </w:r>
-      <w:proofErr w:type="spellEnd"/>
-      <w:r>
-        <w:rPr>
-          <w:rFonts w:ascii="Times New Roman" w:hAnsi="Times New Roman" w:cs="Times New Roman"/>
-          <w:sz w:val="24"/>
-          <w:szCs w:val="24"/>
-        </w:rPr>
-        <w:t xml:space="preserve">, </w:t>
-      </w:r>
-      <w:proofErr w:type="spellStart"/>
-      <w:r>
-        <w:rPr>
-          <w:rFonts w:ascii="Times New Roman" w:hAnsi="Times New Roman" w:cs="Times New Roman"/>
-          <w:sz w:val="24"/>
-          <w:szCs w:val="24"/>
-        </w:rPr>
-        <w:t>EditUserForm</w:t>
-      </w:r>
-      <w:proofErr w:type="spellEnd"/>
-      <w:r>
-        <w:rPr>
-          <w:rFonts w:ascii="Times New Roman" w:hAnsi="Times New Roman" w:cs="Times New Roman"/>
-          <w:sz w:val="24"/>
-          <w:szCs w:val="24"/>
-        </w:rPr>
-        <w:t xml:space="preserve"> és </w:t>
-      </w:r>
-      <w:proofErr w:type="spellStart"/>
-      <w:r>
-        <w:rPr>
-          <w:rFonts w:ascii="Times New Roman" w:hAnsi="Times New Roman" w:cs="Times New Roman"/>
-          <w:sz w:val="24"/>
-          <w:szCs w:val="24"/>
-        </w:rPr>
-        <w:t>UserTable</w:t>
-      </w:r>
-      <w:proofErr w:type="spellEnd"/>
-      <w:r>
-        <w:rPr>
-          <w:rFonts w:ascii="Times New Roman" w:hAnsi="Times New Roman" w:cs="Times New Roman"/>
-          <w:sz w:val="24"/>
-          <w:szCs w:val="24"/>
-        </w:rPr>
-        <w:t xml:space="preserve"> komponensek. Ezzel létrejött a </w:t>
-      </w:r>
-      <w:proofErr w:type="spellStart"/>
-      <w:r>
-        <w:rPr>
-          <w:rFonts w:ascii="Times New Roman" w:hAnsi="Times New Roman" w:cs="Times New Roman"/>
-          <w:sz w:val="24"/>
-          <w:szCs w:val="24"/>
-        </w:rPr>
-        <w:t>React</w:t>
-      </w:r>
-      <w:proofErr w:type="spellEnd"/>
-      <w:r>
-        <w:rPr>
-          <w:rFonts w:ascii="Times New Roman" w:hAnsi="Times New Roman" w:cs="Times New Roman"/>
-          <w:sz w:val="24"/>
-          <w:szCs w:val="24"/>
-        </w:rPr>
-        <w:t xml:space="preserve"> alkalmazás működési alapja, amelyet ezt követően a saját témánknak megfelelően kellett átalakítani.</w:t>
+        <w:t>Az első lépés az volt, hogy a szükséges fájlokat átemeltük a saját projektünkbe. Ezek közé tartozott a src/App.jsx, a src/main.jsx, továbbá az AddUserForm, EditUserForm és UserTable komponensek. Ezzel létrejött a React alkalmazás működési alapja, amelyet ezt követően a saját témánknak megfelelően kellett átalakítani.</w:t>
       </w:r>
     </w:p>
     <w:p>
@@ -5731,259 +4966,7 @@
           <w:sz w:val="24"/>
           <w:szCs w:val="24"/>
         </w:rPr>
-        <w:t xml:space="preserve"> A react.html formázásánál fontos szerepet kapott az egységes megjelenés, ezért a </w:t>
-      </w:r>
-      <w:proofErr w:type="spellStart"/>
-      <w:r>
-        <w:rPr>
-          <w:rFonts w:ascii="Times New Roman" w:hAnsi="Times New Roman" w:cs="Times New Roman"/>
-          <w:sz w:val="24"/>
-          <w:szCs w:val="24"/>
-        </w:rPr>
-        <w:t>head</w:t>
-      </w:r>
-      <w:proofErr w:type="spellEnd"/>
-      <w:r>
-        <w:rPr>
-          <w:rFonts w:ascii="Times New Roman" w:hAnsi="Times New Roman" w:cs="Times New Roman"/>
-          <w:sz w:val="24"/>
-          <w:szCs w:val="24"/>
-        </w:rPr>
-        <w:t xml:space="preserve"> részbe bekerült a menu.css-re mutató hivatkozás, a body részhez pedig átmásoltuk az index oldal topbar szerkezetét. Emellett a navigációban az aktív menüpontot is átállítottuk úgy, hogy a </w:t>
-      </w:r>
-      <w:proofErr w:type="spellStart"/>
-      <w:r>
-        <w:rPr>
-          <w:rFonts w:ascii="Times New Roman" w:hAnsi="Times New Roman" w:cs="Times New Roman"/>
-          <w:sz w:val="24"/>
-          <w:szCs w:val="24"/>
-        </w:rPr>
-        <w:t>React</w:t>
-      </w:r>
-      <w:proofErr w:type="spellEnd"/>
-      <w:r>
-        <w:rPr>
-          <w:rFonts w:ascii="Times New Roman" w:hAnsi="Times New Roman" w:cs="Times New Roman"/>
-          <w:sz w:val="24"/>
-          <w:szCs w:val="24"/>
-        </w:rPr>
-        <w:t xml:space="preserve"> oldalnál legyen kiemelve. A tartalom elrendezéséhez a &lt;main </w:t>
-      </w:r>
-      <w:proofErr w:type="spellStart"/>
-      <w:r>
-        <w:rPr>
-          <w:rFonts w:ascii="Times New Roman" w:hAnsi="Times New Roman" w:cs="Times New Roman"/>
-          <w:sz w:val="24"/>
-          <w:szCs w:val="24"/>
-        </w:rPr>
-        <w:t>class</w:t>
-      </w:r>
-      <w:proofErr w:type="spellEnd"/>
-      <w:r>
-        <w:rPr>
-          <w:rFonts w:ascii="Times New Roman" w:hAnsi="Times New Roman" w:cs="Times New Roman"/>
-          <w:sz w:val="24"/>
-          <w:szCs w:val="24"/>
-        </w:rPr>
-        <w:t>="</w:t>
-      </w:r>
-      <w:proofErr w:type="spellStart"/>
-      <w:r>
-        <w:rPr>
-          <w:rFonts w:ascii="Times New Roman" w:hAnsi="Times New Roman" w:cs="Times New Roman"/>
-          <w:sz w:val="24"/>
-          <w:szCs w:val="24"/>
-        </w:rPr>
-        <w:t>content</w:t>
-      </w:r>
-      <w:proofErr w:type="spellEnd"/>
-      <w:r>
-        <w:rPr>
-          <w:rFonts w:ascii="Times New Roman" w:hAnsi="Times New Roman" w:cs="Times New Roman"/>
-          <w:sz w:val="24"/>
-          <w:szCs w:val="24"/>
-        </w:rPr>
-        <w:t xml:space="preserve">"&gt; részt is beillesztettük, így a </w:t>
-      </w:r>
-      <w:proofErr w:type="spellStart"/>
-      <w:r>
-        <w:rPr>
-          <w:rFonts w:ascii="Times New Roman" w:hAnsi="Times New Roman" w:cs="Times New Roman"/>
-          <w:sz w:val="24"/>
-          <w:szCs w:val="24"/>
-        </w:rPr>
-        <w:t>React</w:t>
-      </w:r>
-      <w:proofErr w:type="spellEnd"/>
-      <w:r>
-        <w:rPr>
-          <w:rFonts w:ascii="Times New Roman" w:hAnsi="Times New Roman" w:cs="Times New Roman"/>
-          <w:sz w:val="24"/>
-          <w:szCs w:val="24"/>
-        </w:rPr>
-        <w:t xml:space="preserve"> oldal vizuálisan is ugyanabba a rendszerbe került, mint a főoldal. A komponensek elnevezését teljes mértékben a saját témánkhoz igazítottuk. A </w:t>
-      </w:r>
-      <w:proofErr w:type="spellStart"/>
-      <w:r>
-        <w:rPr>
-          <w:rFonts w:ascii="Times New Roman" w:hAnsi="Times New Roman" w:cs="Times New Roman"/>
-          <w:sz w:val="24"/>
-          <w:szCs w:val="24"/>
-        </w:rPr>
-        <w:t>UserTable</w:t>
-      </w:r>
-      <w:proofErr w:type="spellEnd"/>
-      <w:r>
-        <w:rPr>
-          <w:rFonts w:ascii="Times New Roman" w:hAnsi="Times New Roman" w:cs="Times New Roman"/>
-          <w:sz w:val="24"/>
-          <w:szCs w:val="24"/>
-        </w:rPr>
-        <w:t xml:space="preserve"> helyére </w:t>
-      </w:r>
-      <w:proofErr w:type="spellStart"/>
-      <w:r>
-        <w:rPr>
-          <w:rFonts w:ascii="Times New Roman" w:hAnsi="Times New Roman" w:cs="Times New Roman"/>
-          <w:sz w:val="24"/>
-          <w:szCs w:val="24"/>
-        </w:rPr>
-        <w:t>SutemenyTable</w:t>
-      </w:r>
-      <w:proofErr w:type="spellEnd"/>
-      <w:r>
-        <w:rPr>
-          <w:rFonts w:ascii="Times New Roman" w:hAnsi="Times New Roman" w:cs="Times New Roman"/>
-          <w:sz w:val="24"/>
-          <w:szCs w:val="24"/>
-        </w:rPr>
-        <w:t xml:space="preserve">, az </w:t>
-      </w:r>
-      <w:proofErr w:type="spellStart"/>
-      <w:r>
-        <w:rPr>
-          <w:rFonts w:ascii="Times New Roman" w:hAnsi="Times New Roman" w:cs="Times New Roman"/>
-          <w:sz w:val="24"/>
-          <w:szCs w:val="24"/>
-        </w:rPr>
-        <w:t>AddUserForm</w:t>
-      </w:r>
-      <w:proofErr w:type="spellEnd"/>
-      <w:r>
-        <w:rPr>
-          <w:rFonts w:ascii="Times New Roman" w:hAnsi="Times New Roman" w:cs="Times New Roman"/>
-          <w:sz w:val="24"/>
-          <w:szCs w:val="24"/>
-        </w:rPr>
-        <w:t xml:space="preserve"> helyére </w:t>
-      </w:r>
-      <w:proofErr w:type="spellStart"/>
-      <w:r>
-        <w:rPr>
-          <w:rFonts w:ascii="Times New Roman" w:hAnsi="Times New Roman" w:cs="Times New Roman"/>
-          <w:sz w:val="24"/>
-          <w:szCs w:val="24"/>
-        </w:rPr>
-        <w:t>AddSutemenyForm</w:t>
-      </w:r>
-      <w:proofErr w:type="spellEnd"/>
-      <w:r>
-        <w:rPr>
-          <w:rFonts w:ascii="Times New Roman" w:hAnsi="Times New Roman" w:cs="Times New Roman"/>
-          <w:sz w:val="24"/>
-          <w:szCs w:val="24"/>
-        </w:rPr>
-        <w:t xml:space="preserve">, az </w:t>
-      </w:r>
-      <w:proofErr w:type="spellStart"/>
-      <w:r>
-        <w:rPr>
-          <w:rFonts w:ascii="Times New Roman" w:hAnsi="Times New Roman" w:cs="Times New Roman"/>
-          <w:sz w:val="24"/>
-          <w:szCs w:val="24"/>
-        </w:rPr>
-        <w:t>EditUserForm</w:t>
-      </w:r>
-      <w:proofErr w:type="spellEnd"/>
-      <w:r>
-        <w:rPr>
-          <w:rFonts w:ascii="Times New Roman" w:hAnsi="Times New Roman" w:cs="Times New Roman"/>
-          <w:sz w:val="24"/>
-          <w:szCs w:val="24"/>
-        </w:rPr>
-        <w:t xml:space="preserve"> helyére pedig </w:t>
-      </w:r>
-      <w:proofErr w:type="spellStart"/>
-      <w:r>
-        <w:rPr>
-          <w:rFonts w:ascii="Times New Roman" w:hAnsi="Times New Roman" w:cs="Times New Roman"/>
-          <w:sz w:val="24"/>
-          <w:szCs w:val="24"/>
-        </w:rPr>
-        <w:t>EditSutemenyForm</w:t>
-      </w:r>
-      <w:proofErr w:type="spellEnd"/>
-      <w:r>
-        <w:rPr>
-          <w:rFonts w:ascii="Times New Roman" w:hAnsi="Times New Roman" w:cs="Times New Roman"/>
-          <w:sz w:val="24"/>
-          <w:szCs w:val="24"/>
-        </w:rPr>
-        <w:t xml:space="preserve"> került. Ez a névváltás nem pusztán formai kérdés volt, hanem azt szolgálta, hogy a teljes alkalmazás nyelvezete következetes maradjon. A táblázatokban elvégeztük a szükséges feliratmódosításokat is, hogy azok illeszkedjenek a javascript.html oldalon kialakított suti-</w:t>
-      </w:r>
-      <w:proofErr w:type="spellStart"/>
-      <w:r>
-        <w:rPr>
-          <w:rFonts w:ascii="Times New Roman" w:hAnsi="Times New Roman" w:cs="Times New Roman"/>
-          <w:sz w:val="24"/>
-          <w:szCs w:val="24"/>
-        </w:rPr>
-        <w:t>form</w:t>
-      </w:r>
-      <w:proofErr w:type="spellEnd"/>
-      <w:r>
-        <w:rPr>
-          <w:rFonts w:ascii="Times New Roman" w:hAnsi="Times New Roman" w:cs="Times New Roman"/>
-          <w:sz w:val="24"/>
-          <w:szCs w:val="24"/>
-        </w:rPr>
-        <w:t xml:space="preserve"> és suti-</w:t>
-      </w:r>
-      <w:proofErr w:type="spellStart"/>
-      <w:r>
-        <w:rPr>
-          <w:rFonts w:ascii="Times New Roman" w:hAnsi="Times New Roman" w:cs="Times New Roman"/>
-          <w:sz w:val="24"/>
-          <w:szCs w:val="24"/>
-        </w:rPr>
-        <w:t>table</w:t>
-      </w:r>
-      <w:proofErr w:type="spellEnd"/>
-      <w:r>
-        <w:rPr>
-          <w:rFonts w:ascii="Times New Roman" w:hAnsi="Times New Roman" w:cs="Times New Roman"/>
-          <w:sz w:val="24"/>
-          <w:szCs w:val="24"/>
-        </w:rPr>
-        <w:t xml:space="preserve"> logikájához. A minta </w:t>
-      </w:r>
-      <w:proofErr w:type="spellStart"/>
-      <w:r>
-        <w:rPr>
-          <w:rFonts w:ascii="Times New Roman" w:hAnsi="Times New Roman" w:cs="Times New Roman"/>
-          <w:sz w:val="24"/>
-          <w:szCs w:val="24"/>
-        </w:rPr>
-        <w:t>React</w:t>
-      </w:r>
-      <w:proofErr w:type="spellEnd"/>
-      <w:r>
-        <w:rPr>
-          <w:rFonts w:ascii="Times New Roman" w:hAnsi="Times New Roman" w:cs="Times New Roman"/>
-          <w:sz w:val="24"/>
-          <w:szCs w:val="24"/>
-        </w:rPr>
-        <w:t xml:space="preserve"> táblázathoz képest plusz oszlopokat is létrehoztunk, hogy a tartalom összhangban legyen a JavaScript változattal. Ezt követően az App.css fájlt saját igényeink szerint átalakítottuk, majd később </w:t>
+        <w:t xml:space="preserve"> A react.html formázásánál fontos szerepet kapott az egységes megjelenés, ezért a head részbe bekerült a menu.css-re mutató hivatkozás, a body részhez pedig átmásoltuk az index oldal topbar szerkezetét. Emellett a navigációban az aktív menüpontot is átállítottuk úgy, hogy a React oldalnál legyen kiemelve. A tartalom elrendezéséhez a &lt;main class="content"&gt; részt is beillesztettük, így a React oldal vizuálisan is ugyanabba a rendszerbe került, mint a főoldal. A komponensek elnevezését teljes mértékben a saját témánkhoz igazítottuk. A UserTable helyére SutemenyTable, az AddUserForm helyére AddSutemenyForm, az EditUserForm helyére pedig EditSutemenyForm került. Ez a névváltás nem pusztán formai kérdés volt, hanem azt szolgálta, hogy a teljes alkalmazás nyelvezete következetes maradjon. A táblázatokban elvégeztük a szükséges feliratmódosításokat is, hogy azok illeszkedjenek a javascript.html oldalon kialakított suti-form és suti-table logikájához. A minta React táblázathoz képest plusz oszlopokat is létrehoztunk, hogy a tartalom összhangban legyen a JavaScript változattal. Ezt követően az App.css fájlt saját igényeink szerint átalakítottuk, majd később </w:t>
       </w:r>
       <w:r>
         <w:rPr>
@@ -6015,25 +4998,7 @@
           <w:sz w:val="24"/>
           <w:szCs w:val="24"/>
         </w:rPr>
-        <w:t xml:space="preserve">. Ebben a stíluslapban a JavaScript oldalhoz igazítottuk az elrendezést, vagyis ugyanazt a színvilágot és nagyon hasonló szerkezeti megoldásokat alkalmaztuk. A </w:t>
-      </w:r>
-      <w:proofErr w:type="spellStart"/>
-      <w:r>
-        <w:rPr>
-          <w:rFonts w:ascii="Times New Roman" w:hAnsi="Times New Roman" w:cs="Times New Roman"/>
-          <w:sz w:val="24"/>
-          <w:szCs w:val="24"/>
-        </w:rPr>
-        <w:t>React</w:t>
-      </w:r>
-      <w:proofErr w:type="spellEnd"/>
-      <w:r>
-        <w:rPr>
-          <w:rFonts w:ascii="Times New Roman" w:hAnsi="Times New Roman" w:cs="Times New Roman"/>
-          <w:sz w:val="24"/>
-          <w:szCs w:val="24"/>
-        </w:rPr>
-        <w:t xml:space="preserve"> oldal fejlesztése során tehát nem csupán az volt a cél, hogy működőképes CRUD alkalmazás </w:t>
+        <w:t xml:space="preserve">. Ebben a stíluslapban a JavaScript oldalhoz igazítottuk az elrendezést, vagyis ugyanazt a színvilágot és nagyon hasonló szerkezeti megoldásokat alkalmaztuk. A React oldal fejlesztése során tehát nem csupán az volt a cél, hogy működőképes CRUD alkalmazás </w:t>
       </w:r>
       <w:r>
         <w:rPr>
@@ -6042,25 +5007,7 @@
           <w:szCs w:val="24"/>
         </w:rPr>
         <w:lastRenderedPageBreak/>
-        <w:t xml:space="preserve">készüljön, hanem az is, hogy a felhasználó számára természetesnek hasson az átmenet a JavaScript és a </w:t>
-      </w:r>
-      <w:proofErr w:type="spellStart"/>
-      <w:r>
-        <w:rPr>
-          <w:rFonts w:ascii="Times New Roman" w:hAnsi="Times New Roman" w:cs="Times New Roman"/>
-          <w:sz w:val="24"/>
-          <w:szCs w:val="24"/>
-        </w:rPr>
-        <w:t>React</w:t>
-      </w:r>
-      <w:proofErr w:type="spellEnd"/>
-      <w:r>
-        <w:rPr>
-          <w:rFonts w:ascii="Times New Roman" w:hAnsi="Times New Roman" w:cs="Times New Roman"/>
-          <w:sz w:val="24"/>
-          <w:szCs w:val="24"/>
-        </w:rPr>
-        <w:t xml:space="preserve"> alapú felület között.</w:t>
+        <w:t>készüljön, hanem az is, hogy a felhasználó számára természetesnek hasson az átmenet a JavaScript és a React alapú felület között.</w:t>
       </w:r>
     </w:p>
     <w:p>
@@ -6240,43 +5187,7 @@
           <w:sz w:val="24"/>
           <w:szCs w:val="24"/>
         </w:rPr>
-        <w:t xml:space="preserve">A react.html tesztelése során észleltük, hogy a korábban kialakított reszponzív megjelenés ezen az oldalon már nem működik megfelelően. Míg a főoldal és a JavaScript oldal esetében a kisebb képernyőméretre váltás viszonylag jól kezelhető volt, a </w:t>
-      </w:r>
-      <w:proofErr w:type="spellStart"/>
-      <w:r>
-        <w:rPr>
-          <w:rFonts w:ascii="Times New Roman" w:hAnsi="Times New Roman" w:cs="Times New Roman"/>
-          <w:sz w:val="24"/>
-          <w:szCs w:val="24"/>
-        </w:rPr>
-        <w:t>React</w:t>
-      </w:r>
-      <w:proofErr w:type="spellEnd"/>
-      <w:r>
-        <w:rPr>
-          <w:rFonts w:ascii="Times New Roman" w:hAnsi="Times New Roman" w:cs="Times New Roman"/>
-          <w:sz w:val="24"/>
-          <w:szCs w:val="24"/>
-        </w:rPr>
-        <w:t xml:space="preserve"> oldalon az elrendezés elcsúszott, a táblázat nem mutatott megfelelően, és a bal oldalon elhelyezett hamburger menü sem illeszkedett harmonikusan az új szerkezethez. A probléma megoldása érdekében átdolgoztuk az oldal elrendezését, és a hamburger menüt áthelyeztük a menüsor jobb oldalára. Ezzel az apró, de lényeges módosítással az oldal sokkal rendezettebbé vált kisebb képernyőn is. A korábbi beállításokat így olyan módon finomítottuk, hogy a menü jól látható maradjon, ugyanakkor ne törje meg a </w:t>
-      </w:r>
-      <w:proofErr w:type="spellStart"/>
-      <w:r>
-        <w:rPr>
-          <w:rFonts w:ascii="Times New Roman" w:hAnsi="Times New Roman" w:cs="Times New Roman"/>
-          <w:sz w:val="24"/>
-          <w:szCs w:val="24"/>
-        </w:rPr>
-        <w:t>React</w:t>
-      </w:r>
-      <w:proofErr w:type="spellEnd"/>
-      <w:r>
-        <w:rPr>
-          <w:rFonts w:ascii="Times New Roman" w:hAnsi="Times New Roman" w:cs="Times New Roman"/>
-          <w:sz w:val="24"/>
-          <w:szCs w:val="24"/>
-        </w:rPr>
-        <w:t xml:space="preserve"> táblázat és az űrlap vizuális egységét. Ez a módosítás jól mutatja, hogy a fejlesztés során többször is szükség volt visszalépésre és </w:t>
+        <w:t xml:space="preserve">A react.html tesztelése során észleltük, hogy a korábban kialakított reszponzív megjelenés ezen az oldalon már nem működik megfelelően. Míg a főoldal és a JavaScript oldal esetében a kisebb képernyőméretre váltás viszonylag jól kezelhető volt, a React oldalon az elrendezés elcsúszott, a táblázat nem mutatott megfelelően, és a bal oldalon elhelyezett hamburger menü sem illeszkedett harmonikusan az új szerkezethez. A probléma megoldása érdekében átdolgoztuk az oldal elrendezését, és a hamburger menüt áthelyeztük a menüsor jobb oldalára. Ezzel az apró, de lényeges módosítással az oldal sokkal rendezettebbé vált kisebb képernyőn is. A korábbi beállításokat így olyan módon finomítottuk, hogy a menü jól látható maradjon, ugyanakkor ne törje meg a React táblázat és az űrlap vizuális egységét. Ez a módosítás jól mutatja, hogy a fejlesztés során többször is szükség volt visszalépésre és </w:t>
       </w:r>
       <w:r>
         <w:rPr>
@@ -6424,25 +5335,7 @@
           <w:sz w:val="24"/>
           <w:szCs w:val="24"/>
         </w:rPr>
-        <w:t xml:space="preserve">A </w:t>
-      </w:r>
-      <w:proofErr w:type="spellStart"/>
-      <w:r>
-        <w:rPr>
-          <w:rFonts w:ascii="Times New Roman" w:hAnsi="Times New Roman" w:cs="Times New Roman"/>
-          <w:sz w:val="24"/>
-          <w:szCs w:val="24"/>
-        </w:rPr>
-        <w:t>React</w:t>
-      </w:r>
-      <w:proofErr w:type="spellEnd"/>
-      <w:r>
-        <w:rPr>
-          <w:rFonts w:ascii="Times New Roman" w:hAnsi="Times New Roman" w:cs="Times New Roman"/>
-          <w:sz w:val="24"/>
-          <w:szCs w:val="24"/>
-        </w:rPr>
-        <w:t xml:space="preserve"> CRUD elkészítése után a SPA, vagyis az egyoldalas alkalmazás megvalósítása következett. Ennél a feladatrésznél a beadandó külön kiemelte, hogy két menüponttal </w:t>
+        <w:t xml:space="preserve">A React CRUD elkészítése után a SPA, vagyis az egyoldalas alkalmazás megvalósítása következett. Ennél a feladatrésznél a beadandó külön kiemelte, hogy két menüponttal </w:t>
       </w:r>
       <w:r>
         <w:rPr>
@@ -6451,133 +5344,7 @@
           <w:szCs w:val="24"/>
         </w:rPr>
         <w:lastRenderedPageBreak/>
-        <w:t xml:space="preserve">rendelkező </w:t>
-      </w:r>
-      <w:proofErr w:type="spellStart"/>
-      <w:r>
-        <w:rPr>
-          <w:rFonts w:ascii="Times New Roman" w:hAnsi="Times New Roman" w:cs="Times New Roman"/>
-          <w:sz w:val="24"/>
-          <w:szCs w:val="24"/>
-        </w:rPr>
-        <w:t>Single</w:t>
-      </w:r>
-      <w:proofErr w:type="spellEnd"/>
-      <w:r>
-        <w:rPr>
-          <w:rFonts w:ascii="Times New Roman" w:hAnsi="Times New Roman" w:cs="Times New Roman"/>
-          <w:sz w:val="24"/>
-          <w:szCs w:val="24"/>
-        </w:rPr>
-        <w:t xml:space="preserve"> Page </w:t>
-      </w:r>
-      <w:proofErr w:type="spellStart"/>
-      <w:r>
-        <w:rPr>
-          <w:rFonts w:ascii="Times New Roman" w:hAnsi="Times New Roman" w:cs="Times New Roman"/>
-          <w:sz w:val="24"/>
-          <w:szCs w:val="24"/>
-        </w:rPr>
-        <w:t>Applicationt</w:t>
-      </w:r>
-      <w:proofErr w:type="spellEnd"/>
-      <w:r>
-        <w:rPr>
-          <w:rFonts w:ascii="Times New Roman" w:hAnsi="Times New Roman" w:cs="Times New Roman"/>
-          <w:sz w:val="24"/>
-          <w:szCs w:val="24"/>
-        </w:rPr>
-        <w:t xml:space="preserve"> kell készíteni, ahol a két menüponthoz két külön </w:t>
-      </w:r>
-      <w:proofErr w:type="spellStart"/>
-      <w:r>
-        <w:rPr>
-          <w:rFonts w:ascii="Times New Roman" w:hAnsi="Times New Roman" w:cs="Times New Roman"/>
-          <w:sz w:val="24"/>
-          <w:szCs w:val="24"/>
-        </w:rPr>
-        <w:t>React</w:t>
-      </w:r>
-      <w:proofErr w:type="spellEnd"/>
-      <w:r>
-        <w:rPr>
-          <w:rFonts w:ascii="Times New Roman" w:hAnsi="Times New Roman" w:cs="Times New Roman"/>
-          <w:sz w:val="24"/>
-          <w:szCs w:val="24"/>
-        </w:rPr>
-        <w:t xml:space="preserve"> alkalmazás tartozik. A fejlesztés kezdeti szakaszában nem rögtön saját kiválasztott alkalmazásokat kerestünk, hanem először a működés logikáját akartuk stabilan megvalósítani. Ezért a megoldasok.zip fájlból átmásoltuk a </w:t>
-      </w:r>
-      <w:proofErr w:type="spellStart"/>
-      <w:r>
-        <w:rPr>
-          <w:rFonts w:ascii="Times New Roman" w:hAnsi="Times New Roman" w:cs="Times New Roman"/>
-          <w:sz w:val="24"/>
-          <w:szCs w:val="24"/>
-        </w:rPr>
-        <w:t>tic-tac-toe</w:t>
-      </w:r>
-      <w:proofErr w:type="spellEnd"/>
-      <w:r>
-        <w:rPr>
-          <w:rFonts w:ascii="Times New Roman" w:hAnsi="Times New Roman" w:cs="Times New Roman"/>
-          <w:sz w:val="24"/>
-          <w:szCs w:val="24"/>
-        </w:rPr>
-        <w:t xml:space="preserve"> és a </w:t>
-      </w:r>
-      <w:proofErr w:type="spellStart"/>
-      <w:r>
-        <w:rPr>
-          <w:rFonts w:ascii="Times New Roman" w:hAnsi="Times New Roman" w:cs="Times New Roman"/>
-          <w:sz w:val="24"/>
-          <w:szCs w:val="24"/>
-        </w:rPr>
-        <w:t>calculator</w:t>
-      </w:r>
-      <w:proofErr w:type="spellEnd"/>
-      <w:r>
-        <w:rPr>
-          <w:rFonts w:ascii="Times New Roman" w:hAnsi="Times New Roman" w:cs="Times New Roman"/>
-          <w:sz w:val="24"/>
-          <w:szCs w:val="24"/>
-        </w:rPr>
-        <w:t xml:space="preserve"> alkalmazást. Ezek jó alapot adtak ahhoz, hogy a menüváltás logikáját kipróbáljuk: a spa.html oldalon két gomb jelent meg, és ezekre kattintva ugyanazon az oldalon belül más-más alkalmazás töltődött be. Ez a működés jól szemléltette a SPA lényegét, hiszen az oldal nem töltődött újra, csak a megjelenített tartalom változott meg. A kezdeti cél tehát az volt, hogy a mechanizmus biztosan jól </w:t>
-      </w:r>
-      <w:proofErr w:type="spellStart"/>
-      <w:r>
-        <w:rPr>
-          <w:rFonts w:ascii="Times New Roman" w:hAnsi="Times New Roman" w:cs="Times New Roman"/>
-          <w:sz w:val="24"/>
-          <w:szCs w:val="24"/>
-        </w:rPr>
-        <w:t>működjön</w:t>
-      </w:r>
-      <w:proofErr w:type="spellEnd"/>
-      <w:r>
-        <w:rPr>
-          <w:rFonts w:ascii="Times New Roman" w:hAnsi="Times New Roman" w:cs="Times New Roman"/>
-          <w:sz w:val="24"/>
-          <w:szCs w:val="24"/>
-        </w:rPr>
-        <w:t xml:space="preserve">. Ezt követően kezdtük el az oldal megjelenésének hozzáigazítását a már kialakított közös arculathoz. Az index oldalról átmásoltuk a topbar és a </w:t>
-      </w:r>
-      <w:proofErr w:type="spellStart"/>
-      <w:r>
-        <w:rPr>
-          <w:rFonts w:ascii="Times New Roman" w:hAnsi="Times New Roman" w:cs="Times New Roman"/>
-          <w:sz w:val="24"/>
-          <w:szCs w:val="24"/>
-        </w:rPr>
-        <w:t>footer</w:t>
-      </w:r>
-      <w:proofErr w:type="spellEnd"/>
-      <w:r>
-        <w:rPr>
-          <w:rFonts w:ascii="Times New Roman" w:hAnsi="Times New Roman" w:cs="Times New Roman"/>
-          <w:sz w:val="24"/>
-          <w:szCs w:val="24"/>
-        </w:rPr>
-        <w:t xml:space="preserve"> szerkezetét, illetve itt is elhelyeztük a menu.css-re mutató hivatkozást.</w:t>
+        <w:t>rendelkező Single Page Applicationt kell készíteni, ahol a két menüponthoz két külön React alkalmazás tartozik. A fejlesztés kezdeti szakaszában nem rögtön saját kiválasztott alkalmazásokat kerestünk, hanem először a működés logikáját akartuk stabilan megvalósítani. Ezért a megoldasok.zip fájlból átmásoltuk a tic-tac-toe és a calculator alkalmazást. Ezek jó alapot adtak ahhoz, hogy a menüváltás logikáját kipróbáljuk: a spa.html oldalon két gomb jelent meg, és ezekre kattintva ugyanazon az oldalon belül más-más alkalmazás töltődött be. Ez a működés jól szemléltette a SPA lényegét, hiszen az oldal nem töltődött újra, csak a megjelenített tartalom változott meg. A kezdeti cél tehát az volt, hogy a mechanizmus biztosan jól működjön. Ezt követően kezdtük el az oldal megjelenésének hozzáigazítását a már kialakított közös arculathoz. Az index oldalról átmásoltuk a topbar és a footer szerkezetét, illetve itt is elhelyeztük a menu.css-re mutató hivatkozást.</w:t>
       </w:r>
     </w:p>
     <w:p>
@@ -6662,25 +5429,7 @@
           <w:sz w:val="24"/>
           <w:szCs w:val="24"/>
         </w:rPr>
-        <w:t xml:space="preserve">Miután a SPA működésének alapelve már stabilan megvolt, megkezdtük a két végleges </w:t>
-      </w:r>
-      <w:proofErr w:type="spellStart"/>
-      <w:r>
-        <w:rPr>
-          <w:rFonts w:ascii="Times New Roman" w:hAnsi="Times New Roman" w:cs="Times New Roman"/>
-          <w:sz w:val="24"/>
-          <w:szCs w:val="24"/>
-        </w:rPr>
-        <w:t>React</w:t>
-      </w:r>
-      <w:proofErr w:type="spellEnd"/>
-      <w:r>
-        <w:rPr>
-          <w:rFonts w:ascii="Times New Roman" w:hAnsi="Times New Roman" w:cs="Times New Roman"/>
-          <w:sz w:val="24"/>
-          <w:szCs w:val="24"/>
-        </w:rPr>
-        <w:t xml:space="preserve"> alkalmazás kiválasztását. Ehhez a tananyagban szereplő linket használtuk, vagyis az </w:t>
+        <w:t xml:space="preserve">Miután a SPA működésének alapelve már stabilan megvolt, megkezdtük a két végleges React alkalmazás kiválasztását. Ehhez a tananyagban szereplő linket használtuk, vagyis az </w:t>
       </w:r>
       <w:hyperlink r:id="rId16" w:history="1">
         <w:r>
@@ -6708,115 +5457,7 @@
           <w:sz w:val="24"/>
           <w:szCs w:val="24"/>
         </w:rPr>
-        <w:t xml:space="preserve">GitHub gyűjteményt. Több projektet is megvizsgáltunk, például a </w:t>
-      </w:r>
-      <w:proofErr w:type="spellStart"/>
-      <w:r>
-        <w:rPr>
-          <w:rFonts w:ascii="Times New Roman" w:hAnsi="Times New Roman" w:cs="Times New Roman"/>
-          <w:sz w:val="24"/>
-          <w:szCs w:val="24"/>
-        </w:rPr>
-        <w:t>weight</w:t>
-      </w:r>
-      <w:proofErr w:type="spellEnd"/>
-      <w:r>
-        <w:rPr>
-          <w:rFonts w:ascii="Times New Roman" w:hAnsi="Times New Roman" w:cs="Times New Roman"/>
-          <w:sz w:val="24"/>
-          <w:szCs w:val="24"/>
-        </w:rPr>
-        <w:t xml:space="preserve"> </w:t>
-      </w:r>
-      <w:proofErr w:type="spellStart"/>
-      <w:r>
-        <w:rPr>
-          <w:rFonts w:ascii="Times New Roman" w:hAnsi="Times New Roman" w:cs="Times New Roman"/>
-          <w:sz w:val="24"/>
-          <w:szCs w:val="24"/>
-        </w:rPr>
-        <w:t>convertert</w:t>
-      </w:r>
-      <w:proofErr w:type="spellEnd"/>
-      <w:r>
-        <w:rPr>
-          <w:rFonts w:ascii="Times New Roman" w:hAnsi="Times New Roman" w:cs="Times New Roman"/>
-          <w:sz w:val="24"/>
-          <w:szCs w:val="24"/>
-        </w:rPr>
-        <w:t xml:space="preserve">, a </w:t>
-      </w:r>
-      <w:proofErr w:type="spellStart"/>
-      <w:r>
-        <w:rPr>
-          <w:rFonts w:ascii="Times New Roman" w:hAnsi="Times New Roman" w:cs="Times New Roman"/>
-          <w:sz w:val="24"/>
-          <w:szCs w:val="24"/>
-        </w:rPr>
-        <w:t>dice</w:t>
-      </w:r>
-      <w:proofErr w:type="spellEnd"/>
-      <w:r>
-        <w:rPr>
-          <w:rFonts w:ascii="Times New Roman" w:hAnsi="Times New Roman" w:cs="Times New Roman"/>
-          <w:sz w:val="24"/>
-          <w:szCs w:val="24"/>
-        </w:rPr>
-        <w:t xml:space="preserve">-appot, a </w:t>
-      </w:r>
-      <w:proofErr w:type="spellStart"/>
-      <w:r>
-        <w:rPr>
-          <w:rFonts w:ascii="Times New Roman" w:hAnsi="Times New Roman" w:cs="Times New Roman"/>
-          <w:sz w:val="24"/>
-          <w:szCs w:val="24"/>
-        </w:rPr>
-        <w:t>memory</w:t>
-      </w:r>
-      <w:proofErr w:type="spellEnd"/>
-      <w:r>
-        <w:rPr>
-          <w:rFonts w:ascii="Times New Roman" w:hAnsi="Times New Roman" w:cs="Times New Roman"/>
-          <w:sz w:val="24"/>
-          <w:szCs w:val="24"/>
-        </w:rPr>
-        <w:t>-</w:t>
-      </w:r>
-      <w:proofErr w:type="spellStart"/>
-      <w:r>
-        <w:rPr>
-          <w:rFonts w:ascii="Times New Roman" w:hAnsi="Times New Roman" w:cs="Times New Roman"/>
-          <w:sz w:val="24"/>
-          <w:szCs w:val="24"/>
-        </w:rPr>
-        <w:t>card</w:t>
-      </w:r>
-      <w:proofErr w:type="spellEnd"/>
-      <w:r>
-        <w:rPr>
-          <w:rFonts w:ascii="Times New Roman" w:hAnsi="Times New Roman" w:cs="Times New Roman"/>
-          <w:sz w:val="24"/>
-          <w:szCs w:val="24"/>
-        </w:rPr>
-        <w:t>-game-</w:t>
-      </w:r>
-      <w:proofErr w:type="spellStart"/>
-      <w:r>
-        <w:rPr>
-          <w:rFonts w:ascii="Times New Roman" w:hAnsi="Times New Roman" w:cs="Times New Roman"/>
-          <w:sz w:val="24"/>
-          <w:szCs w:val="24"/>
-        </w:rPr>
-        <w:t>et</w:t>
-      </w:r>
-      <w:proofErr w:type="spellEnd"/>
-      <w:r>
-        <w:rPr>
-          <w:rFonts w:ascii="Times New Roman" w:hAnsi="Times New Roman" w:cs="Times New Roman"/>
-          <w:sz w:val="24"/>
-          <w:szCs w:val="24"/>
-        </w:rPr>
-        <w:t xml:space="preserve"> és más hasonló alkalmazásokat. A választás során egyszerre kellett figyelembe venni a feladat nehézségi követelményeit és a projekt méretét is, mivel a feltöltésnél az is szempont volt, hogy a GitHubon kezelhető maradjon a mappa</w:t>
+        <w:t>GitHub gyűjteményt. Több projektet is megvizsgáltunk, például a weight convertert, a dice-appot, a memory-card-game-et és más hasonló alkalmazásokat. A választás során egyszerre kellett figyelembe venni a feladat nehézségi követelményeit és a projekt méretét is, mivel a feltöltésnél az is szempont volt, hogy a GitHubon kezelhető maradjon a mappa</w:t>
       </w:r>
       <w:r>
         <w:rPr>
@@ -6832,133 +5473,7 @@
           <w:sz w:val="24"/>
           <w:szCs w:val="24"/>
         </w:rPr>
-        <w:t xml:space="preserve">. Végül két egyszerűbb, de jól használható és látványos alkalmazás mellett döntöttünk: a </w:t>
-      </w:r>
-      <w:proofErr w:type="spellStart"/>
-      <w:r>
-        <w:rPr>
-          <w:rFonts w:ascii="Times New Roman" w:hAnsi="Times New Roman" w:cs="Times New Roman"/>
-          <w:sz w:val="24"/>
-          <w:szCs w:val="24"/>
-        </w:rPr>
-        <w:t>digital</w:t>
-      </w:r>
-      <w:proofErr w:type="spellEnd"/>
-      <w:r>
-        <w:rPr>
-          <w:rFonts w:ascii="Times New Roman" w:hAnsi="Times New Roman" w:cs="Times New Roman"/>
-          <w:sz w:val="24"/>
-          <w:szCs w:val="24"/>
-        </w:rPr>
-        <w:t xml:space="preserve"> </w:t>
-      </w:r>
-      <w:proofErr w:type="spellStart"/>
-      <w:r>
-        <w:rPr>
-          <w:rFonts w:ascii="Times New Roman" w:hAnsi="Times New Roman" w:cs="Times New Roman"/>
-          <w:sz w:val="24"/>
-          <w:szCs w:val="24"/>
-        </w:rPr>
-        <w:t>clock</w:t>
-      </w:r>
-      <w:proofErr w:type="spellEnd"/>
-      <w:r>
-        <w:rPr>
-          <w:rFonts w:ascii="Times New Roman" w:hAnsi="Times New Roman" w:cs="Times New Roman"/>
-          <w:sz w:val="24"/>
-          <w:szCs w:val="24"/>
-        </w:rPr>
-        <w:t xml:space="preserve"> és a </w:t>
-      </w:r>
-      <w:proofErr w:type="spellStart"/>
-      <w:r>
-        <w:rPr>
-          <w:rFonts w:ascii="Times New Roman" w:hAnsi="Times New Roman" w:cs="Times New Roman"/>
-          <w:sz w:val="24"/>
-          <w:szCs w:val="24"/>
-        </w:rPr>
-        <w:t>date</w:t>
-      </w:r>
-      <w:proofErr w:type="spellEnd"/>
-      <w:r>
-        <w:rPr>
-          <w:rFonts w:ascii="Times New Roman" w:hAnsi="Times New Roman" w:cs="Times New Roman"/>
-          <w:sz w:val="24"/>
-          <w:szCs w:val="24"/>
-        </w:rPr>
-        <w:t xml:space="preserve"> </w:t>
-      </w:r>
-      <w:proofErr w:type="spellStart"/>
-      <w:r>
-        <w:rPr>
-          <w:rFonts w:ascii="Times New Roman" w:hAnsi="Times New Roman" w:cs="Times New Roman"/>
-          <w:sz w:val="24"/>
-          <w:szCs w:val="24"/>
-        </w:rPr>
-        <w:t>counter</w:t>
-      </w:r>
-      <w:proofErr w:type="spellEnd"/>
-      <w:r>
-        <w:rPr>
-          <w:rFonts w:ascii="Times New Roman" w:hAnsi="Times New Roman" w:cs="Times New Roman"/>
-          <w:sz w:val="24"/>
-          <w:szCs w:val="24"/>
-        </w:rPr>
-        <w:t xml:space="preserve"> app került be a végleges SPA oldalra. Ezek nehézségi szintje megfelelően illeszkedett a </w:t>
-      </w:r>
-      <w:proofErr w:type="spellStart"/>
-      <w:r>
-        <w:rPr>
-          <w:rFonts w:ascii="Times New Roman" w:hAnsi="Times New Roman" w:cs="Times New Roman"/>
-          <w:sz w:val="24"/>
-          <w:szCs w:val="24"/>
-        </w:rPr>
-        <w:t>calculator</w:t>
-      </w:r>
-      <w:proofErr w:type="spellEnd"/>
-      <w:r>
-        <w:rPr>
-          <w:rFonts w:ascii="Times New Roman" w:hAnsi="Times New Roman" w:cs="Times New Roman"/>
-          <w:sz w:val="24"/>
-          <w:szCs w:val="24"/>
-        </w:rPr>
-        <w:t xml:space="preserve"> és </w:t>
-      </w:r>
-      <w:proofErr w:type="spellStart"/>
-      <w:r>
-        <w:rPr>
-          <w:rFonts w:ascii="Times New Roman" w:hAnsi="Times New Roman" w:cs="Times New Roman"/>
-          <w:sz w:val="24"/>
-          <w:szCs w:val="24"/>
-        </w:rPr>
-        <w:t>tic-tac-toe</w:t>
-      </w:r>
-      <w:proofErr w:type="spellEnd"/>
-      <w:r>
-        <w:rPr>
-          <w:rFonts w:ascii="Times New Roman" w:hAnsi="Times New Roman" w:cs="Times New Roman"/>
-          <w:sz w:val="24"/>
-          <w:szCs w:val="24"/>
-        </w:rPr>
-        <w:t xml:space="preserve"> példákhoz. A kiválasztott alkalmazások </w:t>
-      </w:r>
-      <w:proofErr w:type="spellStart"/>
-      <w:r>
-        <w:rPr>
-          <w:rFonts w:ascii="Times New Roman" w:hAnsi="Times New Roman" w:cs="Times New Roman"/>
-          <w:sz w:val="24"/>
-          <w:szCs w:val="24"/>
-        </w:rPr>
-        <w:t>App.jsx</w:t>
-      </w:r>
-      <w:proofErr w:type="spellEnd"/>
-      <w:r>
-        <w:rPr>
-          <w:rFonts w:ascii="Times New Roman" w:hAnsi="Times New Roman" w:cs="Times New Roman"/>
-          <w:sz w:val="24"/>
-          <w:szCs w:val="24"/>
-        </w:rPr>
-        <w:t xml:space="preserve"> kódját megkerestük, majd ezeket a korábban használt példák helyére </w:t>
+        <w:t xml:space="preserve">. Végül két egyszerűbb, de jól használható és látványos alkalmazás mellett döntöttünk: a digital clock és a date counter app került be a végleges SPA oldalra. Ezek nehézségi szintje megfelelően illeszkedett a calculator és tic-tac-toe példákhoz. A kiválasztott alkalmazások App.jsx kódját megkerestük, majd ezeket a korábban használt példák helyére </w:t>
       </w:r>
       <w:r>
         <w:rPr>
@@ -6990,97 +5505,7 @@
           <w:sz w:val="24"/>
           <w:szCs w:val="24"/>
         </w:rPr>
-        <w:t xml:space="preserve"> igazodjon. Az </w:t>
-      </w:r>
-      <w:proofErr w:type="spellStart"/>
-      <w:r>
-        <w:rPr>
-          <w:rFonts w:ascii="Times New Roman" w:hAnsi="Times New Roman" w:cs="Times New Roman"/>
-          <w:sz w:val="24"/>
-          <w:szCs w:val="24"/>
-        </w:rPr>
-        <w:t>SpaPage.jsx</w:t>
-      </w:r>
-      <w:proofErr w:type="spellEnd"/>
-      <w:r>
-        <w:rPr>
-          <w:rFonts w:ascii="Times New Roman" w:hAnsi="Times New Roman" w:cs="Times New Roman"/>
-          <w:sz w:val="24"/>
-          <w:szCs w:val="24"/>
-        </w:rPr>
-        <w:t xml:space="preserve"> fájlban átírtuk a hivatkozásokat is, így a menügombok már a </w:t>
-      </w:r>
-      <w:proofErr w:type="spellStart"/>
-      <w:r>
-        <w:rPr>
-          <w:rFonts w:ascii="Times New Roman" w:hAnsi="Times New Roman" w:cs="Times New Roman"/>
-          <w:sz w:val="24"/>
-          <w:szCs w:val="24"/>
-        </w:rPr>
-        <w:t>digital</w:t>
-      </w:r>
-      <w:proofErr w:type="spellEnd"/>
-      <w:r>
-        <w:rPr>
-          <w:rFonts w:ascii="Times New Roman" w:hAnsi="Times New Roman" w:cs="Times New Roman"/>
-          <w:sz w:val="24"/>
-          <w:szCs w:val="24"/>
-        </w:rPr>
-        <w:t xml:space="preserve"> </w:t>
-      </w:r>
-      <w:proofErr w:type="spellStart"/>
-      <w:r>
-        <w:rPr>
-          <w:rFonts w:ascii="Times New Roman" w:hAnsi="Times New Roman" w:cs="Times New Roman"/>
-          <w:sz w:val="24"/>
-          <w:szCs w:val="24"/>
-        </w:rPr>
-        <w:t>clock</w:t>
-      </w:r>
-      <w:proofErr w:type="spellEnd"/>
-      <w:r>
-        <w:rPr>
-          <w:rFonts w:ascii="Times New Roman" w:hAnsi="Times New Roman" w:cs="Times New Roman"/>
-          <w:sz w:val="24"/>
-          <w:szCs w:val="24"/>
-        </w:rPr>
-        <w:t xml:space="preserve"> és a </w:t>
-      </w:r>
-      <w:proofErr w:type="spellStart"/>
-      <w:r>
-        <w:rPr>
-          <w:rFonts w:ascii="Times New Roman" w:hAnsi="Times New Roman" w:cs="Times New Roman"/>
-          <w:sz w:val="24"/>
-          <w:szCs w:val="24"/>
-        </w:rPr>
-        <w:t>date</w:t>
-      </w:r>
-      <w:proofErr w:type="spellEnd"/>
-      <w:r>
-        <w:rPr>
-          <w:rFonts w:ascii="Times New Roman" w:hAnsi="Times New Roman" w:cs="Times New Roman"/>
-          <w:sz w:val="24"/>
-          <w:szCs w:val="24"/>
-        </w:rPr>
-        <w:t xml:space="preserve"> </w:t>
-      </w:r>
-      <w:proofErr w:type="spellStart"/>
-      <w:r>
-        <w:rPr>
-          <w:rFonts w:ascii="Times New Roman" w:hAnsi="Times New Roman" w:cs="Times New Roman"/>
-          <w:sz w:val="24"/>
-          <w:szCs w:val="24"/>
-        </w:rPr>
-        <w:t>counter</w:t>
-      </w:r>
-      <w:proofErr w:type="spellEnd"/>
-      <w:r>
-        <w:rPr>
-          <w:rFonts w:ascii="Times New Roman" w:hAnsi="Times New Roman" w:cs="Times New Roman"/>
-          <w:sz w:val="24"/>
-          <w:szCs w:val="24"/>
-        </w:rPr>
-        <w:t xml:space="preserve"> alkalmazásokat töltötték be. Miután a működés ezzel az új tartalommal is stabillá vált, megkezdtük a végső formázást. A menüválasztó gombokat a saját színpalettánkhoz igazítottuk, középre rendeztük, és ügyeltünk arra, hogy az oldal egészének hangulatát erősítsék. Emellett a </w:t>
+        <w:t xml:space="preserve"> igazodjon. Az SpaPage.jsx fájlban átírtuk a hivatkozásokat is, így a menügombok már a digital clock és a date counter alkalmazásokat töltötték be. Miután a működés ezzel az új tartalommal is stabillá vált, megkezdtük a végső formázást. A menüválasztó gombokat a saját színpalettánkhoz igazítottuk, középre rendeztük, és ügyeltünk arra, hogy az oldal egészének hangulatát erősítsék. Emellett a </w:t>
       </w:r>
       <w:r>
         <w:rPr>
@@ -7223,43 +5648,7 @@
           <w:sz w:val="24"/>
           <w:szCs w:val="24"/>
         </w:rPr>
-        <w:t xml:space="preserve">A fejlesztés lezárását követően utólag ellenőriztük a beadandó követelményeit, és ekkor vettük </w:t>
-      </w:r>
-      <w:proofErr w:type="spellStart"/>
-      <w:r>
-        <w:rPr>
-          <w:rFonts w:ascii="Times New Roman" w:hAnsi="Times New Roman" w:cs="Times New Roman"/>
-          <w:sz w:val="24"/>
-          <w:szCs w:val="24"/>
-        </w:rPr>
-        <w:t>észre</w:t>
-      </w:r>
-      <w:proofErr w:type="spellEnd"/>
-      <w:r>
-        <w:rPr>
-          <w:rFonts w:ascii="Times New Roman" w:hAnsi="Times New Roman" w:cs="Times New Roman"/>
-          <w:sz w:val="24"/>
-          <w:szCs w:val="24"/>
-        </w:rPr>
-        <w:t xml:space="preserve">, hogy a feladat előírja a </w:t>
-      </w:r>
-      <w:proofErr w:type="spellStart"/>
-      <w:r>
-        <w:rPr>
-          <w:rFonts w:ascii="Times New Roman" w:hAnsi="Times New Roman" w:cs="Times New Roman"/>
-          <w:sz w:val="24"/>
-          <w:szCs w:val="24"/>
-        </w:rPr>
-        <w:t>React</w:t>
-      </w:r>
-      <w:proofErr w:type="spellEnd"/>
-      <w:r>
-        <w:rPr>
-          <w:rFonts w:ascii="Times New Roman" w:hAnsi="Times New Roman" w:cs="Times New Roman"/>
-          <w:sz w:val="24"/>
-          <w:szCs w:val="24"/>
-        </w:rPr>
-        <w:t xml:space="preserve"> alkalmazások </w:t>
+        <w:t xml:space="preserve">A fejlesztés lezárását követően utólag ellenőriztük a beadandó követelményeit, és ekkor vettük észre, hogy a feladat előírja a React alkalmazások </w:t>
       </w:r>
       <w:r>
         <w:rPr>
@@ -7269,7 +5658,6 @@
         </w:rPr>
         <w:t>„</w:t>
       </w:r>
-      <w:proofErr w:type="spellStart"/>
       <w:r>
         <w:rPr>
           <w:rFonts w:ascii="Times New Roman" w:hAnsi="Times New Roman" w:cs="Times New Roman"/>
@@ -7278,7 +5666,6 @@
         </w:rPr>
         <w:t>src</w:t>
       </w:r>
-      <w:proofErr w:type="spellEnd"/>
       <w:r>
         <w:rPr>
           <w:rFonts w:ascii="Times New Roman" w:hAnsi="Times New Roman" w:cs="Times New Roman"/>
@@ -7303,7 +5690,6 @@
         </w:rPr>
         <w:t>„</w:t>
       </w:r>
-      <w:proofErr w:type="spellStart"/>
       <w:r>
         <w:rPr>
           <w:rFonts w:ascii="Times New Roman" w:hAnsi="Times New Roman" w:cs="Times New Roman"/>
@@ -7312,7 +5698,6 @@
         </w:rPr>
         <w:t>dist</w:t>
       </w:r>
-      <w:proofErr w:type="spellEnd"/>
       <w:r>
         <w:rPr>
           <w:rFonts w:ascii="Times New Roman" w:hAnsi="Times New Roman" w:cs="Times New Roman"/>
@@ -7327,25 +5712,7 @@
           <w:sz w:val="24"/>
           <w:szCs w:val="24"/>
         </w:rPr>
-        <w:t xml:space="preserve"> mappáinak feltöltését a GitHub </w:t>
-      </w:r>
-      <w:proofErr w:type="spellStart"/>
-      <w:r>
-        <w:rPr>
-          <w:rFonts w:ascii="Times New Roman" w:hAnsi="Times New Roman" w:cs="Times New Roman"/>
-          <w:sz w:val="24"/>
-          <w:szCs w:val="24"/>
-        </w:rPr>
-        <w:t>repozitóriumba</w:t>
-      </w:r>
-      <w:proofErr w:type="spellEnd"/>
-      <w:r>
-        <w:rPr>
-          <w:rFonts w:ascii="Times New Roman" w:hAnsi="Times New Roman" w:cs="Times New Roman"/>
-          <w:sz w:val="24"/>
-          <w:szCs w:val="24"/>
-        </w:rPr>
-        <w:t xml:space="preserve">. A kezdeti feltöltés során a </w:t>
+        <w:t xml:space="preserve"> mappáinak feltöltését a GitHub repozitóriumba. A kezdeti feltöltés során a </w:t>
       </w:r>
       <w:r>
         <w:rPr>
@@ -7361,16 +5728,7 @@
           <w:sz w:val="24"/>
           <w:szCs w:val="24"/>
         </w:rPr>
-        <w:t xml:space="preserve"> mappa még nem szerepelt a </w:t>
-      </w:r>
-      <w:proofErr w:type="spellStart"/>
-      <w:r>
-        <w:rPr>
-          <w:rFonts w:ascii="Times New Roman" w:hAnsi="Times New Roman" w:cs="Times New Roman"/>
-          <w:sz w:val="24"/>
-          <w:szCs w:val="24"/>
-        </w:rPr>
-        <w:t>repozitóriumba</w:t>
+        <w:t xml:space="preserve"> mappa még nem szerepelt a repozitóriumba</w:t>
       </w:r>
       <w:r>
         <w:rPr>
@@ -7380,68 +5738,13 @@
         </w:rPr>
         <w:t>n</w:t>
       </w:r>
-      <w:proofErr w:type="spellEnd"/>
-      <w:r>
-        <w:rPr>
-          <w:rFonts w:ascii="Times New Roman" w:hAnsi="Times New Roman" w:cs="Times New Roman"/>
-          <w:sz w:val="24"/>
-          <w:szCs w:val="24"/>
-        </w:rPr>
-        <w:t xml:space="preserve">, ezért ezt utólag pótoltuk. A </w:t>
-      </w:r>
-      <w:proofErr w:type="spellStart"/>
-      <w:r>
-        <w:rPr>
-          <w:rFonts w:ascii="Times New Roman" w:hAnsi="Times New Roman" w:cs="Times New Roman"/>
-          <w:sz w:val="24"/>
-          <w:szCs w:val="24"/>
-        </w:rPr>
-        <w:t>React</w:t>
-      </w:r>
-      <w:proofErr w:type="spellEnd"/>
-      <w:r>
-        <w:rPr>
-          <w:rFonts w:ascii="Times New Roman" w:hAnsi="Times New Roman" w:cs="Times New Roman"/>
-          <w:sz w:val="24"/>
-          <w:szCs w:val="24"/>
-        </w:rPr>
-        <w:t xml:space="preserve"> alkalmazásokat </w:t>
-      </w:r>
-      <w:proofErr w:type="spellStart"/>
-      <w:r>
-        <w:rPr>
-          <w:rFonts w:ascii="Times New Roman" w:hAnsi="Times New Roman" w:cs="Times New Roman"/>
-          <w:sz w:val="24"/>
-          <w:szCs w:val="24"/>
-        </w:rPr>
-        <w:t>Create</w:t>
-      </w:r>
-      <w:proofErr w:type="spellEnd"/>
-      <w:r>
-        <w:rPr>
-          <w:rFonts w:ascii="Times New Roman" w:hAnsi="Times New Roman" w:cs="Times New Roman"/>
-          <w:sz w:val="24"/>
-          <w:szCs w:val="24"/>
-        </w:rPr>
-        <w:t xml:space="preserve"> </w:t>
-      </w:r>
-      <w:proofErr w:type="spellStart"/>
-      <w:r>
-        <w:rPr>
-          <w:rFonts w:ascii="Times New Roman" w:hAnsi="Times New Roman" w:cs="Times New Roman"/>
-          <w:sz w:val="24"/>
-          <w:szCs w:val="24"/>
-        </w:rPr>
-        <w:t>React</w:t>
-      </w:r>
-      <w:proofErr w:type="spellEnd"/>
-      <w:r>
-        <w:rPr>
-          <w:rFonts w:ascii="Times New Roman" w:hAnsi="Times New Roman" w:cs="Times New Roman"/>
-          <w:sz w:val="24"/>
-          <w:szCs w:val="24"/>
-        </w:rPr>
-        <w:t xml:space="preserve"> App környezetben készítettük, amely nem </w:t>
+      <w:r>
+        <w:rPr>
+          <w:rFonts w:ascii="Times New Roman" w:hAnsi="Times New Roman" w:cs="Times New Roman"/>
+          <w:sz w:val="24"/>
+          <w:szCs w:val="24"/>
+        </w:rPr>
+        <w:t xml:space="preserve">, ezért ezt utólag pótoltuk. A React alkalmazásokat Create React App környezetben készítettük, amely nem </w:t>
       </w:r>
       <w:r>
         <w:rPr>
@@ -7451,7 +5754,6 @@
         </w:rPr>
         <w:t>„</w:t>
       </w:r>
-      <w:proofErr w:type="spellStart"/>
       <w:r>
         <w:rPr>
           <w:rFonts w:ascii="Times New Roman" w:hAnsi="Times New Roman" w:cs="Times New Roman"/>
@@ -7460,7 +5762,6 @@
         </w:rPr>
         <w:t>dist</w:t>
       </w:r>
-      <w:proofErr w:type="spellEnd"/>
       <w:r>
         <w:rPr>
           <w:rFonts w:ascii="Times New Roman" w:hAnsi="Times New Roman" w:cs="Times New Roman"/>
@@ -7485,7 +5786,6 @@
         </w:rPr>
         <w:t>„</w:t>
       </w:r>
-      <w:proofErr w:type="spellStart"/>
       <w:r>
         <w:rPr>
           <w:rFonts w:ascii="Times New Roman" w:hAnsi="Times New Roman" w:cs="Times New Roman"/>
@@ -7494,7 +5794,6 @@
         </w:rPr>
         <w:t>build</w:t>
       </w:r>
-      <w:proofErr w:type="spellEnd"/>
       <w:r>
         <w:rPr>
           <w:rFonts w:ascii="Times New Roman" w:hAnsi="Times New Roman" w:cs="Times New Roman"/>
@@ -7519,43 +5818,38 @@
         </w:rPr>
         <w:t>„</w:t>
       </w:r>
-      <w:proofErr w:type="spellStart"/>
-      <w:r>
-        <w:rPr>
-          <w:rFonts w:ascii="Times New Roman" w:hAnsi="Times New Roman" w:cs="Times New Roman"/>
-          <w:sz w:val="24"/>
-          <w:szCs w:val="24"/>
-        </w:rPr>
-        <w:t>npm</w:t>
-      </w:r>
-      <w:proofErr w:type="spellEnd"/>
-      <w:r>
-        <w:rPr>
-          <w:rFonts w:ascii="Times New Roman" w:hAnsi="Times New Roman" w:cs="Times New Roman"/>
-          <w:sz w:val="24"/>
-          <w:szCs w:val="24"/>
-        </w:rPr>
-        <w:t xml:space="preserve"> </w:t>
-      </w:r>
-      <w:proofErr w:type="spellStart"/>
-      <w:r>
-        <w:rPr>
-          <w:rFonts w:ascii="Times New Roman" w:hAnsi="Times New Roman" w:cs="Times New Roman"/>
-          <w:sz w:val="24"/>
-          <w:szCs w:val="24"/>
-        </w:rPr>
-        <w:t>run</w:t>
-      </w:r>
-      <w:proofErr w:type="spellEnd"/>
-      <w:r>
-        <w:rPr>
-          <w:rFonts w:ascii="Times New Roman" w:hAnsi="Times New Roman" w:cs="Times New Roman"/>
-          <w:sz w:val="24"/>
-          <w:szCs w:val="24"/>
-        </w:rPr>
-        <w:t xml:space="preserve"> </w:t>
-      </w:r>
-      <w:proofErr w:type="spellStart"/>
+      <w:r>
+        <w:rPr>
+          <w:rFonts w:ascii="Times New Roman" w:hAnsi="Times New Roman" w:cs="Times New Roman"/>
+          <w:sz w:val="24"/>
+          <w:szCs w:val="24"/>
+        </w:rPr>
+        <w:t>npm run build</w:t>
+      </w:r>
+      <w:r>
+        <w:rPr>
+          <w:rFonts w:ascii="Times New Roman" w:hAnsi="Times New Roman" w:cs="Times New Roman"/>
+          <w:sz w:val="24"/>
+          <w:szCs w:val="24"/>
+        </w:rPr>
+        <w:t>”</w:t>
+      </w:r>
+      <w:r>
+        <w:rPr>
+          <w:rFonts w:ascii="Times New Roman" w:hAnsi="Times New Roman" w:cs="Times New Roman"/>
+          <w:sz w:val="24"/>
+          <w:szCs w:val="24"/>
+        </w:rPr>
+        <w:t xml:space="preserve"> parancs futtatásakor. Ennek megfelelően a két alkalmazás (digital_clock és datecounter) esetében a </w:t>
+      </w:r>
+      <w:r>
+        <w:rPr>
+          <w:rFonts w:ascii="Times New Roman" w:hAnsi="Times New Roman" w:cs="Times New Roman"/>
+          <w:sz w:val="24"/>
+          <w:szCs w:val="24"/>
+        </w:rPr>
+        <w:t>„</w:t>
+      </w:r>
       <w:r>
         <w:rPr>
           <w:rFonts w:ascii="Times New Roman" w:hAnsi="Times New Roman" w:cs="Times New Roman"/>
@@ -7564,7 +5858,6 @@
         </w:rPr>
         <w:t>build</w:t>
       </w:r>
-      <w:proofErr w:type="spellEnd"/>
       <w:r>
         <w:rPr>
           <w:rFonts w:ascii="Times New Roman" w:hAnsi="Times New Roman" w:cs="Times New Roman"/>
@@ -7579,43 +5872,7 @@
           <w:sz w:val="24"/>
           <w:szCs w:val="24"/>
         </w:rPr>
-        <w:t xml:space="preserve"> parancs futtatásakor. Ennek megfelelően a két alkalmazás (</w:t>
-      </w:r>
-      <w:proofErr w:type="spellStart"/>
-      <w:r>
-        <w:rPr>
-          <w:rFonts w:ascii="Times New Roman" w:hAnsi="Times New Roman" w:cs="Times New Roman"/>
-          <w:sz w:val="24"/>
-          <w:szCs w:val="24"/>
-        </w:rPr>
-        <w:t>digital_clock</w:t>
-      </w:r>
-      <w:proofErr w:type="spellEnd"/>
-      <w:r>
-        <w:rPr>
-          <w:rFonts w:ascii="Times New Roman" w:hAnsi="Times New Roman" w:cs="Times New Roman"/>
-          <w:sz w:val="24"/>
-          <w:szCs w:val="24"/>
-        </w:rPr>
-        <w:t xml:space="preserve"> és </w:t>
-      </w:r>
-      <w:proofErr w:type="spellStart"/>
-      <w:r>
-        <w:rPr>
-          <w:rFonts w:ascii="Times New Roman" w:hAnsi="Times New Roman" w:cs="Times New Roman"/>
-          <w:sz w:val="24"/>
-          <w:szCs w:val="24"/>
-        </w:rPr>
-        <w:t>datecounter</w:t>
-      </w:r>
-      <w:proofErr w:type="spellEnd"/>
-      <w:r>
-        <w:rPr>
-          <w:rFonts w:ascii="Times New Roman" w:hAnsi="Times New Roman" w:cs="Times New Roman"/>
-          <w:sz w:val="24"/>
-          <w:szCs w:val="24"/>
-        </w:rPr>
-        <w:t xml:space="preserve">) esetében a </w:t>
+        <w:t xml:space="preserve"> mappák kerültek feltöltésre, amelyek a </w:t>
       </w:r>
       <w:r>
         <w:rPr>
@@ -7625,41 +5882,6 @@
         </w:rPr>
         <w:t>„</w:t>
       </w:r>
-      <w:proofErr w:type="spellStart"/>
-      <w:r>
-        <w:rPr>
-          <w:rFonts w:ascii="Times New Roman" w:hAnsi="Times New Roman" w:cs="Times New Roman"/>
-          <w:sz w:val="24"/>
-          <w:szCs w:val="24"/>
-        </w:rPr>
-        <w:t>build</w:t>
-      </w:r>
-      <w:proofErr w:type="spellEnd"/>
-      <w:r>
-        <w:rPr>
-          <w:rFonts w:ascii="Times New Roman" w:hAnsi="Times New Roman" w:cs="Times New Roman"/>
-          <w:sz w:val="24"/>
-          <w:szCs w:val="24"/>
-        </w:rPr>
-        <w:t>”</w:t>
-      </w:r>
-      <w:r>
-        <w:rPr>
-          <w:rFonts w:ascii="Times New Roman" w:hAnsi="Times New Roman" w:cs="Times New Roman"/>
-          <w:sz w:val="24"/>
-          <w:szCs w:val="24"/>
-        </w:rPr>
-        <w:t xml:space="preserve"> mappák kerültek feltöltésre, amelyek a </w:t>
-      </w:r>
-      <w:r>
-        <w:rPr>
-          <w:rFonts w:ascii="Times New Roman" w:hAnsi="Times New Roman" w:cs="Times New Roman"/>
-          <w:sz w:val="24"/>
-          <w:szCs w:val="24"/>
-        </w:rPr>
-        <w:t>„</w:t>
-      </w:r>
-      <w:proofErr w:type="spellStart"/>
       <w:r>
         <w:rPr>
           <w:rFonts w:ascii="Times New Roman" w:hAnsi="Times New Roman" w:cs="Times New Roman"/>
@@ -7668,7 +5890,6 @@
         </w:rPr>
         <w:t>dist</w:t>
       </w:r>
-      <w:proofErr w:type="spellEnd"/>
       <w:r>
         <w:rPr>
           <w:rFonts w:ascii="Times New Roman" w:hAnsi="Times New Roman" w:cs="Times New Roman"/>
@@ -7948,7 +6169,7 @@
               </wp:anchor>
             </w:drawing>
           </mc:Choice>
-          <mc:Fallback>
+          <mc:Fallback xmlns:w16se="http://schemas.microsoft.com/office/word/2015/wordml/symex" xmlns:w16sdtfl="http://schemas.microsoft.com/office/word/2024/wordml/sdtformatlock" xmlns:w16sdtdh="http://schemas.microsoft.com/office/word/2020/wordml/sdtdatahash" xmlns:w16du="http://schemas.microsoft.com/office/word/2023/wordml/word16du" xmlns:w16="http://schemas.microsoft.com/office/word/2018/wordml" xmlns:w16cid="http://schemas.microsoft.com/office/word/2016/wordml/cid" xmlns:w16cex="http://schemas.microsoft.com/office/word/2018/wordml/cex" xmlns:oel="http://schemas.microsoft.com/office/2019/extlst" xmlns:am3d="http://schemas.microsoft.com/office/drawing/2017/model3d" xmlns:aink="http://schemas.microsoft.com/office/drawing/2016/ink" xmlns:cx8="http://schemas.microsoft.com/office/drawing/2016/5/14/chartex" xmlns:cx7="http://schemas.microsoft.com/office/drawing/2016/5/13/chartex" xmlns:cx6="http://schemas.microsoft.com/office/drawing/2016/5/12/chartex" xmlns:cx5="http://schemas.microsoft.com/office/drawing/2016/5/11/chartex" xmlns:cx4="http://schemas.microsoft.com/office/drawing/2016/5/10/chartex" xmlns:cx3="http://schemas.microsoft.com/office/drawing/2016/5/9/chartex" xmlns:cx2="http://schemas.microsoft.com/office/drawing/2015/10/21/chartex" xmlns:cx1="http://schemas.microsoft.com/office/drawing/2015/9/8/chartex" xmlns:cx="http://schemas.microsoft.com/office/drawing/2014/chartex">
             <w:pict>
               <v:shape w14:anchorId="1126EC94" id="_x0000_s1029" type="#_x0000_t202" style="position:absolute;left:0;text-align:left;margin-left:223.15pt;margin-top:150pt;width:228.5pt;height:.05pt;z-index:251672576;visibility:visible;mso-wrap-style:square;mso-wrap-distance-left:9pt;mso-wrap-distance-top:0;mso-wrap-distance-right:9pt;mso-wrap-distance-bottom:0;mso-position-horizontal:absolute;mso-position-horizontal-relative:text;mso-position-vertical:absolute;mso-position-vertical-relative:text;v-text-anchor:top" o:gfxdata="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" stroked="f">
                 <v:textbox style="mso-fit-shape-to-text:t" inset="0,0,0,0">
@@ -8027,97 +6248,7 @@
           <w:sz w:val="24"/>
           <w:szCs w:val="24"/>
         </w:rPr>
-        <w:t xml:space="preserve">A fetchapi.html menüpont már egy jóval összetettebb feladatrész volt, mert itt szerveroldali adatbázis-tárolásra is szükség volt. A fejlesztés során ehhez SQL alapú adatbázist kellett létrehoznunk. Mivel a munkát Visual </w:t>
-      </w:r>
-      <w:proofErr w:type="spellStart"/>
-      <w:r>
-        <w:rPr>
-          <w:rFonts w:ascii="Times New Roman" w:hAnsi="Times New Roman" w:cs="Times New Roman"/>
-          <w:sz w:val="24"/>
-          <w:szCs w:val="24"/>
-        </w:rPr>
-        <w:t>Studio</w:t>
-      </w:r>
-      <w:proofErr w:type="spellEnd"/>
-      <w:r>
-        <w:rPr>
-          <w:rFonts w:ascii="Times New Roman" w:hAnsi="Times New Roman" w:cs="Times New Roman"/>
-          <w:sz w:val="24"/>
-          <w:szCs w:val="24"/>
-        </w:rPr>
-        <w:t xml:space="preserve"> </w:t>
-      </w:r>
-      <w:proofErr w:type="spellStart"/>
-      <w:r>
-        <w:rPr>
-          <w:rFonts w:ascii="Times New Roman" w:hAnsi="Times New Roman" w:cs="Times New Roman"/>
-          <w:sz w:val="24"/>
-          <w:szCs w:val="24"/>
-        </w:rPr>
-        <w:t>Code</w:t>
-      </w:r>
-      <w:proofErr w:type="spellEnd"/>
-      <w:r>
-        <w:rPr>
-          <w:rFonts w:ascii="Times New Roman" w:hAnsi="Times New Roman" w:cs="Times New Roman"/>
-          <w:sz w:val="24"/>
-          <w:szCs w:val="24"/>
-        </w:rPr>
-        <w:t xml:space="preserve"> környezetben végeztük, telepítettünk egy </w:t>
-      </w:r>
-      <w:proofErr w:type="spellStart"/>
-      <w:r>
-        <w:rPr>
-          <w:rFonts w:ascii="Times New Roman" w:hAnsi="Times New Roman" w:cs="Times New Roman"/>
-          <w:sz w:val="24"/>
-          <w:szCs w:val="24"/>
-        </w:rPr>
-        <w:t>SQLite</w:t>
-      </w:r>
-      <w:proofErr w:type="spellEnd"/>
-      <w:r>
-        <w:rPr>
-          <w:rFonts w:ascii="Times New Roman" w:hAnsi="Times New Roman" w:cs="Times New Roman"/>
-          <w:sz w:val="24"/>
-          <w:szCs w:val="24"/>
-        </w:rPr>
-        <w:t xml:space="preserve"> bővítményt, valamint hozzá az </w:t>
-      </w:r>
-      <w:proofErr w:type="spellStart"/>
-      <w:r>
-        <w:rPr>
-          <w:rFonts w:ascii="Times New Roman" w:hAnsi="Times New Roman" w:cs="Times New Roman"/>
-          <w:sz w:val="24"/>
-          <w:szCs w:val="24"/>
-        </w:rPr>
-        <w:t>SQLite</w:t>
-      </w:r>
-      <w:proofErr w:type="spellEnd"/>
-      <w:r>
-        <w:rPr>
-          <w:rFonts w:ascii="Times New Roman" w:hAnsi="Times New Roman" w:cs="Times New Roman"/>
-          <w:sz w:val="24"/>
-          <w:szCs w:val="24"/>
-        </w:rPr>
-        <w:t xml:space="preserve"> </w:t>
-      </w:r>
-      <w:proofErr w:type="spellStart"/>
-      <w:r>
-        <w:rPr>
-          <w:rFonts w:ascii="Times New Roman" w:hAnsi="Times New Roman" w:cs="Times New Roman"/>
-          <w:sz w:val="24"/>
-          <w:szCs w:val="24"/>
-        </w:rPr>
-        <w:t>Viewer</w:t>
-      </w:r>
-      <w:proofErr w:type="spellEnd"/>
-      <w:r>
-        <w:rPr>
-          <w:rFonts w:ascii="Times New Roman" w:hAnsi="Times New Roman" w:cs="Times New Roman"/>
-          <w:sz w:val="24"/>
-          <w:szCs w:val="24"/>
-        </w:rPr>
-        <w:t xml:space="preserve"> kiegészítőt. </w:t>
+        <w:t xml:space="preserve">A fetchapi.html menüpont már egy jóval összetettebb feladatrész volt, mert itt szerveroldali adatbázis-tárolásra is szükség volt. A fejlesztés során ehhez SQL alapú adatbázist kellett létrehoznunk. Mivel a munkát Visual Studio Code környezetben végeztük, telepítettünk egy SQLite bővítményt, valamint hozzá az SQLite Viewer kiegészítőt. </w:t>
       </w:r>
     </w:p>
     <w:p>
@@ -8138,195 +6269,15 @@
           <w:szCs w:val="24"/>
         </w:rPr>
         <w:lastRenderedPageBreak/>
-        <w:t xml:space="preserve">Ez első ránézésre praktikus megoldásnak tűnt, mert a fejlesztési környezeten belül tudtuk kezelni az adatbázist. A gyakorlatban azonban hamar kiderült, hogy ez a megoldás korlátozott. Különösen hiányzott belőle egy egyszerű exportálási lehetőség, amely megkönnyítette volna az adatok átültetését. Emiatt egy online konverterhez fordultunk, amely a </w:t>
-      </w:r>
-      <w:proofErr w:type="spellStart"/>
-      <w:r>
-        <w:rPr>
-          <w:rFonts w:ascii="Times New Roman" w:hAnsi="Times New Roman" w:cs="Times New Roman"/>
-          <w:sz w:val="24"/>
-          <w:szCs w:val="24"/>
-        </w:rPr>
-        <w:t>txt</w:t>
-      </w:r>
-      <w:proofErr w:type="spellEnd"/>
-      <w:r>
-        <w:rPr>
-          <w:rFonts w:ascii="Times New Roman" w:hAnsi="Times New Roman" w:cs="Times New Roman"/>
-          <w:sz w:val="24"/>
-          <w:szCs w:val="24"/>
-        </w:rPr>
-        <w:t xml:space="preserve"> formátumban kapott adatokat .</w:t>
-      </w:r>
-      <w:proofErr w:type="spellStart"/>
-      <w:r>
-        <w:rPr>
-          <w:rFonts w:ascii="Times New Roman" w:hAnsi="Times New Roman" w:cs="Times New Roman"/>
-          <w:sz w:val="24"/>
-          <w:szCs w:val="24"/>
-        </w:rPr>
-        <w:t>sql</w:t>
-      </w:r>
-      <w:proofErr w:type="spellEnd"/>
-      <w:r>
-        <w:rPr>
-          <w:rFonts w:ascii="Times New Roman" w:hAnsi="Times New Roman" w:cs="Times New Roman"/>
-          <w:sz w:val="24"/>
-          <w:szCs w:val="24"/>
-        </w:rPr>
-        <w:t xml:space="preserve"> kiterjesztésű, beimportálható fájlokká alakította. Ez a lépés ugyan segített, de nem volt tökéletes: bizonyos adattípusokat hibásan ismert fel a rendszer. Például az </w:t>
-      </w:r>
-      <w:proofErr w:type="spellStart"/>
-      <w:r>
-        <w:rPr>
-          <w:rFonts w:ascii="Times New Roman" w:hAnsi="Times New Roman" w:cs="Times New Roman"/>
-          <w:sz w:val="24"/>
-          <w:szCs w:val="24"/>
-        </w:rPr>
-        <w:t>Id</w:t>
-      </w:r>
-      <w:proofErr w:type="spellEnd"/>
-      <w:r>
-        <w:rPr>
-          <w:rFonts w:ascii="Times New Roman" w:hAnsi="Times New Roman" w:cs="Times New Roman"/>
-          <w:sz w:val="24"/>
-          <w:szCs w:val="24"/>
-        </w:rPr>
-        <w:t xml:space="preserve"> mezőt </w:t>
-      </w:r>
-      <w:proofErr w:type="spellStart"/>
-      <w:r>
-        <w:rPr>
-          <w:rFonts w:ascii="Times New Roman" w:hAnsi="Times New Roman" w:cs="Times New Roman"/>
-          <w:sz w:val="24"/>
-          <w:szCs w:val="24"/>
-        </w:rPr>
-        <w:t>Double</w:t>
-      </w:r>
-      <w:proofErr w:type="spellEnd"/>
-      <w:r>
-        <w:rPr>
-          <w:rFonts w:ascii="Times New Roman" w:hAnsi="Times New Roman" w:cs="Times New Roman"/>
-          <w:sz w:val="24"/>
-          <w:szCs w:val="24"/>
-        </w:rPr>
-        <w:t xml:space="preserve"> típusként próbálta létrehozni, miközben nekünk Integer típusra volt szükségünk automatikus számozással. Ezt ezért manuálisan javítottuk, hogy a rekordok azonosítása egyszerű és ütközésmentes maradjon. Az adatbázist végül kézzel hoztuk létre a VS </w:t>
-      </w:r>
-      <w:proofErr w:type="spellStart"/>
-      <w:r>
-        <w:rPr>
-          <w:rFonts w:ascii="Times New Roman" w:hAnsi="Times New Roman" w:cs="Times New Roman"/>
-          <w:sz w:val="24"/>
-          <w:szCs w:val="24"/>
-        </w:rPr>
-        <w:t>Code</w:t>
-      </w:r>
-      <w:proofErr w:type="spellEnd"/>
-      <w:r>
-        <w:rPr>
-          <w:rFonts w:ascii="Times New Roman" w:hAnsi="Times New Roman" w:cs="Times New Roman"/>
-          <w:sz w:val="24"/>
-          <w:szCs w:val="24"/>
-        </w:rPr>
-        <w:t xml:space="preserve"> környezetében. A backend kialakításánál a tanórai PHP kód szolgált kiindulási alapként, de azt rögtön láttuk, hogy az adatbázis-kapcsolatot kezelő rész nem használható változtatás nélkül. Más megoldás szükséges ugyanis XAMPP és </w:t>
-      </w:r>
-      <w:proofErr w:type="spellStart"/>
-      <w:r>
-        <w:rPr>
-          <w:rFonts w:ascii="Times New Roman" w:hAnsi="Times New Roman" w:cs="Times New Roman"/>
-          <w:sz w:val="24"/>
-          <w:szCs w:val="24"/>
-        </w:rPr>
-        <w:t>MySQL</w:t>
-      </w:r>
-      <w:proofErr w:type="spellEnd"/>
-      <w:r>
-        <w:rPr>
-          <w:rFonts w:ascii="Times New Roman" w:hAnsi="Times New Roman" w:cs="Times New Roman"/>
-          <w:sz w:val="24"/>
-          <w:szCs w:val="24"/>
-        </w:rPr>
-        <w:t xml:space="preserve"> esetén, mint </w:t>
-      </w:r>
-      <w:proofErr w:type="spellStart"/>
-      <w:r>
-        <w:rPr>
-          <w:rFonts w:ascii="Times New Roman" w:hAnsi="Times New Roman" w:cs="Times New Roman"/>
-          <w:sz w:val="24"/>
-          <w:szCs w:val="24"/>
-        </w:rPr>
-        <w:t>SQLite</w:t>
-      </w:r>
-      <w:proofErr w:type="spellEnd"/>
-      <w:r>
-        <w:rPr>
-          <w:rFonts w:ascii="Times New Roman" w:hAnsi="Times New Roman" w:cs="Times New Roman"/>
-          <w:sz w:val="24"/>
-          <w:szCs w:val="24"/>
-        </w:rPr>
-        <w:t xml:space="preserve"> használatakor. Emiatt a </w:t>
-      </w:r>
-      <w:proofErr w:type="spellStart"/>
-      <w:r>
-        <w:rPr>
-          <w:rFonts w:ascii="Times New Roman" w:hAnsi="Times New Roman" w:cs="Times New Roman"/>
-          <w:sz w:val="24"/>
-          <w:szCs w:val="24"/>
-        </w:rPr>
-        <w:t>db.php</w:t>
-      </w:r>
-      <w:proofErr w:type="spellEnd"/>
-      <w:r>
-        <w:rPr>
-          <w:rFonts w:ascii="Times New Roman" w:hAnsi="Times New Roman" w:cs="Times New Roman"/>
-          <w:sz w:val="24"/>
-          <w:szCs w:val="24"/>
-        </w:rPr>
-        <w:t xml:space="preserve"> fájlt saját környezetünkhöz kellett igazítani. Eleinte több kiolvasási probléma is jelentkezett, ezért rövidebb és egyszerűbb kódokkal próbáltuk meghatározni a hiba forrását. Csak akkor tértünk vissza a tanórai, strukturáltabb megoldáshoz, amikor az alapkapcsolat már stabilan működött. Ekkor alakítottuk át a </w:t>
-      </w:r>
-      <w:proofErr w:type="spellStart"/>
-      <w:r>
-        <w:rPr>
-          <w:rFonts w:ascii="Times New Roman" w:hAnsi="Times New Roman" w:cs="Times New Roman"/>
-          <w:sz w:val="24"/>
-          <w:szCs w:val="24"/>
-        </w:rPr>
-        <w:t>read.php</w:t>
-      </w:r>
-      <w:proofErr w:type="spellEnd"/>
-      <w:r>
-        <w:rPr>
-          <w:rFonts w:ascii="Times New Roman" w:hAnsi="Times New Roman" w:cs="Times New Roman"/>
-          <w:sz w:val="24"/>
-          <w:szCs w:val="24"/>
-        </w:rPr>
-        <w:t xml:space="preserve"> fájlt a saját adatbázisunknak megfelelően</w:t>
-      </w:r>
-      <w:r>
-        <w:rPr>
-          <w:rFonts w:ascii="Times New Roman" w:hAnsi="Times New Roman" w:cs="Times New Roman"/>
-          <w:sz w:val="24"/>
-          <w:szCs w:val="24"/>
-        </w:rPr>
-        <w:t xml:space="preserve">, ezt úgy oldottuk meg, hogy a </w:t>
-      </w:r>
-      <w:proofErr w:type="spellStart"/>
-      <w:r>
-        <w:rPr>
-          <w:rFonts w:ascii="Times New Roman" w:hAnsi="Times New Roman" w:cs="Times New Roman"/>
-          <w:sz w:val="24"/>
-          <w:szCs w:val="24"/>
-        </w:rPr>
-        <w:t>read.php</w:t>
-      </w:r>
-      <w:proofErr w:type="spellEnd"/>
-      <w:r>
-        <w:rPr>
-          <w:rFonts w:ascii="Times New Roman" w:hAnsi="Times New Roman" w:cs="Times New Roman"/>
-          <w:sz w:val="24"/>
-          <w:szCs w:val="24"/>
-        </w:rPr>
-        <w:t xml:space="preserve"> fájlhoz az alábbi módosításokat adtuk hozzá, hogy engedélyezzük a hozzáférést:</w:t>
+        <w:t>Ez első ránézésre praktikus megoldásnak tűnt, mert a fejlesztési környezeten belül tudtuk kezelni az adatbázist. A gyakorlatban azonban hamar kiderült, hogy ez a megoldás korlátozott. Különösen hiányzott belőle egy egyszerű exportálási lehetőség, amely megkönnyítette volna az adatok átültetését. Emiatt egy online konverterhez fordultunk, amely a txt formátumban kapott adatokat .sql kiterjesztésű, beimportálható fájlokká alakította. Ez a lépés ugyan segített, de nem volt tökéletes: bizonyos adattípusokat hibásan ismert fel a rendszer. Például az Id mezőt Double típusként próbálta létrehozni, miközben nekünk Integer típusra volt szükségünk automatikus számozással. Ezt ezért manuálisan javítottuk, hogy a rekordok azonosítása egyszerű és ütközésmentes maradjon. Az adatbázist végül kézzel hoztuk létre a VS Code környezetében. A backend kialakításánál a tanórai PHP kód szolgált kiindulási alapként, de azt rögtön láttuk, hogy az adatbázis-kapcsolatot kezelő rész nem használható változtatás nélkül. Más megoldás szükséges ugyanis XAMPP és MySQL esetén, mint SQLite használatakor. Emiatt a db.php fájlt saját környezetünkhöz kellett igazítani. Eleinte több kiolvasási probléma is jelentkezett, ezért rövidebb és egyszerűbb kódokkal próbáltuk meghatározni a hiba forrását. Csak akkor tértünk vissza a tanórai, strukturáltabb megoldáshoz, amikor az alapkapcsolat már stabilan működött. Ekkor alakítottuk át a read.php fájlt a saját adatbázisunknak megfelelően</w:t>
+      </w:r>
+      <w:r>
+        <w:rPr>
+          <w:rFonts w:ascii="Times New Roman" w:hAnsi="Times New Roman" w:cs="Times New Roman"/>
+          <w:sz w:val="24"/>
+          <w:szCs w:val="24"/>
+        </w:rPr>
+        <w:t>, ezt úgy oldottuk meg, hogy a read.php fájlhoz az alábbi módosításokat adtuk hozzá, hogy engedélyezzük a hozzáférést:</w:t>
       </w:r>
     </w:p>
     <w:p>
@@ -8344,87 +6295,13 @@
           <w:szCs w:val="24"/>
         </w:rPr>
       </w:pPr>
-      <w:proofErr w:type="spellStart"/>
-      <w:proofErr w:type="gramStart"/>
-      <w:r>
-        <w:rPr>
-          <w:rFonts w:ascii="Times New Roman" w:hAnsi="Times New Roman" w:cs="Times New Roman"/>
-          <w:sz w:val="24"/>
-          <w:szCs w:val="24"/>
-        </w:rPr>
-        <w:t>header</w:t>
-      </w:r>
-      <w:proofErr w:type="spellEnd"/>
-      <w:r>
-        <w:rPr>
-          <w:rFonts w:ascii="Times New Roman" w:hAnsi="Times New Roman" w:cs="Times New Roman"/>
-          <w:sz w:val="24"/>
-          <w:szCs w:val="24"/>
-        </w:rPr>
-        <w:t>(</w:t>
-      </w:r>
-      <w:proofErr w:type="gramEnd"/>
-      <w:r>
-        <w:rPr>
-          <w:rFonts w:ascii="Times New Roman" w:hAnsi="Times New Roman" w:cs="Times New Roman"/>
-          <w:sz w:val="24"/>
-          <w:szCs w:val="24"/>
-        </w:rPr>
-        <w:t>"</w:t>
-      </w:r>
-      <w:proofErr w:type="spellStart"/>
-      <w:r>
-        <w:rPr>
-          <w:rFonts w:ascii="Times New Roman" w:hAnsi="Times New Roman" w:cs="Times New Roman"/>
-          <w:sz w:val="24"/>
-          <w:szCs w:val="24"/>
-        </w:rPr>
-        <w:t>Content-Type</w:t>
-      </w:r>
-      <w:proofErr w:type="spellEnd"/>
-      <w:r>
-        <w:rPr>
-          <w:rFonts w:ascii="Times New Roman" w:hAnsi="Times New Roman" w:cs="Times New Roman"/>
-          <w:sz w:val="24"/>
-          <w:szCs w:val="24"/>
-        </w:rPr>
-        <w:t xml:space="preserve">: </w:t>
-      </w:r>
-      <w:proofErr w:type="spellStart"/>
-      <w:r>
-        <w:rPr>
-          <w:rFonts w:ascii="Times New Roman" w:hAnsi="Times New Roman" w:cs="Times New Roman"/>
-          <w:sz w:val="24"/>
-          <w:szCs w:val="24"/>
-        </w:rPr>
-        <w:t>application</w:t>
-      </w:r>
-      <w:proofErr w:type="spellEnd"/>
-      <w:r>
-        <w:rPr>
-          <w:rFonts w:ascii="Times New Roman" w:hAnsi="Times New Roman" w:cs="Times New Roman"/>
-          <w:sz w:val="24"/>
-          <w:szCs w:val="24"/>
-        </w:rPr>
-        <w:t>/</w:t>
-      </w:r>
-      <w:proofErr w:type="spellStart"/>
-      <w:r>
-        <w:rPr>
-          <w:rFonts w:ascii="Times New Roman" w:hAnsi="Times New Roman" w:cs="Times New Roman"/>
-          <w:sz w:val="24"/>
-          <w:szCs w:val="24"/>
-        </w:rPr>
-        <w:t>json</w:t>
-      </w:r>
-      <w:proofErr w:type="spellEnd"/>
-      <w:r>
-        <w:rPr>
-          <w:rFonts w:ascii="Times New Roman" w:hAnsi="Times New Roman" w:cs="Times New Roman"/>
-          <w:sz w:val="24"/>
-          <w:szCs w:val="24"/>
-        </w:rPr>
-        <w:t xml:space="preserve">"); </w:t>
+      <w:r>
+        <w:rPr>
+          <w:rFonts w:ascii="Times New Roman" w:hAnsi="Times New Roman" w:cs="Times New Roman"/>
+          <w:sz w:val="24"/>
+          <w:szCs w:val="24"/>
+        </w:rPr>
+        <w:t xml:space="preserve">header("Content-Type: application/json"); </w:t>
       </w:r>
     </w:p>
     <w:p>
@@ -8442,69 +6319,13 @@
           <w:szCs w:val="24"/>
         </w:rPr>
       </w:pPr>
-      <w:proofErr w:type="spellStart"/>
-      <w:proofErr w:type="gramStart"/>
-      <w:r>
-        <w:rPr>
-          <w:rFonts w:ascii="Times New Roman" w:hAnsi="Times New Roman" w:cs="Times New Roman"/>
-          <w:sz w:val="24"/>
-          <w:szCs w:val="24"/>
-        </w:rPr>
-        <w:t>header</w:t>
-      </w:r>
-      <w:proofErr w:type="spellEnd"/>
-      <w:r>
-        <w:rPr>
-          <w:rFonts w:ascii="Times New Roman" w:hAnsi="Times New Roman" w:cs="Times New Roman"/>
-          <w:sz w:val="24"/>
-          <w:szCs w:val="24"/>
-        </w:rPr>
-        <w:t>(</w:t>
-      </w:r>
-      <w:proofErr w:type="gramEnd"/>
-      <w:r>
-        <w:rPr>
-          <w:rFonts w:ascii="Times New Roman" w:hAnsi="Times New Roman" w:cs="Times New Roman"/>
-          <w:sz w:val="24"/>
-          <w:szCs w:val="24"/>
-        </w:rPr>
-        <w:t>"Access-</w:t>
-      </w:r>
-      <w:proofErr w:type="spellStart"/>
-      <w:r>
-        <w:rPr>
-          <w:rFonts w:ascii="Times New Roman" w:hAnsi="Times New Roman" w:cs="Times New Roman"/>
-          <w:sz w:val="24"/>
-          <w:szCs w:val="24"/>
-        </w:rPr>
-        <w:t>Control</w:t>
-      </w:r>
-      <w:proofErr w:type="spellEnd"/>
-      <w:r>
-        <w:rPr>
-          <w:rFonts w:ascii="Times New Roman" w:hAnsi="Times New Roman" w:cs="Times New Roman"/>
-          <w:sz w:val="24"/>
-          <w:szCs w:val="24"/>
-        </w:rPr>
-        <w:t>-</w:t>
-      </w:r>
-      <w:proofErr w:type="spellStart"/>
-      <w:r>
-        <w:rPr>
-          <w:rFonts w:ascii="Times New Roman" w:hAnsi="Times New Roman" w:cs="Times New Roman"/>
-          <w:sz w:val="24"/>
-          <w:szCs w:val="24"/>
-        </w:rPr>
-        <w:t>Allow-Origin</w:t>
-      </w:r>
-      <w:proofErr w:type="spellEnd"/>
-      <w:r>
-        <w:rPr>
-          <w:rFonts w:ascii="Times New Roman" w:hAnsi="Times New Roman" w:cs="Times New Roman"/>
-          <w:sz w:val="24"/>
-          <w:szCs w:val="24"/>
-        </w:rPr>
-        <w:t>: *");</w:t>
+      <w:r>
+        <w:rPr>
+          <w:rFonts w:ascii="Times New Roman" w:hAnsi="Times New Roman" w:cs="Times New Roman"/>
+          <w:sz w:val="24"/>
+          <w:szCs w:val="24"/>
+        </w:rPr>
+        <w:t>header("Access-Control-Allow-Origin: *");</w:t>
       </w:r>
     </w:p>
     <w:p>
@@ -8522,69 +6343,13 @@
           <w:szCs w:val="24"/>
         </w:rPr>
       </w:pPr>
-      <w:proofErr w:type="spellStart"/>
-      <w:proofErr w:type="gramStart"/>
-      <w:r>
-        <w:rPr>
-          <w:rFonts w:ascii="Times New Roman" w:hAnsi="Times New Roman" w:cs="Times New Roman"/>
-          <w:sz w:val="24"/>
-          <w:szCs w:val="24"/>
-        </w:rPr>
-        <w:t>header</w:t>
-      </w:r>
-      <w:proofErr w:type="spellEnd"/>
-      <w:r>
-        <w:rPr>
-          <w:rFonts w:ascii="Times New Roman" w:hAnsi="Times New Roman" w:cs="Times New Roman"/>
-          <w:sz w:val="24"/>
-          <w:szCs w:val="24"/>
-        </w:rPr>
-        <w:t>(</w:t>
-      </w:r>
-      <w:proofErr w:type="gramEnd"/>
-      <w:r>
-        <w:rPr>
-          <w:rFonts w:ascii="Times New Roman" w:hAnsi="Times New Roman" w:cs="Times New Roman"/>
-          <w:sz w:val="24"/>
-          <w:szCs w:val="24"/>
-        </w:rPr>
-        <w:t>"Access-</w:t>
-      </w:r>
-      <w:proofErr w:type="spellStart"/>
-      <w:r>
-        <w:rPr>
-          <w:rFonts w:ascii="Times New Roman" w:hAnsi="Times New Roman" w:cs="Times New Roman"/>
-          <w:sz w:val="24"/>
-          <w:szCs w:val="24"/>
-        </w:rPr>
-        <w:t>Control</w:t>
-      </w:r>
-      <w:proofErr w:type="spellEnd"/>
-      <w:r>
-        <w:rPr>
-          <w:rFonts w:ascii="Times New Roman" w:hAnsi="Times New Roman" w:cs="Times New Roman"/>
-          <w:sz w:val="24"/>
-          <w:szCs w:val="24"/>
-        </w:rPr>
-        <w:t>-</w:t>
-      </w:r>
-      <w:proofErr w:type="spellStart"/>
-      <w:r>
-        <w:rPr>
-          <w:rFonts w:ascii="Times New Roman" w:hAnsi="Times New Roman" w:cs="Times New Roman"/>
-          <w:sz w:val="24"/>
-          <w:szCs w:val="24"/>
-        </w:rPr>
-        <w:t>Allow-Methods</w:t>
-      </w:r>
-      <w:proofErr w:type="spellEnd"/>
-      <w:r>
-        <w:rPr>
-          <w:rFonts w:ascii="Times New Roman" w:hAnsi="Times New Roman" w:cs="Times New Roman"/>
-          <w:sz w:val="24"/>
-          <w:szCs w:val="24"/>
-        </w:rPr>
-        <w:t>: GET, POST, PUT, DELETE, OPTIONS");</w:t>
+      <w:r>
+        <w:rPr>
+          <w:rFonts w:ascii="Times New Roman" w:hAnsi="Times New Roman" w:cs="Times New Roman"/>
+          <w:sz w:val="24"/>
+          <w:szCs w:val="24"/>
+        </w:rPr>
+        <w:t>header("Access-Control-Allow-Methods: GET, POST, PUT, DELETE, OPTIONS");</w:t>
       </w:r>
     </w:p>
     <w:p>
@@ -8602,87 +6367,13 @@
           <w:szCs w:val="24"/>
         </w:rPr>
       </w:pPr>
-      <w:proofErr w:type="spellStart"/>
-      <w:proofErr w:type="gramStart"/>
-      <w:r>
-        <w:rPr>
-          <w:rFonts w:ascii="Times New Roman" w:hAnsi="Times New Roman" w:cs="Times New Roman"/>
-          <w:sz w:val="24"/>
-          <w:szCs w:val="24"/>
-        </w:rPr>
-        <w:t>header</w:t>
-      </w:r>
-      <w:proofErr w:type="spellEnd"/>
-      <w:r>
-        <w:rPr>
-          <w:rFonts w:ascii="Times New Roman" w:hAnsi="Times New Roman" w:cs="Times New Roman"/>
-          <w:sz w:val="24"/>
-          <w:szCs w:val="24"/>
-        </w:rPr>
-        <w:t>(</w:t>
-      </w:r>
-      <w:proofErr w:type="gramEnd"/>
-      <w:r>
-        <w:rPr>
-          <w:rFonts w:ascii="Times New Roman" w:hAnsi="Times New Roman" w:cs="Times New Roman"/>
-          <w:sz w:val="24"/>
-          <w:szCs w:val="24"/>
-        </w:rPr>
-        <w:t>"Access-</w:t>
-      </w:r>
-      <w:proofErr w:type="spellStart"/>
-      <w:r>
-        <w:rPr>
-          <w:rFonts w:ascii="Times New Roman" w:hAnsi="Times New Roman" w:cs="Times New Roman"/>
-          <w:sz w:val="24"/>
-          <w:szCs w:val="24"/>
-        </w:rPr>
-        <w:t>Control</w:t>
-      </w:r>
-      <w:proofErr w:type="spellEnd"/>
-      <w:r>
-        <w:rPr>
-          <w:rFonts w:ascii="Times New Roman" w:hAnsi="Times New Roman" w:cs="Times New Roman"/>
-          <w:sz w:val="24"/>
-          <w:szCs w:val="24"/>
-        </w:rPr>
-        <w:t>-</w:t>
-      </w:r>
-      <w:proofErr w:type="spellStart"/>
-      <w:r>
-        <w:rPr>
-          <w:rFonts w:ascii="Times New Roman" w:hAnsi="Times New Roman" w:cs="Times New Roman"/>
-          <w:sz w:val="24"/>
-          <w:szCs w:val="24"/>
-        </w:rPr>
-        <w:t>Allow-Headers</w:t>
-      </w:r>
-      <w:proofErr w:type="spellEnd"/>
-      <w:r>
-        <w:rPr>
-          <w:rFonts w:ascii="Times New Roman" w:hAnsi="Times New Roman" w:cs="Times New Roman"/>
-          <w:sz w:val="24"/>
-          <w:szCs w:val="24"/>
-        </w:rPr>
-        <w:t xml:space="preserve">: </w:t>
-      </w:r>
-      <w:proofErr w:type="spellStart"/>
-      <w:r>
-        <w:rPr>
-          <w:rFonts w:ascii="Times New Roman" w:hAnsi="Times New Roman" w:cs="Times New Roman"/>
-          <w:sz w:val="24"/>
-          <w:szCs w:val="24"/>
-        </w:rPr>
-        <w:t>Content-Type</w:t>
-      </w:r>
-      <w:proofErr w:type="spellEnd"/>
-      <w:r>
-        <w:rPr>
-          <w:rFonts w:ascii="Times New Roman" w:hAnsi="Times New Roman" w:cs="Times New Roman"/>
-          <w:sz w:val="24"/>
-          <w:szCs w:val="24"/>
-        </w:rPr>
-        <w:t>");</w:t>
+      <w:r>
+        <w:rPr>
+          <w:rFonts w:ascii="Times New Roman" w:hAnsi="Times New Roman" w:cs="Times New Roman"/>
+          <w:sz w:val="24"/>
+          <w:szCs w:val="24"/>
+        </w:rPr>
+        <w:t>header("Access-Control-Allow-Headers: Content-Type");</w:t>
       </w:r>
     </w:p>
     <w:p>
@@ -8702,61 +6393,7 @@
           <w:sz w:val="24"/>
           <w:szCs w:val="24"/>
         </w:rPr>
-        <w:t xml:space="preserve">Hasonló logikával építettük fel a kliensoldali JavaScript részt is a fetchapi_js.js fájlban. A HTML oldalt a már meglévő, közös stílusok felhasználásával formáztuk, így a </w:t>
-      </w:r>
-      <w:proofErr w:type="spellStart"/>
-      <w:r>
-        <w:rPr>
-          <w:rFonts w:ascii="Times New Roman" w:hAnsi="Times New Roman" w:cs="Times New Roman"/>
-          <w:sz w:val="24"/>
-          <w:szCs w:val="24"/>
-        </w:rPr>
-        <w:t>Fetch</w:t>
-      </w:r>
-      <w:proofErr w:type="spellEnd"/>
-      <w:r>
-        <w:rPr>
-          <w:rFonts w:ascii="Times New Roman" w:hAnsi="Times New Roman" w:cs="Times New Roman"/>
-          <w:sz w:val="24"/>
-          <w:szCs w:val="24"/>
-        </w:rPr>
-        <w:t xml:space="preserve"> API menüpont is vizuálisan egységes maradt. Ez a weboldalrész a localhost:8000-es </w:t>
-      </w:r>
-      <w:proofErr w:type="spellStart"/>
-      <w:r>
-        <w:rPr>
-          <w:rFonts w:ascii="Times New Roman" w:hAnsi="Times New Roman" w:cs="Times New Roman"/>
-          <w:sz w:val="24"/>
-          <w:szCs w:val="24"/>
-        </w:rPr>
-        <w:t>porton</w:t>
-      </w:r>
-      <w:proofErr w:type="spellEnd"/>
-      <w:r>
-        <w:rPr>
-          <w:rFonts w:ascii="Times New Roman" w:hAnsi="Times New Roman" w:cs="Times New Roman"/>
-          <w:sz w:val="24"/>
-          <w:szCs w:val="24"/>
-        </w:rPr>
-        <w:t xml:space="preserve"> futott, ami később az </w:t>
-      </w:r>
-      <w:proofErr w:type="spellStart"/>
-      <w:r>
-        <w:rPr>
-          <w:rFonts w:ascii="Times New Roman" w:hAnsi="Times New Roman" w:cs="Times New Roman"/>
-          <w:sz w:val="24"/>
-          <w:szCs w:val="24"/>
-        </w:rPr>
-        <w:t>Axios</w:t>
-      </w:r>
-      <w:proofErr w:type="spellEnd"/>
-      <w:r>
-        <w:rPr>
-          <w:rFonts w:ascii="Times New Roman" w:hAnsi="Times New Roman" w:cs="Times New Roman"/>
-          <w:sz w:val="24"/>
-          <w:szCs w:val="24"/>
-        </w:rPr>
-        <w:t xml:space="preserve"> menünél is fontos szerepet kapott.</w:t>
+        <w:t>Hasonló logikával építettük fel a kliensoldali JavaScript részt is a fetchapi_js.js fájlban. A HTML oldalt a már meglévő, közös stílusok felhasználásával formáztuk, így a Fetch API menüpont is vizuálisan egységes maradt. Ez a weboldalrész a localhost:8000-es porton futott, ami később az Axios menünél is fontos szerepet kapott.</w:t>
       </w:r>
     </w:p>
     <w:p>
@@ -8849,367 +6486,7 @@
           <w:szCs w:val="24"/>
         </w:rPr>
         <w:lastRenderedPageBreak/>
-        <w:t xml:space="preserve">kihívást hozott, mivel itt </w:t>
-      </w:r>
-      <w:proofErr w:type="spellStart"/>
-      <w:r>
-        <w:rPr>
-          <w:rFonts w:ascii="Times New Roman" w:hAnsi="Times New Roman" w:cs="Times New Roman"/>
-          <w:sz w:val="24"/>
-          <w:szCs w:val="24"/>
-        </w:rPr>
-        <w:t>React</w:t>
-      </w:r>
-      <w:proofErr w:type="spellEnd"/>
-      <w:r>
-        <w:rPr>
-          <w:rFonts w:ascii="Times New Roman" w:hAnsi="Times New Roman" w:cs="Times New Roman"/>
-          <w:sz w:val="24"/>
-          <w:szCs w:val="24"/>
-        </w:rPr>
-        <w:t xml:space="preserve"> környezetben kellett </w:t>
-      </w:r>
-      <w:proofErr w:type="spellStart"/>
-      <w:r>
-        <w:rPr>
-          <w:rFonts w:ascii="Times New Roman" w:hAnsi="Times New Roman" w:cs="Times New Roman"/>
-          <w:sz w:val="24"/>
-          <w:szCs w:val="24"/>
-        </w:rPr>
-        <w:t>Axios</w:t>
-      </w:r>
-      <w:proofErr w:type="spellEnd"/>
-      <w:r>
-        <w:rPr>
-          <w:rFonts w:ascii="Times New Roman" w:hAnsi="Times New Roman" w:cs="Times New Roman"/>
-          <w:sz w:val="24"/>
-          <w:szCs w:val="24"/>
-        </w:rPr>
-        <w:t xml:space="preserve"> segítségével megvalósítani a szerveroldali adatkezelést. A fejlesztés első technikai lépése az </w:t>
-      </w:r>
-      <w:proofErr w:type="spellStart"/>
-      <w:r>
-        <w:rPr>
-          <w:rFonts w:ascii="Times New Roman" w:hAnsi="Times New Roman" w:cs="Times New Roman"/>
-          <w:sz w:val="24"/>
-          <w:szCs w:val="24"/>
-        </w:rPr>
-        <w:t>Axios</w:t>
-      </w:r>
-      <w:proofErr w:type="spellEnd"/>
-      <w:r>
-        <w:rPr>
-          <w:rFonts w:ascii="Times New Roman" w:hAnsi="Times New Roman" w:cs="Times New Roman"/>
-          <w:sz w:val="24"/>
-          <w:szCs w:val="24"/>
-        </w:rPr>
-        <w:t xml:space="preserve"> telepítése volt, amelyet a VS </w:t>
-      </w:r>
-      <w:proofErr w:type="spellStart"/>
-      <w:r>
-        <w:rPr>
-          <w:rFonts w:ascii="Times New Roman" w:hAnsi="Times New Roman" w:cs="Times New Roman"/>
-          <w:sz w:val="24"/>
-          <w:szCs w:val="24"/>
-        </w:rPr>
-        <w:t>Code</w:t>
-      </w:r>
-      <w:proofErr w:type="spellEnd"/>
-      <w:r>
-        <w:rPr>
-          <w:rFonts w:ascii="Times New Roman" w:hAnsi="Times New Roman" w:cs="Times New Roman"/>
-          <w:sz w:val="24"/>
-          <w:szCs w:val="24"/>
-        </w:rPr>
-        <w:t xml:space="preserve"> termináljában az </w:t>
-      </w:r>
-      <w:proofErr w:type="spellStart"/>
-      <w:r>
-        <w:rPr>
-          <w:rFonts w:ascii="Times New Roman" w:hAnsi="Times New Roman" w:cs="Times New Roman"/>
-          <w:sz w:val="24"/>
-          <w:szCs w:val="24"/>
-        </w:rPr>
-        <w:t>npm</w:t>
-      </w:r>
-      <w:proofErr w:type="spellEnd"/>
-      <w:r>
-        <w:rPr>
-          <w:rFonts w:ascii="Times New Roman" w:hAnsi="Times New Roman" w:cs="Times New Roman"/>
-          <w:sz w:val="24"/>
-          <w:szCs w:val="24"/>
-        </w:rPr>
-        <w:t xml:space="preserve"> </w:t>
-      </w:r>
-      <w:proofErr w:type="spellStart"/>
-      <w:r>
-        <w:rPr>
-          <w:rFonts w:ascii="Times New Roman" w:hAnsi="Times New Roman" w:cs="Times New Roman"/>
-          <w:sz w:val="24"/>
-          <w:szCs w:val="24"/>
-        </w:rPr>
-        <w:t>install</w:t>
-      </w:r>
-      <w:proofErr w:type="spellEnd"/>
-      <w:r>
-        <w:rPr>
-          <w:rFonts w:ascii="Times New Roman" w:hAnsi="Times New Roman" w:cs="Times New Roman"/>
-          <w:sz w:val="24"/>
-          <w:szCs w:val="24"/>
-        </w:rPr>
-        <w:t xml:space="preserve"> </w:t>
-      </w:r>
-      <w:proofErr w:type="spellStart"/>
-      <w:r>
-        <w:rPr>
-          <w:rFonts w:ascii="Times New Roman" w:hAnsi="Times New Roman" w:cs="Times New Roman"/>
-          <w:sz w:val="24"/>
-          <w:szCs w:val="24"/>
-        </w:rPr>
-        <w:t>axios</w:t>
-      </w:r>
-      <w:proofErr w:type="spellEnd"/>
-      <w:r>
-        <w:rPr>
-          <w:rFonts w:ascii="Times New Roman" w:hAnsi="Times New Roman" w:cs="Times New Roman"/>
-          <w:sz w:val="24"/>
-          <w:szCs w:val="24"/>
-        </w:rPr>
-        <w:t xml:space="preserve"> paranccsal végeztünk el. Az alkalmazás megírásánál ismét a tanórai mintakódot vettük alapul, de ezt jelentősen testre kellett szabni. A legnagyobb kihívást az jelentette, hogy a backend és a frontend külön </w:t>
-      </w:r>
-      <w:proofErr w:type="spellStart"/>
-      <w:r>
-        <w:rPr>
-          <w:rFonts w:ascii="Times New Roman" w:hAnsi="Times New Roman" w:cs="Times New Roman"/>
-          <w:sz w:val="24"/>
-          <w:szCs w:val="24"/>
-        </w:rPr>
-        <w:t>porton</w:t>
-      </w:r>
-      <w:proofErr w:type="spellEnd"/>
-      <w:r>
-        <w:rPr>
-          <w:rFonts w:ascii="Times New Roman" w:hAnsi="Times New Roman" w:cs="Times New Roman"/>
-          <w:sz w:val="24"/>
-          <w:szCs w:val="24"/>
-        </w:rPr>
-        <w:t xml:space="preserve"> futott. A saját fejlesztői gépen a localhost:8000 </w:t>
-      </w:r>
-      <w:proofErr w:type="spellStart"/>
-      <w:r>
-        <w:rPr>
-          <w:rFonts w:ascii="Times New Roman" w:hAnsi="Times New Roman" w:cs="Times New Roman"/>
-          <w:sz w:val="24"/>
-          <w:szCs w:val="24"/>
-        </w:rPr>
-        <w:t>porton</w:t>
-      </w:r>
-      <w:proofErr w:type="spellEnd"/>
-      <w:r>
-        <w:rPr>
-          <w:rFonts w:ascii="Times New Roman" w:hAnsi="Times New Roman" w:cs="Times New Roman"/>
-          <w:sz w:val="24"/>
-          <w:szCs w:val="24"/>
-        </w:rPr>
-        <w:t xml:space="preserve"> működött a PHP-s, adatbázisra épülő rész, míg a </w:t>
-      </w:r>
-      <w:proofErr w:type="spellStart"/>
-      <w:r>
-        <w:rPr>
-          <w:rFonts w:ascii="Times New Roman" w:hAnsi="Times New Roman" w:cs="Times New Roman"/>
-          <w:sz w:val="24"/>
-          <w:szCs w:val="24"/>
-        </w:rPr>
-        <w:t>Reactet</w:t>
-      </w:r>
-      <w:proofErr w:type="spellEnd"/>
-      <w:r>
-        <w:rPr>
-          <w:rFonts w:ascii="Times New Roman" w:hAnsi="Times New Roman" w:cs="Times New Roman"/>
-          <w:sz w:val="24"/>
-          <w:szCs w:val="24"/>
-        </w:rPr>
-        <w:t xml:space="preserve"> futtató </w:t>
-      </w:r>
-      <w:proofErr w:type="spellStart"/>
-      <w:r>
-        <w:rPr>
-          <w:rFonts w:ascii="Times New Roman" w:hAnsi="Times New Roman" w:cs="Times New Roman"/>
-          <w:sz w:val="24"/>
-          <w:szCs w:val="24"/>
-        </w:rPr>
-        <w:t>npm</w:t>
-      </w:r>
-      <w:proofErr w:type="spellEnd"/>
-      <w:r>
-        <w:rPr>
-          <w:rFonts w:ascii="Times New Roman" w:hAnsi="Times New Roman" w:cs="Times New Roman"/>
-          <w:sz w:val="24"/>
-          <w:szCs w:val="24"/>
-        </w:rPr>
-        <w:t xml:space="preserve"> fejlesztői kiszolgáló a localhost:5173 </w:t>
-      </w:r>
-      <w:proofErr w:type="spellStart"/>
-      <w:r>
-        <w:rPr>
-          <w:rFonts w:ascii="Times New Roman" w:hAnsi="Times New Roman" w:cs="Times New Roman"/>
-          <w:sz w:val="24"/>
-          <w:szCs w:val="24"/>
-        </w:rPr>
-        <w:t>portot</w:t>
-      </w:r>
-      <w:proofErr w:type="spellEnd"/>
-      <w:r>
-        <w:rPr>
-          <w:rFonts w:ascii="Times New Roman" w:hAnsi="Times New Roman" w:cs="Times New Roman"/>
-          <w:sz w:val="24"/>
-          <w:szCs w:val="24"/>
-        </w:rPr>
-        <w:t xml:space="preserve"> használta. Kezdetben nem fordítottunk erre elegendő figyelmet, ezért nehezen volt átlátható, miért nem kommunikál megfelelően egymással a két rendszer. Ebből adódóan előfordult, hogy vagy az adatbázis elérése nem működött, vagy a </w:t>
-      </w:r>
-      <w:proofErr w:type="spellStart"/>
-      <w:r>
-        <w:rPr>
-          <w:rFonts w:ascii="Times New Roman" w:hAnsi="Times New Roman" w:cs="Times New Roman"/>
-          <w:sz w:val="24"/>
-          <w:szCs w:val="24"/>
-        </w:rPr>
-        <w:t>React</w:t>
-      </w:r>
-      <w:proofErr w:type="spellEnd"/>
-      <w:r>
-        <w:rPr>
-          <w:rFonts w:ascii="Times New Roman" w:hAnsi="Times New Roman" w:cs="Times New Roman"/>
-          <w:sz w:val="24"/>
-          <w:szCs w:val="24"/>
-        </w:rPr>
-        <w:t xml:space="preserve"> alkalmazás nem reagált a várt módon. A probléma megoldásához a </w:t>
-      </w:r>
-      <w:proofErr w:type="spellStart"/>
-      <w:r>
-        <w:rPr>
-          <w:rFonts w:ascii="Times New Roman" w:hAnsi="Times New Roman" w:cs="Times New Roman"/>
-          <w:sz w:val="24"/>
-          <w:szCs w:val="24"/>
-        </w:rPr>
-        <w:t>read.php</w:t>
-      </w:r>
-      <w:proofErr w:type="spellEnd"/>
-      <w:r>
-        <w:rPr>
-          <w:rFonts w:ascii="Times New Roman" w:hAnsi="Times New Roman" w:cs="Times New Roman"/>
-          <w:sz w:val="24"/>
-          <w:szCs w:val="24"/>
-        </w:rPr>
-        <w:t xml:space="preserve"> fájlba CORS-engedélyező fejlécsorokat illesztettünk be. Ennek részeként beállítottuk a </w:t>
-      </w:r>
-      <w:proofErr w:type="spellStart"/>
-      <w:r>
-        <w:rPr>
-          <w:rFonts w:ascii="Times New Roman" w:hAnsi="Times New Roman" w:cs="Times New Roman"/>
-          <w:sz w:val="24"/>
-          <w:szCs w:val="24"/>
-        </w:rPr>
-        <w:t>Content-Type</w:t>
-      </w:r>
-      <w:proofErr w:type="spellEnd"/>
-      <w:r>
-        <w:rPr>
-          <w:rFonts w:ascii="Times New Roman" w:hAnsi="Times New Roman" w:cs="Times New Roman"/>
-          <w:sz w:val="24"/>
-          <w:szCs w:val="24"/>
-        </w:rPr>
-        <w:t xml:space="preserve"> értéket, engedélyeztük a külső eredetű hozzáférést, valamint megadtuk az engedélyezett metódusokat és fejlécmezőket is. Ezzel a szerver képes lett fogadni a különböző </w:t>
-      </w:r>
-      <w:proofErr w:type="spellStart"/>
-      <w:r>
-        <w:rPr>
-          <w:rFonts w:ascii="Times New Roman" w:hAnsi="Times New Roman" w:cs="Times New Roman"/>
-          <w:sz w:val="24"/>
-          <w:szCs w:val="24"/>
-        </w:rPr>
-        <w:t>portra</w:t>
-      </w:r>
-      <w:proofErr w:type="spellEnd"/>
-      <w:r>
-        <w:rPr>
-          <w:rFonts w:ascii="Times New Roman" w:hAnsi="Times New Roman" w:cs="Times New Roman"/>
-          <w:sz w:val="24"/>
-          <w:szCs w:val="24"/>
-        </w:rPr>
-        <w:t xml:space="preserve"> érkező kéréseket. Emellett az </w:t>
-      </w:r>
-      <w:proofErr w:type="spellStart"/>
-      <w:r>
-        <w:rPr>
-          <w:rFonts w:ascii="Times New Roman" w:hAnsi="Times New Roman" w:cs="Times New Roman"/>
-          <w:sz w:val="24"/>
-          <w:szCs w:val="24"/>
-        </w:rPr>
-        <w:t>axios.jsx</w:t>
-      </w:r>
-      <w:proofErr w:type="spellEnd"/>
-      <w:r>
-        <w:rPr>
-          <w:rFonts w:ascii="Times New Roman" w:hAnsi="Times New Roman" w:cs="Times New Roman"/>
-          <w:sz w:val="24"/>
-          <w:szCs w:val="24"/>
-        </w:rPr>
-        <w:t xml:space="preserve"> fájlban is pontosítani kellett az API elérési útját, vagyis rögzítettük, hogy a </w:t>
-      </w:r>
-      <w:proofErr w:type="spellStart"/>
-      <w:r>
-        <w:rPr>
-          <w:rFonts w:ascii="Times New Roman" w:hAnsi="Times New Roman" w:cs="Times New Roman"/>
-          <w:sz w:val="24"/>
-          <w:szCs w:val="24"/>
-        </w:rPr>
-        <w:t>read.php</w:t>
-      </w:r>
-      <w:proofErr w:type="spellEnd"/>
-      <w:r>
-        <w:rPr>
-          <w:rFonts w:ascii="Times New Roman" w:hAnsi="Times New Roman" w:cs="Times New Roman"/>
-          <w:sz w:val="24"/>
-          <w:szCs w:val="24"/>
-        </w:rPr>
-        <w:t xml:space="preserve"> a localhost:8000 címen érhető el. Miután ez a kapcsolat stabilan működött, a felhasználói élmény javításával is foglalkoztunk. Itt merült fel az az ötlet, hogy a rendszer ne pusztán egy szöveges kiírással jelezze a sikeres műveleteket, hanem a böngésző jelenítsen meg értesítést. Ez azért bizonyult előnyösnek, mert így a visszajelzés nem zavarta meg a felület vizuális szerkezetét. Emellett a </w:t>
-      </w:r>
-      <w:proofErr w:type="spellStart"/>
-      <w:r>
-        <w:rPr>
-          <w:rFonts w:ascii="Times New Roman" w:hAnsi="Times New Roman" w:cs="Times New Roman"/>
-          <w:sz w:val="24"/>
-          <w:szCs w:val="24"/>
-        </w:rPr>
-        <w:t>read.php</w:t>
-      </w:r>
-      <w:proofErr w:type="spellEnd"/>
-      <w:r>
-        <w:rPr>
-          <w:rFonts w:ascii="Times New Roman" w:hAnsi="Times New Roman" w:cs="Times New Roman"/>
-          <w:sz w:val="24"/>
-          <w:szCs w:val="24"/>
-        </w:rPr>
-        <w:t xml:space="preserve"> állapotüzeneteit magyar nyelvűre módosítottuk, vagyis például az angol sikerüzenetek helyett „Sikeres létrehozás!” formájú visszajelzéseket adtunk. Az </w:t>
-      </w:r>
-      <w:proofErr w:type="spellStart"/>
-      <w:r>
-        <w:rPr>
-          <w:rFonts w:ascii="Times New Roman" w:hAnsi="Times New Roman" w:cs="Times New Roman"/>
-          <w:sz w:val="24"/>
-          <w:szCs w:val="24"/>
-        </w:rPr>
-        <w:t>Axios</w:t>
-      </w:r>
-      <w:proofErr w:type="spellEnd"/>
-      <w:r>
-        <w:rPr>
-          <w:rFonts w:ascii="Times New Roman" w:hAnsi="Times New Roman" w:cs="Times New Roman"/>
-          <w:sz w:val="24"/>
-          <w:szCs w:val="24"/>
-        </w:rPr>
-        <w:t xml:space="preserve"> oldal így nemcsak technikailag valósította meg a beadandó előírásait, hanem használhatóság és megjelenés szempontjából is egységesen illeszkedett a teljes alkalmazásba.</w:t>
+        <w:t>kihívást hozott, mivel itt React környezetben kellett Axios segítségével megvalósítani a szerveroldali adatkezelést. A fejlesztés első technikai lépése az Axios telepítése volt, amelyet a VS Code termináljában az npm install axios paranccsal végeztünk el. Az alkalmazás megírásánál ismét a tanórai mintakódot vettük alapul, de ezt jelentősen testre kellett szabni. A legnagyobb kihívást az jelentette, hogy a backend és a frontend külön porton futott. A saját fejlesztői gépen a localhost:8000 porton működött a PHP-s, adatbázisra épülő rész, míg a Reactet futtató npm fejlesztői kiszolgáló a localhost:5173 portot használta. Kezdetben nem fordítottunk erre elegendő figyelmet, ezért nehezen volt átlátható, miért nem kommunikál megfelelően egymással a két rendszer. Ebből adódóan előfordult, hogy vagy az adatbázis elérése nem működött, vagy a React alkalmazás nem reagált a várt módon. A probléma megoldásához a read.php fájlba CORS-engedélyező fejlécsorokat illesztettünk be. Ennek részeként beállítottuk a Content-Type értéket, engedélyeztük a külső eredetű hozzáférést, valamint megadtuk az engedélyezett metódusokat és fejlécmezőket is. Ezzel a szerver képes lett fogadni a különböző portra érkező kéréseket. Emellett az axios.jsx fájlban is pontosítani kellett az API elérési útját, vagyis rögzítettük, hogy a read.php a localhost:8000 címen érhető el. Miután ez a kapcsolat stabilan működött, a felhasználói élmény javításával is foglalkoztunk. Itt merült fel az az ötlet, hogy a rendszer ne pusztán egy szöveges kiírással jelezze a sikeres műveleteket, hanem a böngésző jelenítsen meg értesítést. Ez azért bizonyult előnyösnek, mert így a visszajelzés nem zavarta meg a felület vizuális szerkezetét. Emellett a read.php állapotüzeneteit magyar nyelvűre módosítottuk, vagyis például az angol sikerüzenetek helyett „Sikeres létrehozás!” formájú visszajelzéseket adtunk. Az Axios oldal így nemcsak technikailag valósította meg a beadandó előírásait, hanem használhatóság és megjelenés szempontjából is egységesen illeszkedett a teljes alkalmazásba.</w:t>
       </w:r>
     </w:p>
     <w:p>
@@ -9260,25 +6537,7 @@
           <w:sz w:val="24"/>
           <w:szCs w:val="24"/>
         </w:rPr>
-        <w:t>A projekt következő lépéseként az OOJS (</w:t>
-      </w:r>
-      <w:proofErr w:type="spellStart"/>
-      <w:r>
-        <w:rPr>
-          <w:rFonts w:ascii="Times New Roman" w:hAnsi="Times New Roman" w:cs="Times New Roman"/>
-          <w:sz w:val="24"/>
-          <w:szCs w:val="24"/>
-        </w:rPr>
-        <w:t>Object</w:t>
-      </w:r>
-      <w:proofErr w:type="spellEnd"/>
-      <w:r>
-        <w:rPr>
-          <w:rFonts w:ascii="Times New Roman" w:hAnsi="Times New Roman" w:cs="Times New Roman"/>
-          <w:sz w:val="24"/>
-          <w:szCs w:val="24"/>
-        </w:rPr>
-        <w:t>-Oriented JavaScript) menüpont kialakítása történt meg. Ennél a feladatrésznél a beadandó előírása szerint egy grafikus, objektumorientált szemléletben megvalósított JavaScript alkalmazást kellett készítenünk.</w:t>
+        <w:t>A projekt következő lépéseként az OOJS (Object-Oriented JavaScript) menüpont kialakítása történt meg. Ennél a feladatrésznél a beadandó előírása szerint egy grafikus, objektumorientált szemléletben megvalósított JavaScript alkalmazást kellett készítenünk.</w:t>
       </w:r>
     </w:p>
     <w:p>
@@ -9297,25 +6556,7 @@
           <w:sz w:val="24"/>
           <w:szCs w:val="24"/>
         </w:rPr>
-        <w:t xml:space="preserve">A fejlesztés kezdeti szakaszában először egy webshop jellegű megoldásban gondolkodtunk, amely a cukrászda termékeit jelenítette volna meg. Ez az elképzelés azonban nem bizonyult megfelelőnek, mivel a feladatleírás kifejezetten grafikus, interaktív alkalmazás készítését várta el, nem pedig egy adatlistázó vagy webshop jellegű felületet. Emiatt </w:t>
-      </w:r>
-      <w:proofErr w:type="spellStart"/>
-      <w:r>
-        <w:rPr>
-          <w:rFonts w:ascii="Times New Roman" w:hAnsi="Times New Roman" w:cs="Times New Roman"/>
-          <w:sz w:val="24"/>
-          <w:szCs w:val="24"/>
-        </w:rPr>
-        <w:t>újragondoltuk</w:t>
-      </w:r>
-      <w:proofErr w:type="spellEnd"/>
-      <w:r>
-        <w:rPr>
-          <w:rFonts w:ascii="Times New Roman" w:hAnsi="Times New Roman" w:cs="Times New Roman"/>
-          <w:sz w:val="24"/>
-          <w:szCs w:val="24"/>
-        </w:rPr>
-        <w:t xml:space="preserve"> a koncepciót</w:t>
+        <w:t>A fejlesztés kezdeti szakaszában először egy webshop jellegű megoldásban gondolkodtunk, amely a cukrászda termékeit jelenítette volna meg. Ez az elképzelés azonban nem bizonyult megfelelőnek, mivel a feladatleírás kifejezetten grafikus, interaktív alkalmazás készítését várta el, nem pedig egy adatlistázó vagy webshop jellegű felületet. Emiatt újragondoltuk a koncepciót</w:t>
       </w:r>
       <w:r>
         <w:rPr>
@@ -9532,7 +6773,7 @@
               </wp:anchor>
             </w:drawing>
           </mc:Choice>
-          <mc:Fallback>
+          <mc:Fallback xmlns:w16se="http://schemas.microsoft.com/office/word/2015/wordml/symex" xmlns:w16sdtfl="http://schemas.microsoft.com/office/word/2024/wordml/sdtformatlock" xmlns:w16sdtdh="http://schemas.microsoft.com/office/word/2020/wordml/sdtdatahash" xmlns:w16du="http://schemas.microsoft.com/office/word/2023/wordml/word16du" xmlns:w16="http://schemas.microsoft.com/office/word/2018/wordml" xmlns:w16cid="http://schemas.microsoft.com/office/word/2016/wordml/cid" xmlns:w16cex="http://schemas.microsoft.com/office/word/2018/wordml/cex" xmlns:oel="http://schemas.microsoft.com/office/2019/extlst" xmlns:am3d="http://schemas.microsoft.com/office/drawing/2017/model3d" xmlns:aink="http://schemas.microsoft.com/office/drawing/2016/ink" xmlns:cx8="http://schemas.microsoft.com/office/drawing/2016/5/14/chartex" xmlns:cx7="http://schemas.microsoft.com/office/drawing/2016/5/13/chartex" xmlns:cx6="http://schemas.microsoft.com/office/drawing/2016/5/12/chartex" xmlns:cx5="http://schemas.microsoft.com/office/drawing/2016/5/11/chartex" xmlns:cx4="http://schemas.microsoft.com/office/drawing/2016/5/10/chartex" xmlns:cx3="http://schemas.microsoft.com/office/drawing/2016/5/9/chartex" xmlns:cx2="http://schemas.microsoft.com/office/drawing/2015/10/21/chartex" xmlns:cx1="http://schemas.microsoft.com/office/drawing/2015/9/8/chartex" xmlns:cx="http://schemas.microsoft.com/office/drawing/2014/chartex">
             <w:pict>
               <v:shape w14:anchorId="0ADE5BE0" id="_x0000_s1030" type="#_x0000_t202" style="position:absolute;left:0;text-align:left;margin-left:240.3pt;margin-top:184.25pt;width:213.9pt;height:.05pt;z-index:251666432;visibility:visible;mso-wrap-style:square;mso-wrap-distance-left:9pt;mso-wrap-distance-top:0;mso-wrap-distance-right:9pt;mso-wrap-distance-bottom:0;mso-position-horizontal:absolute;mso-position-horizontal-relative:margin;mso-position-vertical:absolute;mso-position-vertical-relative:text;v-text-anchor:top" o:gfxdata="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" stroked="f">
                 <v:textbox style="mso-fit-shape-to-text:t" inset="0,0,0,0">
@@ -9604,25 +6845,7 @@
           <w:sz w:val="24"/>
           <w:szCs w:val="24"/>
         </w:rPr>
-        <w:t xml:space="preserve">A tervezési szakaszban először egy egyszerű vizuális elképzelést alakítottunk ki. Ennek lényege az volt, hogy a képernyő közepén két darab sütemény jelenjen meg, amelyek enyhe „rezgő” animációval hívják fel magukra a figyelmet. A felhasználó ezekre kattintva indíthatja el az alkalmazás működését, amely során a </w:t>
-      </w:r>
-      <w:proofErr w:type="gramStart"/>
-      <w:r>
-        <w:rPr>
-          <w:rFonts w:ascii="Times New Roman" w:hAnsi="Times New Roman" w:cs="Times New Roman"/>
-          <w:sz w:val="24"/>
-          <w:szCs w:val="24"/>
-        </w:rPr>
-        <w:t>süti</w:t>
-      </w:r>
-      <w:proofErr w:type="gramEnd"/>
-      <w:r>
-        <w:rPr>
-          <w:rFonts w:ascii="Times New Roman" w:hAnsi="Times New Roman" w:cs="Times New Roman"/>
-          <w:sz w:val="24"/>
-          <w:szCs w:val="24"/>
-        </w:rPr>
-        <w:t xml:space="preserve"> „kinyílik”, és megjelenik egy üzenet.</w:t>
+        <w:t>A tervezési szakaszban először egy egyszerű vizuális elképzelést alakítottunk ki. Ennek lényege az volt, hogy a képernyő közepén két darab sütemény jelenjen meg, amelyek enyhe „rezgő” animációval hívják fel magukra a figyelmet. A felhasználó ezekre kattintva indíthatja el az alkalmazás működését, amely során a süti „kinyílik”, és megjelenik egy üzenet.</w:t>
       </w:r>
       <w:r>
         <w:rPr>
@@ -9638,25 +6861,7 @@
           <w:sz w:val="24"/>
           <w:szCs w:val="24"/>
         </w:rPr>
-        <w:t xml:space="preserve">A kezdeti megvalósítás során először egy egyszerű, alap kinézetet készítettünk el. Ebben a szakaszban a hangsúly nem a megjelenésen, hanem a működésen volt. A </w:t>
-      </w:r>
-      <w:proofErr w:type="gramStart"/>
-      <w:r>
-        <w:rPr>
-          <w:rFonts w:ascii="Times New Roman" w:hAnsi="Times New Roman" w:cs="Times New Roman"/>
-          <w:sz w:val="24"/>
-          <w:szCs w:val="24"/>
-        </w:rPr>
-        <w:t>süti</w:t>
-      </w:r>
-      <w:proofErr w:type="gramEnd"/>
-      <w:r>
-        <w:rPr>
-          <w:rFonts w:ascii="Times New Roman" w:hAnsi="Times New Roman" w:cs="Times New Roman"/>
-          <w:sz w:val="24"/>
-          <w:szCs w:val="24"/>
-        </w:rPr>
-        <w:t xml:space="preserve"> objektumorientált módon került kialakításra, és sikerült elérni, hogy kattintásra animáció induljon, majd megjelenjen a jóslat szövege.</w:t>
+        <w:t>A kezdeti megvalósítás során először egy egyszerű, alap kinézetet készítettünk el. Ebben a szakaszban a hangsúly nem a megjelenésen, hanem a működésen volt. A süti objektumorientált módon került kialakításra, és sikerült elérni, hogy kattintásra animáció induljon, majd megjelenjen a jóslat szövege.</w:t>
       </w:r>
     </w:p>
     <w:p>
@@ -9837,7 +7042,7 @@
               </wp:anchor>
             </w:drawing>
           </mc:Choice>
-          <mc:Fallback>
+          <mc:Fallback xmlns:w16se="http://schemas.microsoft.com/office/word/2015/wordml/symex" xmlns:w16sdtfl="http://schemas.microsoft.com/office/word/2024/wordml/sdtformatlock" xmlns:w16sdtdh="http://schemas.microsoft.com/office/word/2020/wordml/sdtdatahash" xmlns:w16du="http://schemas.microsoft.com/office/word/2023/wordml/word16du" xmlns:w16="http://schemas.microsoft.com/office/word/2018/wordml" xmlns:w16cid="http://schemas.microsoft.com/office/word/2016/wordml/cid" xmlns:w16cex="http://schemas.microsoft.com/office/word/2018/wordml/cex" xmlns:oel="http://schemas.microsoft.com/office/2019/extlst" xmlns:am3d="http://schemas.microsoft.com/office/drawing/2017/model3d" xmlns:aink="http://schemas.microsoft.com/office/drawing/2016/ink" xmlns:cx8="http://schemas.microsoft.com/office/drawing/2016/5/14/chartex" xmlns:cx7="http://schemas.microsoft.com/office/drawing/2016/5/13/chartex" xmlns:cx6="http://schemas.microsoft.com/office/drawing/2016/5/12/chartex" xmlns:cx5="http://schemas.microsoft.com/office/drawing/2016/5/11/chartex" xmlns:cx4="http://schemas.microsoft.com/office/drawing/2016/5/10/chartex" xmlns:cx3="http://schemas.microsoft.com/office/drawing/2016/5/9/chartex" xmlns:cx2="http://schemas.microsoft.com/office/drawing/2015/10/21/chartex" xmlns:cx1="http://schemas.microsoft.com/office/drawing/2015/9/8/chartex" xmlns:cx="http://schemas.microsoft.com/office/drawing/2014/chartex">
             <w:pict>
               <v:shape w14:anchorId="7B461D09" id="_x0000_s1031" type="#_x0000_t202" style="position:absolute;left:0;text-align:left;margin-left:190.45pt;margin-top:165.25pt;width:241.65pt;height:.05pt;z-index:251669504;visibility:visible;mso-wrap-style:square;mso-wrap-distance-left:9pt;mso-wrap-distance-top:0;mso-wrap-distance-right:9pt;mso-wrap-distance-bottom:0;mso-position-horizontal:right;mso-position-horizontal-relative:margin;mso-position-vertical:absolute;mso-position-vertical-relative:text;v-text-anchor:top" o:gfxdata="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" stroked="f">
                 <v:textbox style="mso-fit-shape-to-text:t" inset="0,0,0,0">
@@ -9941,25 +7146,7 @@
           <w:sz w:val="24"/>
           <w:szCs w:val="24"/>
         </w:rPr>
-        <w:t xml:space="preserve">, nem illeszkedett a többi oldalhoz, és a teljes oldal egy egyszerű fehér háttérrel jelent meg. Ebben az állapotban az oldal ugyan funkcionálisan működött, de vizuálisan nem illett bele az alkalmazás egységes </w:t>
-      </w:r>
-      <w:proofErr w:type="spellStart"/>
-      <w:r>
-        <w:rPr>
-          <w:rFonts w:ascii="Times New Roman" w:hAnsi="Times New Roman" w:cs="Times New Roman"/>
-          <w:sz w:val="24"/>
-          <w:szCs w:val="24"/>
-        </w:rPr>
-        <w:t>arculatába</w:t>
-      </w:r>
-      <w:proofErr w:type="spellEnd"/>
-      <w:r>
-        <w:rPr>
-          <w:rFonts w:ascii="Times New Roman" w:hAnsi="Times New Roman" w:cs="Times New Roman"/>
-          <w:sz w:val="24"/>
-          <w:szCs w:val="24"/>
-        </w:rPr>
-        <w:t>.</w:t>
+        <w:t>, nem illeszkedett a többi oldalhoz, és a teljes oldal egy egyszerű fehér háttérrel jelent meg. Ebben az állapotban az oldal ugyan funkcionálisan működött, de vizuálisan nem illett bele az alkalmazás egységes arculatába.</w:t>
       </w:r>
       <w:r>
         <w:rPr>
@@ -10027,43 +7214,7 @@
           <w:sz w:val="24"/>
           <w:szCs w:val="24"/>
         </w:rPr>
-        <w:t xml:space="preserve">Az animáció során a </w:t>
-      </w:r>
-      <w:proofErr w:type="gramStart"/>
-      <w:r>
-        <w:rPr>
-          <w:rFonts w:ascii="Times New Roman" w:hAnsi="Times New Roman" w:cs="Times New Roman"/>
-          <w:sz w:val="24"/>
-          <w:szCs w:val="24"/>
-        </w:rPr>
-        <w:t>süti</w:t>
-      </w:r>
-      <w:proofErr w:type="gramEnd"/>
-      <w:r>
-        <w:rPr>
-          <w:rFonts w:ascii="Times New Roman" w:hAnsi="Times New Roman" w:cs="Times New Roman"/>
-          <w:sz w:val="24"/>
-          <w:szCs w:val="24"/>
-        </w:rPr>
-        <w:t xml:space="preserve"> két félből áll, amelyek kattintás hatására szétválnak, majd megjelenik a jóslatot tartalmazó „papír”. Ezt követően egy gomb segítségével új </w:t>
-      </w:r>
-      <w:proofErr w:type="gramStart"/>
-      <w:r>
-        <w:rPr>
-          <w:rFonts w:ascii="Times New Roman" w:hAnsi="Times New Roman" w:cs="Times New Roman"/>
-          <w:sz w:val="24"/>
-          <w:szCs w:val="24"/>
-        </w:rPr>
-        <w:t>süti</w:t>
-      </w:r>
-      <w:proofErr w:type="gramEnd"/>
-      <w:r>
-        <w:rPr>
-          <w:rFonts w:ascii="Times New Roman" w:hAnsi="Times New Roman" w:cs="Times New Roman"/>
-          <w:sz w:val="24"/>
-          <w:szCs w:val="24"/>
-        </w:rPr>
-        <w:t xml:space="preserve"> kérhető, </w:t>
+        <w:t xml:space="preserve">Az animáció során a süti két félből áll, amelyek kattintás hatására szétválnak, majd megjelenik a jóslatot tartalmazó „papír”. Ezt követően egy gomb segítségével új süti kérhető, </w:t>
       </w:r>
       <w:r>
         <w:rPr>
@@ -10263,7 +7414,6 @@
           <w:szCs w:val="24"/>
         </w:rPr>
       </w:pPr>
-      <w:proofErr w:type="spellStart"/>
       <w:r>
         <w:rPr>
           <w:rFonts w:ascii="Times New Roman" w:hAnsi="Times New Roman" w:cs="Times New Roman"/>
@@ -10272,7 +7422,6 @@
         </w:rPr>
         <w:t>class</w:t>
       </w:r>
-      <w:proofErr w:type="spellEnd"/>
     </w:p>
     <w:p>
       <w:pPr>
@@ -10289,7 +7438,6 @@
           <w:szCs w:val="24"/>
         </w:rPr>
       </w:pPr>
-      <w:proofErr w:type="spellStart"/>
       <w:r>
         <w:rPr>
           <w:rFonts w:ascii="Times New Roman" w:hAnsi="Times New Roman" w:cs="Times New Roman"/>
@@ -10298,7 +7446,6 @@
         </w:rPr>
         <w:t>constructor</w:t>
       </w:r>
-      <w:proofErr w:type="spellEnd"/>
     </w:p>
     <w:p>
       <w:pPr>
@@ -10339,34 +7486,14 @@
           <w:szCs w:val="24"/>
         </w:rPr>
       </w:pPr>
-      <w:proofErr w:type="spellStart"/>
-      <w:r>
-        <w:rPr>
-          <w:rFonts w:ascii="Times New Roman" w:hAnsi="Times New Roman" w:cs="Times New Roman"/>
-          <w:sz w:val="24"/>
-          <w:szCs w:val="24"/>
-        </w:rPr>
-        <w:t>extends</w:t>
-      </w:r>
-      <w:proofErr w:type="spellEnd"/>
-      <w:r>
-        <w:rPr>
-          <w:rFonts w:ascii="Times New Roman" w:hAnsi="Times New Roman" w:cs="Times New Roman"/>
-          <w:sz w:val="24"/>
-          <w:szCs w:val="24"/>
-        </w:rPr>
-        <w:t xml:space="preserve"> és </w:t>
-      </w:r>
-      <w:proofErr w:type="spellStart"/>
-      <w:r>
-        <w:rPr>
-          <w:rFonts w:ascii="Times New Roman" w:hAnsi="Times New Roman" w:cs="Times New Roman"/>
-          <w:sz w:val="24"/>
-          <w:szCs w:val="24"/>
-        </w:rPr>
-        <w:t>super</w:t>
-      </w:r>
-      <w:proofErr w:type="spellEnd"/>
+      <w:r>
+        <w:rPr>
+          <w:rFonts w:ascii="Times New Roman" w:hAnsi="Times New Roman" w:cs="Times New Roman"/>
+          <w:sz w:val="24"/>
+          <w:szCs w:val="24"/>
+        </w:rPr>
+        <w:t>extends és super</w:t>
+      </w:r>
     </w:p>
     <w:p>
       <w:pPr>
@@ -10383,26 +7510,201 @@
           <w:szCs w:val="24"/>
         </w:rPr>
       </w:pPr>
-      <w:proofErr w:type="spellStart"/>
-      <w:proofErr w:type="gramStart"/>
-      <w:r>
-        <w:rPr>
-          <w:rFonts w:ascii="Times New Roman" w:hAnsi="Times New Roman" w:cs="Times New Roman"/>
-          <w:sz w:val="24"/>
-          <w:szCs w:val="24"/>
-        </w:rPr>
-        <w:t>document.body</w:t>
-      </w:r>
-      <w:proofErr w:type="gramEnd"/>
-      <w:r>
-        <w:rPr>
-          <w:rFonts w:ascii="Times New Roman" w:hAnsi="Times New Roman" w:cs="Times New Roman"/>
-          <w:sz w:val="24"/>
-          <w:szCs w:val="24"/>
-        </w:rPr>
-        <w:t>.appendChild</w:t>
-      </w:r>
-      <w:proofErr w:type="spellEnd"/>
+      <w:r>
+        <w:rPr>
+          <w:rFonts w:ascii="Times New Roman" w:hAnsi="Times New Roman" w:cs="Times New Roman"/>
+          <w:sz w:val="24"/>
+          <w:szCs w:val="24"/>
+        </w:rPr>
+        <w:t>document.body.appendChild</w:t>
+      </w:r>
+    </w:p>
+    <w:p>
+      <w:pPr>
+        <w:pStyle w:val="Listaszerbekezds"/>
+        <w:numPr>
+          <w:ilvl w:val="0"/>
+          <w:numId w:val="1"/>
+        </w:numPr>
+        <w:spacing w:line="360" w:lineRule="auto"/>
+        <w:jc w:val="both"/>
+        <w:rPr>
+          <w:rFonts w:ascii="Times New Roman" w:hAnsi="Times New Roman" w:cs="Times New Roman"/>
+          <w:b/>
+          <w:sz w:val="28"/>
+          <w:szCs w:val="24"/>
+        </w:rPr>
+      </w:pPr>
+      <w:r>
+        <w:rPr>
+          <w:rFonts w:ascii="Times New Roman" w:hAnsi="Times New Roman" w:cs="Times New Roman"/>
+          <w:b/>
+          <w:sz w:val="28"/>
+          <w:szCs w:val="24"/>
+        </w:rPr>
+        <w:t>A Nettarhely.hu-ra való feltöltés</w:t>
+      </w:r>
+    </w:p>
+    <w:p>
+      <w:pPr>
+        <w:jc w:val="both"/>
+        <w:rPr>
+          <w:rFonts w:ascii="Times New Roman" w:hAnsi="Times New Roman" w:cs="Times New Roman"/>
+          <w:sz w:val="24"/>
+        </w:rPr>
+      </w:pPr>
+      <w:r>
+        <w:rPr>
+          <w:rFonts w:ascii="Times New Roman" w:hAnsi="Times New Roman" w:cs="Times New Roman"/>
+          <w:sz w:val="24"/>
+        </w:rPr>
+        <w:t>A segéddokumentumokban leírt módon létrehoztuk a nettarhely.hu oldalon az ingyenes tárhelyet.</w:t>
+      </w:r>
+      <w:r>
+        <w:rPr>
+          <w:rFonts w:ascii="Times New Roman" w:hAnsi="Times New Roman" w:cs="Times New Roman"/>
+          <w:sz w:val="24"/>
+        </w:rPr>
+        <w:t xml:space="preserve"> A tárhelyet FTP kapcsolaton keresztül értük el, melyhez Total Commandert használtunk.</w:t>
+      </w:r>
+      <w:r>
+        <w:rPr>
+          <w:rFonts w:ascii="Times New Roman" w:hAnsi="Times New Roman" w:cs="Times New Roman"/>
+          <w:sz w:val="24"/>
+        </w:rPr>
+        <w:t xml:space="preserve"> Létrehoztuk az </w:t>
+      </w:r>
+      <w:r>
+        <w:rPr>
+          <w:rFonts w:ascii="Times New Roman" w:hAnsi="Times New Roman" w:cs="Times New Roman"/>
+          <w:sz w:val="24"/>
+        </w:rPr>
+        <w:t>„</w:t>
+      </w:r>
+      <w:r>
+        <w:rPr>
+          <w:rFonts w:ascii="Times New Roman" w:hAnsi="Times New Roman" w:cs="Times New Roman"/>
+          <w:sz w:val="24"/>
+        </w:rPr>
+        <w:t>eviesdavid</w:t>
+      </w:r>
+      <w:r>
+        <w:rPr>
+          <w:rFonts w:ascii="Times New Roman" w:hAnsi="Times New Roman" w:cs="Times New Roman"/>
+          <w:sz w:val="24"/>
+        </w:rPr>
+        <w:t>”</w:t>
+      </w:r>
+      <w:r>
+        <w:rPr>
+          <w:rFonts w:ascii="Times New Roman" w:hAnsi="Times New Roman" w:cs="Times New Roman"/>
+          <w:sz w:val="24"/>
+        </w:rPr>
+        <w:t xml:space="preserve"> elnevezésű MySQL adatbázist és </w:t>
+      </w:r>
+      <w:r>
+        <w:rPr>
+          <w:rFonts w:ascii="Times New Roman" w:hAnsi="Times New Roman" w:cs="Times New Roman"/>
+          <w:sz w:val="24"/>
+        </w:rPr>
+        <w:t xml:space="preserve">importáltuk benne az adatokat. A feltöltés során a db.php fájlt módosítanunk kellett, hogy megtalálja az adott adatbázits. Ez </w:t>
+      </w:r>
+      <w:r>
+        <w:rPr>
+          <w:rFonts w:ascii="Times New Roman" w:hAnsi="Times New Roman" w:cs="Times New Roman"/>
+          <w:sz w:val="24"/>
+        </w:rPr>
+        <w:t>-</w:t>
+      </w:r>
+      <w:r>
+        <w:rPr>
+          <w:rFonts w:ascii="Times New Roman" w:hAnsi="Times New Roman" w:cs="Times New Roman"/>
+          <w:sz w:val="24"/>
+        </w:rPr>
+        <w:t>számunkra is meglepő módon</w:t>
+      </w:r>
+      <w:r>
+        <w:rPr>
+          <w:rFonts w:ascii="Times New Roman" w:hAnsi="Times New Roman" w:cs="Times New Roman"/>
+          <w:sz w:val="24"/>
+        </w:rPr>
+        <w:t>-</w:t>
+      </w:r>
+      <w:r>
+        <w:rPr>
+          <w:rFonts w:ascii="Times New Roman" w:hAnsi="Times New Roman" w:cs="Times New Roman"/>
+          <w:sz w:val="24"/>
+        </w:rPr>
+        <w:t xml:space="preserve"> elsőre működött. De a feltöltés után nem működtek a React alapú oldalak, mire rájöttünk, hogy a „build” részt elfelejtettük. Ehhez frissíteni kellett </w:t>
+      </w:r>
+      <w:r>
+        <w:rPr>
+          <w:rFonts w:ascii="Times New Roman" w:hAnsi="Times New Roman" w:cs="Times New Roman"/>
+          <w:sz w:val="24"/>
+        </w:rPr>
+        <w:t>a vite.config.js fájlt, hogy a React alapú html-eket elérje. Ezután parancssorosan lefuttattuk az -npm run build- parancsot, és a dist mappában létrehozott állományokat felmásoltuk a tárhelyre, és így már probléma nélkül működött az oldal React-os része is. A PHP verziónak a 8.2-t állítottuk be, mivel talán ez egy biztonságosabb verzió a régiekhez képest, és a kódunk kompatibilis ezzel a verzióval.</w:t>
+      </w:r>
+    </w:p>
+    <w:p>
+      <w:pPr>
+        <w:jc w:val="both"/>
+        <w:rPr>
+          <w:rFonts w:ascii="Times New Roman" w:hAnsi="Times New Roman" w:cs="Times New Roman"/>
+          <w:sz w:val="24"/>
+        </w:rPr>
+      </w:pPr>
+      <w:r>
+        <w:rPr>
+          <w:rFonts w:ascii="Times New Roman" w:hAnsi="Times New Roman" w:cs="Times New Roman"/>
+          <w:sz w:val="24"/>
+        </w:rPr>
+        <w:t xml:space="preserve">Az elérés: </w:t>
+      </w:r>
+    </w:p>
+    <w:p>
+      <w:pPr>
+        <w:jc w:val="both"/>
+        <w:rPr>
+          <w:rFonts w:ascii="Times New Roman" w:hAnsi="Times New Roman" w:cs="Times New Roman"/>
+          <w:sz w:val="24"/>
+        </w:rPr>
+      </w:pPr>
+      <w:r>
+        <w:rPr>
+          <w:rFonts w:ascii="Times New Roman" w:hAnsi="Times New Roman" w:cs="Times New Roman"/>
+          <w:sz w:val="24"/>
+        </w:rPr>
+        <w:lastRenderedPageBreak/>
+        <w:t xml:space="preserve">Email: </w:t>
+      </w:r>
+      <w:hyperlink r:id="rId22" w:history="1">
+        <w:r>
+          <w:rPr>
+            <w:rStyle w:val="Hiperhivatkozs"/>
+            <w:rFonts w:ascii="Times New Roman" w:hAnsi="Times New Roman" w:cs="Times New Roman"/>
+            <w:sz w:val="24"/>
+          </w:rPr>
+          <w:t>info.alfadelta@gmail.com</w:t>
+        </w:r>
+      </w:hyperlink>
+    </w:p>
+    <w:p>
+      <w:pPr>
+        <w:jc w:val="both"/>
+        <w:rPr>
+          <w:rFonts w:ascii="Times New Roman" w:hAnsi="Times New Roman" w:cs="Times New Roman"/>
+          <w:sz w:val="24"/>
+        </w:rPr>
+      </w:pPr>
+      <w:r>
+        <w:rPr>
+          <w:rFonts w:ascii="Times New Roman" w:hAnsi="Times New Roman" w:cs="Times New Roman"/>
+          <w:sz w:val="24"/>
+        </w:rPr>
+        <w:t>Jelszó: eviesdavidwebprog18</w:t>
+      </w:r>
+      <w:bookmarkStart w:id="15" w:name="_GoBack"/>
+      <w:bookmarkEnd w:id="15"/>
     </w:p>
     <w:p>
       <w:pPr>
@@ -10420,7 +7722,7 @@
           <w:szCs w:val="28"/>
         </w:rPr>
       </w:pPr>
-      <w:bookmarkStart w:id="15" w:name="_Toc226794862"/>
+      <w:bookmarkStart w:id="16" w:name="_Toc226794862"/>
       <w:r>
         <w:rPr>
           <w:rFonts w:ascii="Times New Roman" w:hAnsi="Times New Roman" w:cs="Times New Roman"/>
@@ -10432,7 +7734,7 @@
         </w:rPr>
         <w:t>Rövid használati útmutató a honlaphoz</w:t>
       </w:r>
-      <w:bookmarkEnd w:id="15"/>
+      <w:bookmarkEnd w:id="16"/>
     </w:p>
     <w:p>
       <w:pPr>
@@ -10503,61 +7805,7 @@
           <w:sz w:val="24"/>
           <w:szCs w:val="24"/>
         </w:rPr>
-        <w:t xml:space="preserve">A </w:t>
-      </w:r>
-      <w:proofErr w:type="spellStart"/>
-      <w:r>
-        <w:rPr>
-          <w:rFonts w:ascii="Times New Roman" w:hAnsi="Times New Roman" w:cs="Times New Roman"/>
-          <w:sz w:val="24"/>
-          <w:szCs w:val="24"/>
-        </w:rPr>
-        <w:t>React</w:t>
-      </w:r>
-      <w:proofErr w:type="spellEnd"/>
-      <w:r>
-        <w:rPr>
-          <w:rFonts w:ascii="Times New Roman" w:hAnsi="Times New Roman" w:cs="Times New Roman"/>
-          <w:sz w:val="24"/>
-          <w:szCs w:val="24"/>
-        </w:rPr>
-        <w:t xml:space="preserve"> menüpont hasonló funkciót kínál, mint a </w:t>
-      </w:r>
-      <w:proofErr w:type="spellStart"/>
-      <w:r>
-        <w:rPr>
-          <w:rFonts w:ascii="Times New Roman" w:hAnsi="Times New Roman" w:cs="Times New Roman"/>
-          <w:sz w:val="24"/>
-          <w:szCs w:val="24"/>
-        </w:rPr>
-        <w:t>Javascript</w:t>
-      </w:r>
-      <w:proofErr w:type="spellEnd"/>
-      <w:r>
-        <w:rPr>
-          <w:rFonts w:ascii="Times New Roman" w:hAnsi="Times New Roman" w:cs="Times New Roman"/>
-          <w:sz w:val="24"/>
-          <w:szCs w:val="24"/>
-        </w:rPr>
-        <w:t xml:space="preserve"> CRUD alkalmazása, azonban itt a műveletek már </w:t>
-      </w:r>
-      <w:proofErr w:type="spellStart"/>
-      <w:r>
-        <w:rPr>
-          <w:rFonts w:ascii="Times New Roman" w:hAnsi="Times New Roman" w:cs="Times New Roman"/>
-          <w:sz w:val="24"/>
-          <w:szCs w:val="24"/>
-        </w:rPr>
-        <w:t>React</w:t>
-      </w:r>
-      <w:proofErr w:type="spellEnd"/>
-      <w:r>
-        <w:rPr>
-          <w:rFonts w:ascii="Times New Roman" w:hAnsi="Times New Roman" w:cs="Times New Roman"/>
-          <w:sz w:val="24"/>
-          <w:szCs w:val="24"/>
-        </w:rPr>
-        <w:t xml:space="preserve"> alapú megoldásban valósulnak meg. </w:t>
+        <w:t xml:space="preserve">A React menüpont hasonló funkciót kínál, mint a Javascript CRUD alkalmazása, azonban itt a műveletek már React alapú megoldásban valósulnak meg. </w:t>
       </w:r>
     </w:p>
     <w:p>
@@ -10577,26 +7825,7 @@
           <w:sz w:val="24"/>
           <w:szCs w:val="24"/>
         </w:rPr>
-        <w:lastRenderedPageBreak/>
-        <w:t xml:space="preserve">Tovább lépve az SPA menüpont két, gombok segítségével váltható </w:t>
-      </w:r>
-      <w:proofErr w:type="spellStart"/>
-      <w:r>
-        <w:rPr>
-          <w:rFonts w:ascii="Times New Roman" w:hAnsi="Times New Roman" w:cs="Times New Roman"/>
-          <w:sz w:val="24"/>
-          <w:szCs w:val="24"/>
-        </w:rPr>
-        <w:t>React</w:t>
-      </w:r>
-      <w:proofErr w:type="spellEnd"/>
-      <w:r>
-        <w:rPr>
-          <w:rFonts w:ascii="Times New Roman" w:hAnsi="Times New Roman" w:cs="Times New Roman"/>
-          <w:sz w:val="24"/>
-          <w:szCs w:val="24"/>
-        </w:rPr>
-        <w:t xml:space="preserve"> alkalmazást tartalmaz</w:t>
+        <w:t>Tovább lépve az SPA menüpont két, gombok segítségével váltható React alkalmazást tartalmaz</w:t>
       </w:r>
       <w:r>
         <w:rPr>
@@ -10648,43 +7877,7 @@
           <w:sz w:val="24"/>
           <w:szCs w:val="24"/>
         </w:rPr>
-        <w:t xml:space="preserve">A </w:t>
-      </w:r>
-      <w:proofErr w:type="spellStart"/>
-      <w:r>
-        <w:rPr>
-          <w:rFonts w:ascii="Times New Roman" w:hAnsi="Times New Roman" w:cs="Times New Roman"/>
-          <w:sz w:val="24"/>
-          <w:szCs w:val="24"/>
-        </w:rPr>
-        <w:t>Fetch</w:t>
-      </w:r>
-      <w:proofErr w:type="spellEnd"/>
-      <w:r>
-        <w:rPr>
-          <w:rFonts w:ascii="Times New Roman" w:hAnsi="Times New Roman" w:cs="Times New Roman"/>
-          <w:sz w:val="24"/>
-          <w:szCs w:val="24"/>
-        </w:rPr>
-        <w:t xml:space="preserve"> API és az </w:t>
-      </w:r>
-      <w:proofErr w:type="spellStart"/>
-      <w:r>
-        <w:rPr>
-          <w:rFonts w:ascii="Times New Roman" w:hAnsi="Times New Roman" w:cs="Times New Roman"/>
-          <w:sz w:val="24"/>
-          <w:szCs w:val="24"/>
-        </w:rPr>
-        <w:t>Axios</w:t>
-      </w:r>
-      <w:proofErr w:type="spellEnd"/>
-      <w:r>
-        <w:rPr>
-          <w:rFonts w:ascii="Times New Roman" w:hAnsi="Times New Roman" w:cs="Times New Roman"/>
-          <w:sz w:val="24"/>
-          <w:szCs w:val="24"/>
-        </w:rPr>
-        <w:t xml:space="preserve"> oldalak már szerveroldali adattárolással működnek, ezért ezek a menüpontok a háttérben adatbázissal is kommunikálnak. </w:t>
+        <w:t xml:space="preserve">A Fetch API és az Axios oldalak már szerveroldali adattárolással működnek, ezért ezek a menüpontok a háttérben adatbázissal is kommunikálnak. </w:t>
       </w:r>
     </w:p>
     <w:p>
@@ -10774,67 +7967,7 @@
           <w:sz w:val="24"/>
           <w:szCs w:val="24"/>
         </w:rPr>
-        <w:t xml:space="preserve">A projekt megvalósítása során a feladatokat végig közösen, szoros együttműködésben végeztük el. Bár a GitHub </w:t>
-      </w:r>
-      <w:proofErr w:type="spellStart"/>
-      <w:r>
-        <w:rPr>
-          <w:rFonts w:ascii="Times New Roman" w:hAnsi="Times New Roman" w:cs="Times New Roman"/>
-          <w:color w:val="000000" w:themeColor="text1"/>
-          <w:sz w:val="24"/>
-          <w:szCs w:val="24"/>
-        </w:rPr>
-        <w:t>repository</w:t>
-      </w:r>
-      <w:proofErr w:type="spellEnd"/>
-      <w:r>
-        <w:rPr>
-          <w:rFonts w:ascii="Times New Roman" w:hAnsi="Times New Roman" w:cs="Times New Roman"/>
-          <w:color w:val="000000" w:themeColor="text1"/>
-          <w:sz w:val="24"/>
-          <w:szCs w:val="24"/>
-        </w:rPr>
-        <w:t xml:space="preserve">-ban a </w:t>
-      </w:r>
-      <w:proofErr w:type="spellStart"/>
-      <w:r>
-        <w:rPr>
-          <w:rFonts w:ascii="Times New Roman" w:hAnsi="Times New Roman" w:cs="Times New Roman"/>
-          <w:color w:val="000000" w:themeColor="text1"/>
-          <w:sz w:val="24"/>
-          <w:szCs w:val="24"/>
-        </w:rPr>
-        <w:t>commitok</w:t>
-      </w:r>
-      <w:proofErr w:type="spellEnd"/>
-      <w:r>
-        <w:rPr>
-          <w:rFonts w:ascii="Times New Roman" w:hAnsi="Times New Roman" w:cs="Times New Roman"/>
-          <w:color w:val="000000" w:themeColor="text1"/>
-          <w:sz w:val="24"/>
-          <w:szCs w:val="24"/>
-        </w:rPr>
-        <w:t xml:space="preserve"> alapján időnként úgy tűnhet, hogy az egyik fél aktívabb volt, a valóságban a fejlesztési folyamat minden lépését együtt beszéltük át. Folyamatos online kapcsolatban álltunk egymással, így a legtöbb esetben a </w:t>
-      </w:r>
-      <w:proofErr w:type="spellStart"/>
-      <w:r>
-        <w:rPr>
-          <w:rFonts w:ascii="Times New Roman" w:hAnsi="Times New Roman" w:cs="Times New Roman"/>
-          <w:color w:val="000000" w:themeColor="text1"/>
-          <w:sz w:val="24"/>
-          <w:szCs w:val="24"/>
-        </w:rPr>
-        <w:t>commitolás</w:t>
-      </w:r>
-      <w:proofErr w:type="spellEnd"/>
-      <w:r>
-        <w:rPr>
-          <w:rFonts w:ascii="Times New Roman" w:hAnsi="Times New Roman" w:cs="Times New Roman"/>
-          <w:color w:val="000000" w:themeColor="text1"/>
-          <w:sz w:val="24"/>
-          <w:szCs w:val="24"/>
-        </w:rPr>
-        <w:t xml:space="preserve"> előtt már mindketten átnéztük és egyeztettük a módosításokat.</w:t>
+        <w:t>A projekt megvalósítása során a feladatokat végig közösen, szoros együttműködésben végeztük el. Bár a GitHub repository-ban a commitok alapján időnként úgy tűnhet, hogy az egyik fél aktívabb volt, a valóságban a fejlesztési folyamat minden lépését együtt beszéltük át. Folyamatos online kapcsolatban álltunk egymással, így a legtöbb esetben a commitolás előtt már mindketten átnéztük és egyeztettük a módosításokat.</w:t>
       </w:r>
     </w:p>
     <w:p>
@@ -10852,7 +7985,9 @@
       <w:r>
         <w:rPr>
           <w:noProof/>
-        </w:rPr>
+          <w:lang w:eastAsia="hu-HU"/>
+        </w:rPr>
+        <w:lastRenderedPageBreak/>
         <mc:AlternateContent>
           <mc:Choice Requires="wps">
             <w:drawing>
@@ -10940,23 +8075,7 @@
                                 <w:rFonts w:ascii="Times New Roman" w:hAnsi="Times New Roman" w:cs="Times New Roman"/>
                                 <w:color w:val="000000" w:themeColor="text1"/>
                               </w:rPr>
-                              <w:t xml:space="preserve">. ábra </w:t>
-                            </w:r>
-                            <w:proofErr w:type="spellStart"/>
-                            <w:r>
-                              <w:rPr>
-                                <w:rFonts w:ascii="Times New Roman" w:hAnsi="Times New Roman" w:cs="Times New Roman"/>
-                                <w:color w:val="000000" w:themeColor="text1"/>
-                              </w:rPr>
-                              <w:t>Commit</w:t>
-                            </w:r>
-                            <w:proofErr w:type="spellEnd"/>
-                            <w:r>
-                              <w:rPr>
-                                <w:rFonts w:ascii="Times New Roman" w:hAnsi="Times New Roman" w:cs="Times New Roman"/>
-                                <w:color w:val="000000" w:themeColor="text1"/>
-                              </w:rPr>
-                              <w:t xml:space="preserve"> lista egy része</w:t>
+                              <w:t>. ábra Commit lista egy része</w:t>
                             </w:r>
                           </w:p>
                         </w:txbxContent>
@@ -10973,7 +8092,7 @@
               </wp:anchor>
             </w:drawing>
           </mc:Choice>
-          <mc:Fallback>
+          <mc:Fallback xmlns:w16se="http://schemas.microsoft.com/office/word/2015/wordml/symex" xmlns:w16sdtfl="http://schemas.microsoft.com/office/word/2024/wordml/sdtformatlock" xmlns:w16sdtdh="http://schemas.microsoft.com/office/word/2020/wordml/sdtdatahash" xmlns:w16du="http://schemas.microsoft.com/office/word/2023/wordml/word16du" xmlns:w16="http://schemas.microsoft.com/office/word/2018/wordml" xmlns:w16cid="http://schemas.microsoft.com/office/word/2016/wordml/cid" xmlns:w16cex="http://schemas.microsoft.com/office/word/2018/wordml/cex" xmlns:oel="http://schemas.microsoft.com/office/2019/extlst" xmlns:am3d="http://schemas.microsoft.com/office/drawing/2017/model3d" xmlns:aink="http://schemas.microsoft.com/office/drawing/2016/ink" xmlns:cx8="http://schemas.microsoft.com/office/drawing/2016/5/14/chartex" xmlns:cx7="http://schemas.microsoft.com/office/drawing/2016/5/13/chartex" xmlns:cx6="http://schemas.microsoft.com/office/drawing/2016/5/12/chartex" xmlns:cx5="http://schemas.microsoft.com/office/drawing/2016/5/11/chartex" xmlns:cx4="http://schemas.microsoft.com/office/drawing/2016/5/10/chartex" xmlns:cx3="http://schemas.microsoft.com/office/drawing/2016/5/9/chartex" xmlns:cx2="http://schemas.microsoft.com/office/drawing/2015/10/21/chartex" xmlns:cx1="http://schemas.microsoft.com/office/drawing/2015/9/8/chartex" xmlns:cx="http://schemas.microsoft.com/office/drawing/2014/chartex">
             <w:pict>
               <v:shape w14:anchorId="4C51B646" id="_x0000_s1032" type="#_x0000_t202" style="position:absolute;left:0;text-align:left;margin-left:197.1pt;margin-top:201.5pt;width:254.9pt;height:.05pt;z-index:251678720;visibility:visible;mso-wrap-style:square;mso-wrap-distance-left:9pt;mso-wrap-distance-top:0;mso-wrap-distance-right:9pt;mso-wrap-distance-bottom:0;mso-position-horizontal:absolute;mso-position-horizontal-relative:text;mso-position-vertical:absolute;mso-position-vertical-relative:text;v-text-anchor:top" o:gfxdata="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" stroked="f">
                 <v:textbox style="mso-fit-shape-to-text:t" inset="0,0,0,0">
@@ -11058,9 +8177,11 @@
       <w:r>
         <w:rPr>
           <w:rFonts w:ascii="Times New Roman" w:hAnsi="Times New Roman" w:cs="Times New Roman"/>
+          <w:noProof/>
           <w:color w:val="000000" w:themeColor="text1"/>
           <w:sz w:val="24"/>
           <w:szCs w:val="24"/>
+          <w:lang w:eastAsia="hu-HU"/>
         </w:rPr>
         <w:drawing>
           <wp:anchor distT="0" distB="0" distL="114300" distR="114300" simplePos="0" relativeHeight="251676672" behindDoc="0" locked="0" layoutInCell="1" allowOverlap="1" wp14:anchorId="473AEB64" wp14:editId="0B885397">
@@ -11086,7 +8207,7 @@
                     <pic:cNvPicPr/>
                   </pic:nvPicPr>
                   <pic:blipFill>
-                    <a:blip r:embed="rId22" cstate="print">
+                    <a:blip r:embed="rId23" cstate="print">
                       <a:extLst>
                         <a:ext uri="{28A0092B-C50C-407E-A947-70E740481C1C}">
                           <a14:useLocalDpi xmlns:a14="http://schemas.microsoft.com/office/drawing/2010/main" val="0"/>
@@ -11124,9 +8245,11 @@
           <w:sz w:val="24"/>
           <w:szCs w:val="24"/>
         </w:rPr>
-        <w:t xml:space="preserve">Az összes HTML oldal (index, </w:t>
-      </w:r>
-      <w:proofErr w:type="spellStart"/>
+        <w:t>Az összes HTML oldal (index, javascript, react, spa, fetchapi, axios, oojs) kialakítása közös munkával történt, a különbség inkább abban jelent meg, hogy éppen ki végezte el a commitolást a GitHub Desktop alkalmazáson keresztül. Több alkalommal személyesen, az iskola helyszínén is együtt dolgoztunk, ilyenkor jellemzően az egyik csoporttag számítógépén folyt a munka. Ez magyarázza, hogy egyes napokon az egyik félhez köthető több commit jelenik meg a verziókövetésben.</w:t>
+      </w:r>
+      <w:r>
+        <w:t xml:space="preserve"> </w:t>
+      </w:r>
       <w:r>
         <w:rPr>
           <w:rFonts w:ascii="Times New Roman" w:hAnsi="Times New Roman" w:cs="Times New Roman"/>
@@ -11134,9 +8257,8 @@
           <w:sz w:val="24"/>
           <w:szCs w:val="24"/>
         </w:rPr>
-        <w:t>javascript</w:t>
-      </w:r>
-      <w:proofErr w:type="spellEnd"/>
+        <w:t xml:space="preserve">A GitHub repository-ban jól látható a projekt folyamatos fejlesztése. </w:t>
+      </w:r>
       <w:r>
         <w:rPr>
           <w:rFonts w:ascii="Times New Roman" w:hAnsi="Times New Roman" w:cs="Times New Roman"/>
@@ -11144,9 +8266,9 @@
           <w:sz w:val="24"/>
           <w:szCs w:val="24"/>
         </w:rPr>
-        <w:t xml:space="preserve">, </w:t>
-      </w:r>
-      <w:proofErr w:type="spellStart"/>
+        <w:br/>
+        <w:t xml:space="preserve">A commitok száma és időbeli eloszlása igazolja, hogy a feladat több lépésben készült el. </w:t>
+      </w:r>
       <w:r>
         <w:rPr>
           <w:rFonts w:ascii="Times New Roman" w:hAnsi="Times New Roman" w:cs="Times New Roman"/>
@@ -11154,9 +8276,9 @@
           <w:sz w:val="24"/>
           <w:szCs w:val="24"/>
         </w:rPr>
-        <w:t>react</w:t>
-      </w:r>
-      <w:proofErr w:type="spellEnd"/>
+        <w:br/>
+        <w:t xml:space="preserve">A contributors </w:t>
+      </w:r>
       <w:r>
         <w:rPr>
           <w:rFonts w:ascii="Times New Roman" w:hAnsi="Times New Roman" w:cs="Times New Roman"/>
@@ -11164,9 +8286,8 @@
           <w:sz w:val="24"/>
           <w:szCs w:val="24"/>
         </w:rPr>
-        <w:t xml:space="preserve">, </w:t>
-      </w:r>
-      <w:proofErr w:type="spellStart"/>
+        <w:t>(</w:t>
+      </w:r>
       <w:r>
         <w:rPr>
           <w:rFonts w:ascii="Times New Roman" w:hAnsi="Times New Roman" w:cs="Times New Roman"/>
@@ -11174,9 +8295,8 @@
           <w:sz w:val="24"/>
           <w:szCs w:val="24"/>
         </w:rPr>
-        <w:t>spa</w:t>
-      </w:r>
-      <w:proofErr w:type="spellEnd"/>
+        <w:t>harmatinepasztoreva</w:t>
+      </w:r>
       <w:r>
         <w:rPr>
           <w:rFonts w:ascii="Times New Roman" w:hAnsi="Times New Roman" w:cs="Times New Roman"/>
@@ -11184,9 +8304,8 @@
           <w:sz w:val="24"/>
           <w:szCs w:val="24"/>
         </w:rPr>
-        <w:t xml:space="preserve">, </w:t>
-      </w:r>
-      <w:proofErr w:type="spellStart"/>
+        <w:t xml:space="preserve"> – Harmatiné Pásztor Éva (JBDAQO), </w:t>
+      </w:r>
       <w:r>
         <w:rPr>
           <w:rFonts w:ascii="Times New Roman" w:hAnsi="Times New Roman" w:cs="Times New Roman"/>
@@ -11194,9 +8313,8 @@
           <w:sz w:val="24"/>
           <w:szCs w:val="24"/>
         </w:rPr>
-        <w:t>fetchapi</w:t>
-      </w:r>
-      <w:proofErr w:type="spellEnd"/>
+        <w:t>ttdd33</w:t>
+      </w:r>
       <w:r>
         <w:rPr>
           <w:rFonts w:ascii="Times New Roman" w:hAnsi="Times New Roman" w:cs="Times New Roman"/>
@@ -11204,256 +8322,7 @@
           <w:sz w:val="24"/>
           <w:szCs w:val="24"/>
         </w:rPr>
-        <w:t xml:space="preserve">, </w:t>
-      </w:r>
-      <w:proofErr w:type="spellStart"/>
-      <w:r>
-        <w:rPr>
-          <w:rFonts w:ascii="Times New Roman" w:hAnsi="Times New Roman" w:cs="Times New Roman"/>
-          <w:color w:val="000000" w:themeColor="text1"/>
-          <w:sz w:val="24"/>
-          <w:szCs w:val="24"/>
-        </w:rPr>
-        <w:t>axios</w:t>
-      </w:r>
-      <w:proofErr w:type="spellEnd"/>
-      <w:r>
-        <w:rPr>
-          <w:rFonts w:ascii="Times New Roman" w:hAnsi="Times New Roman" w:cs="Times New Roman"/>
-          <w:color w:val="000000" w:themeColor="text1"/>
-          <w:sz w:val="24"/>
-          <w:szCs w:val="24"/>
-        </w:rPr>
-        <w:t xml:space="preserve">, </w:t>
-      </w:r>
-      <w:proofErr w:type="spellStart"/>
-      <w:r>
-        <w:rPr>
-          <w:rFonts w:ascii="Times New Roman" w:hAnsi="Times New Roman" w:cs="Times New Roman"/>
-          <w:color w:val="000000" w:themeColor="text1"/>
-          <w:sz w:val="24"/>
-          <w:szCs w:val="24"/>
-        </w:rPr>
-        <w:t>oojs</w:t>
-      </w:r>
-      <w:proofErr w:type="spellEnd"/>
-      <w:r>
-        <w:rPr>
-          <w:rFonts w:ascii="Times New Roman" w:hAnsi="Times New Roman" w:cs="Times New Roman"/>
-          <w:color w:val="000000" w:themeColor="text1"/>
-          <w:sz w:val="24"/>
-          <w:szCs w:val="24"/>
-        </w:rPr>
-        <w:t xml:space="preserve">) kialakítása közös munkával történt, a különbség inkább abban jelent meg, hogy éppen ki végezte el a </w:t>
-      </w:r>
-      <w:proofErr w:type="spellStart"/>
-      <w:r>
-        <w:rPr>
-          <w:rFonts w:ascii="Times New Roman" w:hAnsi="Times New Roman" w:cs="Times New Roman"/>
-          <w:color w:val="000000" w:themeColor="text1"/>
-          <w:sz w:val="24"/>
-          <w:szCs w:val="24"/>
-        </w:rPr>
-        <w:t>commitolást</w:t>
-      </w:r>
-      <w:proofErr w:type="spellEnd"/>
-      <w:r>
-        <w:rPr>
-          <w:rFonts w:ascii="Times New Roman" w:hAnsi="Times New Roman" w:cs="Times New Roman"/>
-          <w:color w:val="000000" w:themeColor="text1"/>
-          <w:sz w:val="24"/>
-          <w:szCs w:val="24"/>
-        </w:rPr>
-        <w:t xml:space="preserve"> a GitHub </w:t>
-      </w:r>
-      <w:proofErr w:type="spellStart"/>
-      <w:r>
-        <w:rPr>
-          <w:rFonts w:ascii="Times New Roman" w:hAnsi="Times New Roman" w:cs="Times New Roman"/>
-          <w:color w:val="000000" w:themeColor="text1"/>
-          <w:sz w:val="24"/>
-          <w:szCs w:val="24"/>
-        </w:rPr>
-        <w:t>Desktop</w:t>
-      </w:r>
-      <w:proofErr w:type="spellEnd"/>
-      <w:r>
-        <w:rPr>
-          <w:rFonts w:ascii="Times New Roman" w:hAnsi="Times New Roman" w:cs="Times New Roman"/>
-          <w:color w:val="000000" w:themeColor="text1"/>
-          <w:sz w:val="24"/>
-          <w:szCs w:val="24"/>
-        </w:rPr>
-        <w:t xml:space="preserve"> alkalmazáson keresztül. Több alkalommal személyesen, az iskola helyszínén is együtt dolgoztunk, ilyenkor jellemzően az egyik csoporttag számítógépén folyt a munka. Ez magyarázza, hogy egyes napokon az egyik félhez köthető több </w:t>
-      </w:r>
-      <w:proofErr w:type="spellStart"/>
-      <w:r>
-        <w:rPr>
-          <w:rFonts w:ascii="Times New Roman" w:hAnsi="Times New Roman" w:cs="Times New Roman"/>
-          <w:color w:val="000000" w:themeColor="text1"/>
-          <w:sz w:val="24"/>
-          <w:szCs w:val="24"/>
-        </w:rPr>
-        <w:t>commit</w:t>
-      </w:r>
-      <w:proofErr w:type="spellEnd"/>
-      <w:r>
-        <w:rPr>
-          <w:rFonts w:ascii="Times New Roman" w:hAnsi="Times New Roman" w:cs="Times New Roman"/>
-          <w:color w:val="000000" w:themeColor="text1"/>
-          <w:sz w:val="24"/>
-          <w:szCs w:val="24"/>
-        </w:rPr>
-        <w:t xml:space="preserve"> jelenik meg a verziókövetésben.</w:t>
-      </w:r>
-      <w:r>
-        <w:t xml:space="preserve"> </w:t>
-      </w:r>
-      <w:r>
-        <w:rPr>
-          <w:rFonts w:ascii="Times New Roman" w:hAnsi="Times New Roman" w:cs="Times New Roman"/>
-          <w:color w:val="000000" w:themeColor="text1"/>
-          <w:sz w:val="24"/>
-          <w:szCs w:val="24"/>
-        </w:rPr>
-        <w:t xml:space="preserve">A GitHub </w:t>
-      </w:r>
-      <w:proofErr w:type="spellStart"/>
-      <w:r>
-        <w:rPr>
-          <w:rFonts w:ascii="Times New Roman" w:hAnsi="Times New Roman" w:cs="Times New Roman"/>
-          <w:color w:val="000000" w:themeColor="text1"/>
-          <w:sz w:val="24"/>
-          <w:szCs w:val="24"/>
-        </w:rPr>
-        <w:t>repository</w:t>
-      </w:r>
-      <w:proofErr w:type="spellEnd"/>
-      <w:r>
-        <w:rPr>
-          <w:rFonts w:ascii="Times New Roman" w:hAnsi="Times New Roman" w:cs="Times New Roman"/>
-          <w:color w:val="000000" w:themeColor="text1"/>
-          <w:sz w:val="24"/>
-          <w:szCs w:val="24"/>
-        </w:rPr>
-        <w:t xml:space="preserve">-ban jól látható a projekt folyamatos fejlesztése. </w:t>
-      </w:r>
-      <w:r>
-        <w:rPr>
-          <w:rFonts w:ascii="Times New Roman" w:hAnsi="Times New Roman" w:cs="Times New Roman"/>
-          <w:color w:val="000000" w:themeColor="text1"/>
-          <w:sz w:val="24"/>
-          <w:szCs w:val="24"/>
-        </w:rPr>
-        <w:br/>
-        <w:t xml:space="preserve">A </w:t>
-      </w:r>
-      <w:proofErr w:type="spellStart"/>
-      <w:r>
-        <w:rPr>
-          <w:rFonts w:ascii="Times New Roman" w:hAnsi="Times New Roman" w:cs="Times New Roman"/>
-          <w:color w:val="000000" w:themeColor="text1"/>
-          <w:sz w:val="24"/>
-          <w:szCs w:val="24"/>
-        </w:rPr>
-        <w:t>commitok</w:t>
-      </w:r>
-      <w:proofErr w:type="spellEnd"/>
-      <w:r>
-        <w:rPr>
-          <w:rFonts w:ascii="Times New Roman" w:hAnsi="Times New Roman" w:cs="Times New Roman"/>
-          <w:color w:val="000000" w:themeColor="text1"/>
-          <w:sz w:val="24"/>
-          <w:szCs w:val="24"/>
-        </w:rPr>
-        <w:t xml:space="preserve"> száma és időbeli eloszlása igazolja, hogy a feladat több lépésben készült el. </w:t>
-      </w:r>
-      <w:r>
-        <w:rPr>
-          <w:rFonts w:ascii="Times New Roman" w:hAnsi="Times New Roman" w:cs="Times New Roman"/>
-          <w:color w:val="000000" w:themeColor="text1"/>
-          <w:sz w:val="24"/>
-          <w:szCs w:val="24"/>
-        </w:rPr>
-        <w:br/>
-        <w:t xml:space="preserve">A </w:t>
-      </w:r>
-      <w:proofErr w:type="spellStart"/>
-      <w:r>
-        <w:rPr>
-          <w:rFonts w:ascii="Times New Roman" w:hAnsi="Times New Roman" w:cs="Times New Roman"/>
-          <w:color w:val="000000" w:themeColor="text1"/>
-          <w:sz w:val="24"/>
-          <w:szCs w:val="24"/>
-        </w:rPr>
-        <w:t>contributors</w:t>
-      </w:r>
-      <w:proofErr w:type="spellEnd"/>
-      <w:r>
-        <w:rPr>
-          <w:rFonts w:ascii="Times New Roman" w:hAnsi="Times New Roman" w:cs="Times New Roman"/>
-          <w:color w:val="000000" w:themeColor="text1"/>
-          <w:sz w:val="24"/>
-          <w:szCs w:val="24"/>
-        </w:rPr>
-        <w:t xml:space="preserve"> </w:t>
-      </w:r>
-      <w:r>
-        <w:rPr>
-          <w:rFonts w:ascii="Times New Roman" w:hAnsi="Times New Roman" w:cs="Times New Roman"/>
-          <w:color w:val="000000" w:themeColor="text1"/>
-          <w:sz w:val="24"/>
-          <w:szCs w:val="24"/>
-        </w:rPr>
-        <w:t>(</w:t>
-      </w:r>
-      <w:proofErr w:type="spellStart"/>
-      <w:r>
-        <w:rPr>
-          <w:rFonts w:ascii="Times New Roman" w:hAnsi="Times New Roman" w:cs="Times New Roman"/>
-          <w:color w:val="000000" w:themeColor="text1"/>
-          <w:sz w:val="24"/>
-          <w:szCs w:val="24"/>
-        </w:rPr>
-        <w:t>harmatinepasztoreva</w:t>
-      </w:r>
-      <w:proofErr w:type="spellEnd"/>
-      <w:r>
-        <w:rPr>
-          <w:rFonts w:ascii="Times New Roman" w:hAnsi="Times New Roman" w:cs="Times New Roman"/>
-          <w:color w:val="000000" w:themeColor="text1"/>
-          <w:sz w:val="24"/>
-          <w:szCs w:val="24"/>
-        </w:rPr>
-        <w:t xml:space="preserve"> – Harmatiné Pásztor Éva (JBDAQO), </w:t>
-      </w:r>
-      <w:r>
-        <w:rPr>
-          <w:rFonts w:ascii="Times New Roman" w:hAnsi="Times New Roman" w:cs="Times New Roman"/>
-          <w:color w:val="000000" w:themeColor="text1"/>
-          <w:sz w:val="24"/>
-          <w:szCs w:val="24"/>
-        </w:rPr>
-        <w:t>ttdd33</w:t>
-      </w:r>
-      <w:r>
-        <w:rPr>
-          <w:rFonts w:ascii="Times New Roman" w:hAnsi="Times New Roman" w:cs="Times New Roman"/>
-          <w:color w:val="000000" w:themeColor="text1"/>
-          <w:sz w:val="24"/>
-          <w:szCs w:val="24"/>
-        </w:rPr>
-        <w:t xml:space="preserve"> – Deák </w:t>
-      </w:r>
-      <w:r>
-        <w:rPr>
-          <w:rFonts w:ascii="Times New Roman" w:hAnsi="Times New Roman" w:cs="Times New Roman"/>
-          <w:color w:val="000000" w:themeColor="text1"/>
-          <w:sz w:val="24"/>
-          <w:szCs w:val="24"/>
-        </w:rPr>
-        <w:lastRenderedPageBreak/>
-        <w:t>Dávid (</w:t>
+        <w:t xml:space="preserve"> – Deák Dávid (</w:t>
       </w:r>
       <w:r>
         <w:rPr>
@@ -11502,27 +8371,7 @@
           <w:sz w:val="24"/>
           <w:szCs w:val="24"/>
         </w:rPr>
-        <w:t xml:space="preserve">A projekt során a GitHub </w:t>
-      </w:r>
-      <w:proofErr w:type="spellStart"/>
-      <w:r>
-        <w:rPr>
-          <w:rFonts w:ascii="Times New Roman" w:hAnsi="Times New Roman" w:cs="Times New Roman"/>
-          <w:color w:val="000000" w:themeColor="text1"/>
-          <w:sz w:val="24"/>
-          <w:szCs w:val="24"/>
-        </w:rPr>
-        <w:t>Desktop</w:t>
-      </w:r>
-      <w:proofErr w:type="spellEnd"/>
-      <w:r>
-        <w:rPr>
-          <w:rFonts w:ascii="Times New Roman" w:hAnsi="Times New Roman" w:cs="Times New Roman"/>
-          <w:color w:val="000000" w:themeColor="text1"/>
-          <w:sz w:val="24"/>
-          <w:szCs w:val="24"/>
-        </w:rPr>
-        <w:t xml:space="preserve"> használata mindkettőnk számára új tapasztalat volt, és pozitív meglepetésként ért minket, hogy mennyire hatékonyan támogatja a közös munkavégzést. Ennek köszönhetően nemcsak a beadandó feladatot tudtuk strukturáltan és átlátható módon megvalósítani, hanem jelentős tapasztalatot is szereztünk a verziókövetés és a csapatmunka gyakorlati alkalmazásában. Összességében a projekt egyik legnagyobb pozitív élménye éppen az volt, hogy megtanultuk, hogyan lehet egy közös fejlesztést hatékonyan megszervezni és lebonyolítani GitHub környezetben.</w:t>
+        <w:t>A projekt során a GitHub Desktop használata mindkettőnk számára új tapasztalat volt, és pozitív meglepetésként ért minket, hogy mennyire hatékonyan támogatja a közös munkavégzést. Ennek köszönhetően nemcsak a beadandó feladatot tudtuk strukturáltan és átlátható módon megvalósítani, hanem jelentős tapasztalatot is szereztünk a verziókövetés és a csapatmunka gyakorlati alkalmazásában. Összességében a projekt egyik legnagyobb pozitív élménye éppen az volt, hogy megtanultuk, hogyan lehet egy közös fejlesztést hatékonyan megszervezni és lebonyolítani GitHub környezetben.</w:t>
       </w:r>
     </w:p>
     <w:p>
@@ -11541,7 +8390,7 @@
           <w:szCs w:val="28"/>
         </w:rPr>
       </w:pPr>
-      <w:bookmarkStart w:id="16" w:name="_Toc226794863"/>
+      <w:bookmarkStart w:id="17" w:name="_Toc226794863"/>
       <w:r>
         <w:rPr>
           <w:rFonts w:ascii="Times New Roman" w:hAnsi="Times New Roman" w:cs="Times New Roman"/>
@@ -11553,7 +8402,7 @@
         </w:rPr>
         <w:t>Források</w:t>
       </w:r>
-      <w:bookmarkEnd w:id="16"/>
+      <w:bookmarkEnd w:id="17"/>
     </w:p>
     <w:p>
       <w:pPr>
@@ -11703,27 +8552,9 @@
           <w:sz w:val="24"/>
           <w:szCs w:val="24"/>
         </w:rPr>
-        <w:t xml:space="preserve">GitHub </w:t>
-      </w:r>
-      <w:proofErr w:type="spellStart"/>
-      <w:r>
-        <w:rPr>
-          <w:rFonts w:ascii="Times New Roman" w:hAnsi="Times New Roman" w:cs="Times New Roman"/>
-          <w:sz w:val="24"/>
-          <w:szCs w:val="24"/>
-        </w:rPr>
-        <w:t>repository</w:t>
-      </w:r>
-      <w:proofErr w:type="spellEnd"/>
-      <w:r>
-        <w:rPr>
-          <w:rFonts w:ascii="Times New Roman" w:hAnsi="Times New Roman" w:cs="Times New Roman"/>
-          <w:sz w:val="24"/>
-          <w:szCs w:val="24"/>
-        </w:rPr>
-        <w:t xml:space="preserve">: </w:t>
-      </w:r>
-      <w:hyperlink r:id="rId23" w:history="1">
+        <w:t xml:space="preserve">GitHub repository: </w:t>
+      </w:r>
+      <w:hyperlink r:id="rId24" w:history="1">
         <w:r>
           <w:rPr>
             <w:rStyle w:val="Hiperhivatkozs"/>
@@ -11750,25 +8581,16 @@
           <w:szCs w:val="24"/>
         </w:rPr>
       </w:pPr>
-      <w:proofErr w:type="spellStart"/>
-      <w:r>
-        <w:rPr>
-          <w:rFonts w:ascii="Times New Roman" w:hAnsi="Times New Roman" w:cs="Times New Roman"/>
-          <w:sz w:val="24"/>
-          <w:szCs w:val="24"/>
-        </w:rPr>
-        <w:t>React</w:t>
-      </w:r>
-      <w:proofErr w:type="spellEnd"/>
-      <w:r>
-        <w:rPr>
-          <w:rFonts w:ascii="Times New Roman" w:hAnsi="Times New Roman" w:cs="Times New Roman"/>
-          <w:sz w:val="24"/>
-          <w:szCs w:val="24"/>
-        </w:rPr>
-        <w:t xml:space="preserve"> mintaprojektek gyűjteménye: </w:t>
-      </w:r>
-      <w:hyperlink r:id="rId24" w:history="1">
+      <w:r>
+        <w:rPr>
+          <w:rFonts w:ascii="Times New Roman" w:hAnsi="Times New Roman" w:cs="Times New Roman"/>
+          <w:sz w:val="24"/>
+          <w:szCs w:val="24"/>
+        </w:rPr>
+        <w:lastRenderedPageBreak/>
+        <w:t xml:space="preserve">React mintaprojektek gyűjteménye: </w:t>
+      </w:r>
+      <w:hyperlink r:id="rId25" w:history="1">
         <w:r>
           <w:rPr>
             <w:rStyle w:val="Hiperhivatkozs"/>
@@ -11795,25 +8617,15 @@
           <w:szCs w:val="24"/>
         </w:rPr>
       </w:pPr>
-      <w:proofErr w:type="spellStart"/>
-      <w:r>
-        <w:rPr>
-          <w:rFonts w:ascii="Times New Roman" w:hAnsi="Times New Roman" w:cs="Times New Roman"/>
-          <w:sz w:val="24"/>
-          <w:szCs w:val="24"/>
-        </w:rPr>
-        <w:t>Canva</w:t>
-      </w:r>
-      <w:proofErr w:type="spellEnd"/>
-      <w:r>
-        <w:rPr>
-          <w:rFonts w:ascii="Times New Roman" w:hAnsi="Times New Roman" w:cs="Times New Roman"/>
-          <w:sz w:val="24"/>
-          <w:szCs w:val="24"/>
-        </w:rPr>
-        <w:t xml:space="preserve"> a logó elkészítéséhez - </w:t>
-      </w:r>
-      <w:hyperlink r:id="rId25" w:history="1">
+      <w:r>
+        <w:rPr>
+          <w:rFonts w:ascii="Times New Roman" w:hAnsi="Times New Roman" w:cs="Times New Roman"/>
+          <w:sz w:val="24"/>
+          <w:szCs w:val="24"/>
+        </w:rPr>
+        <w:t xml:space="preserve">Canva a logó elkészítéséhez - </w:t>
+      </w:r>
+      <w:hyperlink r:id="rId26" w:history="1">
         <w:r>
           <w:rPr>
             <w:rStyle w:val="Hiperhivatkozs"/>
@@ -11840,25 +8652,15 @@
           <w:szCs w:val="24"/>
         </w:rPr>
       </w:pPr>
-      <w:proofErr w:type="spellStart"/>
-      <w:r>
-        <w:rPr>
-          <w:rFonts w:ascii="Times New Roman" w:hAnsi="Times New Roman" w:cs="Times New Roman"/>
-          <w:sz w:val="24"/>
-          <w:szCs w:val="24"/>
-        </w:rPr>
-        <w:t>Coolors</w:t>
-      </w:r>
-      <w:proofErr w:type="spellEnd"/>
-      <w:r>
-        <w:rPr>
-          <w:rFonts w:ascii="Times New Roman" w:hAnsi="Times New Roman" w:cs="Times New Roman"/>
-          <w:sz w:val="24"/>
-          <w:szCs w:val="24"/>
-        </w:rPr>
-        <w:t xml:space="preserve"> a színpaletta kiválasztásához - </w:t>
-      </w:r>
-      <w:hyperlink r:id="rId26" w:history="1">
+      <w:r>
+        <w:rPr>
+          <w:rFonts w:ascii="Times New Roman" w:hAnsi="Times New Roman" w:cs="Times New Roman"/>
+          <w:sz w:val="24"/>
+          <w:szCs w:val="24"/>
+        </w:rPr>
+        <w:t xml:space="preserve">Coolors a színpaletta kiválasztásához - </w:t>
+      </w:r>
+      <w:hyperlink r:id="rId27" w:history="1">
         <w:r>
           <w:rPr>
             <w:rStyle w:val="Hiperhivatkozs"/>
@@ -11885,59 +8687,13 @@
           <w:szCs w:val="24"/>
         </w:rPr>
       </w:pPr>
-      <w:proofErr w:type="spellStart"/>
-      <w:r>
-        <w:rPr>
-          <w:rFonts w:ascii="Times New Roman" w:hAnsi="Times New Roman" w:cs="Times New Roman"/>
-          <w:sz w:val="24"/>
-          <w:szCs w:val="24"/>
-        </w:rPr>
-        <w:t>Aspose</w:t>
-      </w:r>
-      <w:proofErr w:type="spellEnd"/>
-      <w:r>
-        <w:rPr>
-          <w:rFonts w:ascii="Times New Roman" w:hAnsi="Times New Roman" w:cs="Times New Roman"/>
-          <w:sz w:val="24"/>
-          <w:szCs w:val="24"/>
-        </w:rPr>
-        <w:t xml:space="preserve"> online </w:t>
-      </w:r>
-      <w:proofErr w:type="spellStart"/>
-      <w:r>
-        <w:rPr>
-          <w:rFonts w:ascii="Times New Roman" w:hAnsi="Times New Roman" w:cs="Times New Roman"/>
-          <w:sz w:val="24"/>
-          <w:szCs w:val="24"/>
-        </w:rPr>
-        <w:t>txt</w:t>
-      </w:r>
-      <w:proofErr w:type="spellEnd"/>
-      <w:r>
-        <w:rPr>
-          <w:rFonts w:ascii="Times New Roman" w:hAnsi="Times New Roman" w:cs="Times New Roman"/>
-          <w:sz w:val="24"/>
-          <w:szCs w:val="24"/>
-        </w:rPr>
-        <w:t>–</w:t>
-      </w:r>
-      <w:proofErr w:type="spellStart"/>
-      <w:r>
-        <w:rPr>
-          <w:rFonts w:ascii="Times New Roman" w:hAnsi="Times New Roman" w:cs="Times New Roman"/>
-          <w:sz w:val="24"/>
-          <w:szCs w:val="24"/>
-        </w:rPr>
-        <w:t>sql</w:t>
-      </w:r>
-      <w:proofErr w:type="spellEnd"/>
-      <w:r>
-        <w:rPr>
-          <w:rFonts w:ascii="Times New Roman" w:hAnsi="Times New Roman" w:cs="Times New Roman"/>
-          <w:sz w:val="24"/>
-          <w:szCs w:val="24"/>
-        </w:rPr>
-        <w:t xml:space="preserve"> konverter az adatbázis konvertálásához</w:t>
+      <w:r>
+        <w:rPr>
+          <w:rFonts w:ascii="Times New Roman" w:hAnsi="Times New Roman" w:cs="Times New Roman"/>
+          <w:sz w:val="24"/>
+          <w:szCs w:val="24"/>
+        </w:rPr>
+        <w:t>Aspose online txt–sql konverter az adatbázis konvertálásához</w:t>
       </w:r>
       <w:r>
         <w:rPr>
@@ -11955,7 +8711,7 @@
         </w:rPr>
         <w:t xml:space="preserve"> </w:t>
       </w:r>
-      <w:hyperlink r:id="rId27" w:history="1">
+      <w:hyperlink r:id="rId28" w:history="1">
         <w:r>
           <w:rPr>
             <w:rStyle w:val="Hiperhivatkozs"/>
@@ -11991,7 +8747,7 @@
 </file>
 
 <file path=word/endnotes.xml><?xml version="1.0" encoding="utf-8"?>
-<w:endnotes xmlns:wpc="http://schemas.microsoft.com/office/word/2010/wordprocessingCanvas" xmlns:cx="http://schemas.microsoft.com/office/drawing/2014/chartex" xmlns:cx1="http://schemas.microsoft.com/office/drawing/2015/9/8/chartex" xmlns:cx2="http://schemas.microsoft.com/office/drawing/2015/10/21/chartex" xmlns:cx3="http://schemas.microsoft.com/office/drawing/2016/5/9/chartex" xmlns:cx4="http://schemas.microsoft.com/office/drawing/2016/5/10/chartex" xmlns:cx5="http://schemas.microsoft.com/office/drawing/2016/5/11/chartex" xmlns:cx6="http://schemas.microsoft.com/office/drawing/2016/5/12/chartex" xmlns:cx7="http://schemas.microsoft.com/office/drawing/2016/5/13/chartex" xmlns:cx8="http://schemas.microsoft.com/office/drawing/2016/5/14/chartex" xmlns:mc="http://schemas.openxmlformats.org/markup-compatibility/2006" xmlns:aink="http://schemas.microsoft.com/office/drawing/2016/ink" xmlns:am3d="http://schemas.microsoft.com/office/drawing/2017/model3d" xmlns:o="urn:schemas-microsoft-com:office:office" xmlns:oel="http://schemas.microsoft.com/office/2019/extlst" xmlns:r="http://schemas.openxmlformats.org/officeDocument/2006/relationships" xmlns:m="http://schemas.openxmlformats.org/officeDocument/2006/math" xmlns:v="urn:schemas-microsoft-com:vml" xmlns:wp14="http://schemas.microsoft.com/office/word/2010/wordprocessingDrawing" xmlns:wp="http://schemas.openxmlformats.org/drawingml/2006/wordprocessingDrawing" xmlns:w10="urn:schemas-microsoft-com:office:word" xmlns:w="http://schemas.openxmlformats.org/wordprocessingml/2006/main" xmlns:w14="http://schemas.microsoft.com/office/word/2010/wordml" xmlns:w15="http://schemas.microsoft.com/office/word/2012/wordml" xmlns:w16cex="http://schemas.microsoft.com/office/word/2018/wordml/cex" xmlns:w16cid="http://schemas.microsoft.com/office/word/2016/wordml/cid" xmlns:w16="http://schemas.microsoft.com/office/word/2018/wordml" xmlns:w16du="http://schemas.microsoft.com/office/word/2023/wordml/word16du" xmlns:w16sdtdh="http://schemas.microsoft.com/office/word/2020/wordml/sdtdatahash" xmlns:w16sdtfl="http://schemas.microsoft.com/office/word/2024/wordml/sdtformatlock" xmlns:w16se="http://schemas.microsoft.com/office/word/2015/wordml/symex" xmlns:wpg="http://schemas.microsoft.com/office/word/2010/wordprocessingGroup" xmlns:wpi="http://schemas.microsoft.com/office/word/2010/wordprocessingInk" xmlns:wne="http://schemas.microsoft.com/office/word/2006/wordml" xmlns:wps="http://schemas.microsoft.com/office/word/2010/wordprocessingShape" mc:Ignorable="w14 w15 w16se w16cid w16 w16cex w16sdtdh w16sdtfl w16du wp14">
+<w:endnotes xmlns:wpc="http://schemas.microsoft.com/office/word/2010/wordprocessingCanvas" xmlns:mc="http://schemas.openxmlformats.org/markup-compatibility/2006" xmlns:o="urn:schemas-microsoft-com:office:office" xmlns:r="http://schemas.openxmlformats.org/officeDocument/2006/relationships" xmlns:m="http://schemas.openxmlformats.org/officeDocument/2006/math" xmlns:v="urn:schemas-microsoft-com:vml" xmlns:wp14="http://schemas.microsoft.com/office/word/2010/wordprocessingDrawing" xmlns:wp="http://schemas.openxmlformats.org/drawingml/2006/wordprocessingDrawing" xmlns:w10="urn:schemas-microsoft-com:office:word" xmlns:w="http://schemas.openxmlformats.org/wordprocessingml/2006/main" xmlns:w14="http://schemas.microsoft.com/office/word/2010/wordml" xmlns:w15="http://schemas.microsoft.com/office/word/2012/wordml" xmlns:wpg="http://schemas.microsoft.com/office/word/2010/wordprocessingGroup" xmlns:wpi="http://schemas.microsoft.com/office/word/2010/wordprocessingInk" xmlns:wne="http://schemas.microsoft.com/office/word/2006/wordml" xmlns:wps="http://schemas.microsoft.com/office/word/2010/wordprocessingShape" mc:Ignorable="w14 w15 wp14">
   <w:endnote w:type="separator" w:id="-1">
     <w:p>
       <w:pPr>
@@ -12016,7 +8772,7 @@
 </file>
 
 <file path=word/footnotes.xml><?xml version="1.0" encoding="utf-8"?>
-<w:footnotes xmlns:wpc="http://schemas.microsoft.com/office/word/2010/wordprocessingCanvas" xmlns:cx="http://schemas.microsoft.com/office/drawing/2014/chartex" xmlns:cx1="http://schemas.microsoft.com/office/drawing/2015/9/8/chartex" xmlns:cx2="http://schemas.microsoft.com/office/drawing/2015/10/21/chartex" xmlns:cx3="http://schemas.microsoft.com/office/drawing/2016/5/9/chartex" xmlns:cx4="http://schemas.microsoft.com/office/drawing/2016/5/10/chartex" xmlns:cx5="http://schemas.microsoft.com/office/drawing/2016/5/11/chartex" xmlns:cx6="http://schemas.microsoft.com/office/drawing/2016/5/12/chartex" xmlns:cx7="http://schemas.microsoft.com/office/drawing/2016/5/13/chartex" xmlns:cx8="http://schemas.microsoft.com/office/drawing/2016/5/14/chartex" xmlns:mc="http://schemas.openxmlformats.org/markup-compatibility/2006" xmlns:aink="http://schemas.microsoft.com/office/drawing/2016/ink" xmlns:am3d="http://schemas.microsoft.com/office/drawing/2017/model3d" xmlns:o="urn:schemas-microsoft-com:office:office" xmlns:oel="http://schemas.microsoft.com/office/2019/extlst" xmlns:r="http://schemas.openxmlformats.org/officeDocument/2006/relationships" xmlns:m="http://schemas.openxmlformats.org/officeDocument/2006/math" xmlns:v="urn:schemas-microsoft-com:vml" xmlns:wp14="http://schemas.microsoft.com/office/word/2010/wordprocessingDrawing" xmlns:wp="http://schemas.openxmlformats.org/drawingml/2006/wordprocessingDrawing" xmlns:w10="urn:schemas-microsoft-com:office:word" xmlns:w="http://schemas.openxmlformats.org/wordprocessingml/2006/main" xmlns:w14="http://schemas.microsoft.com/office/word/2010/wordml" xmlns:w15="http://schemas.microsoft.com/office/word/2012/wordml" xmlns:w16cex="http://schemas.microsoft.com/office/word/2018/wordml/cex" xmlns:w16cid="http://schemas.microsoft.com/office/word/2016/wordml/cid" xmlns:w16="http://schemas.microsoft.com/office/word/2018/wordml" xmlns:w16du="http://schemas.microsoft.com/office/word/2023/wordml/word16du" xmlns:w16sdtdh="http://schemas.microsoft.com/office/word/2020/wordml/sdtdatahash" xmlns:w16sdtfl="http://schemas.microsoft.com/office/word/2024/wordml/sdtformatlock" xmlns:w16se="http://schemas.microsoft.com/office/word/2015/wordml/symex" xmlns:wpg="http://schemas.microsoft.com/office/word/2010/wordprocessingGroup" xmlns:wpi="http://schemas.microsoft.com/office/word/2010/wordprocessingInk" xmlns:wne="http://schemas.microsoft.com/office/word/2006/wordml" xmlns:wps="http://schemas.microsoft.com/office/word/2010/wordprocessingShape" mc:Ignorable="w14 w15 w16se w16cid w16 w16cex w16sdtdh w16sdtfl w16du wp14">
+<w:footnotes xmlns:wpc="http://schemas.microsoft.com/office/word/2010/wordprocessingCanvas" xmlns:mc="http://schemas.openxmlformats.org/markup-compatibility/2006" xmlns:o="urn:schemas-microsoft-com:office:office" xmlns:r="http://schemas.openxmlformats.org/officeDocument/2006/relationships" xmlns:m="http://schemas.openxmlformats.org/officeDocument/2006/math" xmlns:v="urn:schemas-microsoft-com:vml" xmlns:wp14="http://schemas.microsoft.com/office/word/2010/wordprocessingDrawing" xmlns:wp="http://schemas.openxmlformats.org/drawingml/2006/wordprocessingDrawing" xmlns:w10="urn:schemas-microsoft-com:office:word" xmlns:w="http://schemas.openxmlformats.org/wordprocessingml/2006/main" xmlns:w14="http://schemas.microsoft.com/office/word/2010/wordml" xmlns:w15="http://schemas.microsoft.com/office/word/2012/wordml" xmlns:wpg="http://schemas.microsoft.com/office/word/2010/wordprocessingGroup" xmlns:wpi="http://schemas.microsoft.com/office/word/2010/wordprocessingInk" xmlns:wne="http://schemas.microsoft.com/office/word/2006/wordml" xmlns:wps="http://schemas.microsoft.com/office/word/2010/wordprocessingShape" mc:Ignorable="w14 w15 wp14">
   <w:footnote w:type="separator" w:id="-1">
     <w:p>
       <w:pPr>
@@ -12041,7 +8797,7 @@
 </file>
 
 <file path=word/numbering.xml><?xml version="1.0" encoding="utf-8"?>
-<w:numbering xmlns:wpc="http://schemas.microsoft.com/office/word/2010/wordprocessingCanvas" xmlns:cx="http://schemas.microsoft.com/office/drawing/2014/chartex" xmlns:cx1="http://schemas.microsoft.com/office/drawing/2015/9/8/chartex" xmlns:cx2="http://schemas.microsoft.com/office/drawing/2015/10/21/chartex" xmlns:cx3="http://schemas.microsoft.com/office/drawing/2016/5/9/chartex" xmlns:cx4="http://schemas.microsoft.com/office/drawing/2016/5/10/chartex" xmlns:cx5="http://schemas.microsoft.com/office/drawing/2016/5/11/chartex" xmlns:cx6="http://schemas.microsoft.com/office/drawing/2016/5/12/chartex" xmlns:cx7="http://schemas.microsoft.com/office/drawing/2016/5/13/chartex" xmlns:cx8="http://schemas.microsoft.com/office/drawing/2016/5/14/chartex" xmlns:mc="http://schemas.openxmlformats.org/markup-compatibility/2006" xmlns:aink="http://schemas.microsoft.com/office/drawing/2016/ink" xmlns:am3d="http://schemas.microsoft.com/office/drawing/2017/model3d" xmlns:o="urn:schemas-microsoft-com:office:office" xmlns:oel="http://schemas.microsoft.com/office/2019/extlst" xmlns:r="http://schemas.openxmlformats.org/officeDocument/2006/relationships" xmlns:m="http://schemas.openxmlformats.org/officeDocument/2006/math" xmlns:v="urn:schemas-microsoft-com:vml" xmlns:wp14="http://schemas.microsoft.com/office/word/2010/wordprocessingDrawing" xmlns:wp="http://schemas.openxmlformats.org/drawingml/2006/wordprocessingDrawing" xmlns:w10="urn:schemas-microsoft-com:office:word" xmlns:w="http://schemas.openxmlformats.org/wordprocessingml/2006/main" xmlns:w14="http://schemas.microsoft.com/office/word/2010/wordml" xmlns:w15="http://schemas.microsoft.com/office/word/2012/wordml" xmlns:w16cex="http://schemas.microsoft.com/office/word/2018/wordml/cex" xmlns:w16cid="http://schemas.microsoft.com/office/word/2016/wordml/cid" xmlns:w16="http://schemas.microsoft.com/office/word/2018/wordml" xmlns:w16du="http://schemas.microsoft.com/office/word/2023/wordml/word16du" xmlns:w16sdtdh="http://schemas.microsoft.com/office/word/2020/wordml/sdtdatahash" xmlns:w16sdtfl="http://schemas.microsoft.com/office/word/2024/wordml/sdtformatlock" xmlns:w16se="http://schemas.microsoft.com/office/word/2015/wordml/symex" xmlns:wpg="http://schemas.microsoft.com/office/word/2010/wordprocessingGroup" xmlns:wpi="http://schemas.microsoft.com/office/word/2010/wordprocessingInk" xmlns:wne="http://schemas.microsoft.com/office/word/2006/wordml" xmlns:wps="http://schemas.microsoft.com/office/word/2010/wordprocessingShape" mc:Ignorable="w14 w15 w16se w16cid w16 w16cex w16sdtdh w16sdtfl w16du wp14">
+<w:numbering xmlns:wpc="http://schemas.microsoft.com/office/word/2010/wordprocessingCanvas" xmlns:mc="http://schemas.openxmlformats.org/markup-compatibility/2006" xmlns:o="urn:schemas-microsoft-com:office:office" xmlns:r="http://schemas.openxmlformats.org/officeDocument/2006/relationships" xmlns:m="http://schemas.openxmlformats.org/officeDocument/2006/math" xmlns:v="urn:schemas-microsoft-com:vml" xmlns:wp14="http://schemas.microsoft.com/office/word/2010/wordprocessingDrawing" xmlns:wp="http://schemas.openxmlformats.org/drawingml/2006/wordprocessingDrawing" xmlns:w10="urn:schemas-microsoft-com:office:word" xmlns:w="http://schemas.openxmlformats.org/wordprocessingml/2006/main" xmlns:w14="http://schemas.microsoft.com/office/word/2010/wordml" xmlns:w15="http://schemas.microsoft.com/office/word/2012/wordml" xmlns:wpg="http://schemas.microsoft.com/office/word/2010/wordprocessingGroup" xmlns:wpi="http://schemas.microsoft.com/office/word/2010/wordprocessingInk" xmlns:wne="http://schemas.microsoft.com/office/word/2006/wordml" xmlns:wps="http://schemas.microsoft.com/office/word/2010/wordprocessingShape" mc:Ignorable="w14 w15 wp14">
   <w:abstractNum w:abstractNumId="0" w15:restartNumberingAfterBreak="0">
     <w:nsid w:val="083216BB"/>
     <w:multiLevelType w:val="hybridMultilevel"/>
@@ -12987,38 +9743,38 @@
       </w:rPr>
     </w:lvl>
   </w:abstractNum>
-  <w:num w:numId="1" w16cid:durableId="453138738">
+  <w:num w:numId="1">
     <w:abstractNumId w:val="3"/>
   </w:num>
-  <w:num w:numId="2" w16cid:durableId="1986352817">
+  <w:num w:numId="2">
     <w:abstractNumId w:val="1"/>
   </w:num>
-  <w:num w:numId="3" w16cid:durableId="1208755603">
+  <w:num w:numId="3">
     <w:abstractNumId w:val="5"/>
   </w:num>
-  <w:num w:numId="4" w16cid:durableId="1509557945">
+  <w:num w:numId="4">
     <w:abstractNumId w:val="7"/>
   </w:num>
-  <w:num w:numId="5" w16cid:durableId="584384540">
+  <w:num w:numId="5">
     <w:abstractNumId w:val="2"/>
   </w:num>
-  <w:num w:numId="6" w16cid:durableId="797189651">
+  <w:num w:numId="6">
     <w:abstractNumId w:val="8"/>
   </w:num>
-  <w:num w:numId="7" w16cid:durableId="254411717">
+  <w:num w:numId="7">
     <w:abstractNumId w:val="0"/>
   </w:num>
-  <w:num w:numId="8" w16cid:durableId="996373597">
+  <w:num w:numId="8">
     <w:abstractNumId w:val="4"/>
   </w:num>
-  <w:num w:numId="9" w16cid:durableId="1105341080">
+  <w:num w:numId="9">
     <w:abstractNumId w:val="6"/>
   </w:num>
 </w:numbering>
 </file>
 
 <file path=word/styles.xml><?xml version="1.0" encoding="utf-8"?>
-<w:styles xmlns:mc="http://schemas.openxmlformats.org/markup-compatibility/2006" xmlns:r="http://schemas.openxmlformats.org/officeDocument/2006/relationships" xmlns:w="http://schemas.openxmlformats.org/wordprocessingml/2006/main" xmlns:w14="http://schemas.microsoft.com/office/word/2010/wordml" xmlns:w15="http://schemas.microsoft.com/office/word/2012/wordml" xmlns:w16cex="http://schemas.microsoft.com/office/word/2018/wordml/cex" xmlns:w16cid="http://schemas.microsoft.com/office/word/2016/wordml/cid" xmlns:w16="http://schemas.microsoft.com/office/word/2018/wordml" xmlns:w16du="http://schemas.microsoft.com/office/word/2023/wordml/word16du" xmlns:w16sdtdh="http://schemas.microsoft.com/office/word/2020/wordml/sdtdatahash" xmlns:w16sdtfl="http://schemas.microsoft.com/office/word/2024/wordml/sdtformatlock" xmlns:w16se="http://schemas.microsoft.com/office/word/2015/wordml/symex" mc:Ignorable="w14 w15 w16se w16cid w16 w16cex w16sdtdh w16sdtfl w16du">
+<w:styles xmlns:mc="http://schemas.openxmlformats.org/markup-compatibility/2006" xmlns:r="http://schemas.openxmlformats.org/officeDocument/2006/relationships" xmlns:w="http://schemas.openxmlformats.org/wordprocessingml/2006/main" xmlns:w14="http://schemas.microsoft.com/office/word/2010/wordml" xmlns:w15="http://schemas.microsoft.com/office/word/2012/wordml" mc:Ignorable="w14 w15">
   <w:docDefaults>
     <w:rPrDefault>
       <w:rPr>
@@ -13036,7 +9792,7 @@
       </w:pPr>
     </w:pPrDefault>
   </w:docDefaults>
-  <w:latentStyles w:defLockedState="0" w:defUIPriority="99" w:defSemiHidden="0" w:defUnhideWhenUsed="0" w:defQFormat="0" w:count="376">
+  <w:latentStyles w:defLockedState="0" w:defUIPriority="99" w:defSemiHidden="0" w:defUnhideWhenUsed="0" w:defQFormat="0" w:count="371">
     <w:lsdException w:name="Normal" w:uiPriority="0" w:qFormat="1"/>
     <w:lsdException w:name="heading 1" w:uiPriority="9" w:qFormat="1"/>
     <w:lsdException w:name="heading 2" w:semiHidden="1" w:uiPriority="9" w:unhideWhenUsed="1" w:qFormat="1"/>
@@ -13408,11 +10164,6 @@
     <w:lsdException w:name="List Table 5 Dark Accent 6" w:uiPriority="50"/>
     <w:lsdException w:name="List Table 6 Colorful Accent 6" w:uiPriority="51"/>
     <w:lsdException w:name="List Table 7 Colorful Accent 6" w:uiPriority="52"/>
-    <w:lsdException w:name="Mention" w:semiHidden="1" w:unhideWhenUsed="1"/>
-    <w:lsdException w:name="Smart Hyperlink" w:semiHidden="1" w:unhideWhenUsed="1"/>
-    <w:lsdException w:name="Hashtag" w:semiHidden="1" w:unhideWhenUsed="1"/>
-    <w:lsdException w:name="Unresolved Mention" w:semiHidden="1" w:unhideWhenUsed="1"/>
-    <w:lsdException w:name="Smart Link" w:semiHidden="1" w:unhideWhenUsed="1"/>
   </w:latentStyles>
   <w:style w:type="paragraph" w:default="1" w:styleId="Norml">
     <w:name w:val="Normal"/>
@@ -13619,6 +10370,7 @@
   <w:style w:type="character" w:default="1" w:styleId="Bekezdsalapbettpusa">
     <w:name w:val="Default Paragraph Font"/>
     <w:uiPriority w:val="1"/>
+    <w:semiHidden/>
     <w:unhideWhenUsed/>
   </w:style>
   <w:style w:type="table" w:default="1" w:styleId="Normltblzat">
@@ -14079,7 +10831,7 @@
       <w:szCs w:val="18"/>
     </w:rPr>
   </w:style>
-  <w:style w:type="character" w:styleId="Feloldatlanmegemlts">
+  <w:style w:type="character" w:customStyle="1" w:styleId="UnresolvedMention">
     <w:name w:val="Unresolved Mention"/>
     <w:basedOn w:val="Bekezdsalapbettpusa"/>
     <w:uiPriority w:val="99"/>
@@ -14406,7 +11158,7 @@
 </file>
 
 <file path=customXml/itemProps1.xml><?xml version="1.0" encoding="utf-8"?>
-<ds:datastoreItem xmlns:ds="http://schemas.openxmlformats.org/officeDocument/2006/customXml" ds:itemID="{5DCC9ADA-486F-4855-94D0-8E338B8FA5F8}">
+<ds:datastoreItem xmlns:ds="http://schemas.openxmlformats.org/officeDocument/2006/customXml" ds:itemID="{27977688-A18A-4085-9001-D65110C3167B}">
   <ds:schemaRefs>
     <ds:schemaRef ds:uri="http://schemas.openxmlformats.org/officeDocument/2006/bibliography"/>
   </ds:schemaRefs>

</xml_diff>